<commit_message>
first prod v0.1.65 pdf files fixes
</commit_message>
<xml_diff>
--- a/static/docs/kdn_act.docx
+++ b/static/docs/kdn_act.docx
@@ -1,9 +1,10 @@
 
 <file path=word/document.xml><?xml version="1.0" encoding="utf-8"?>
-<w:document xmlns:wpc="http://schemas.microsoft.com/office/word/2010/wordprocessingCanvas" xmlns:cx="http://schemas.microsoft.com/office/drawing/2014/chartex" xmlns:cx1="http://schemas.microsoft.com/office/drawing/2015/9/8/chartex" xmlns:cx2="http://schemas.microsoft.com/office/drawing/2015/10/21/chartex" xmlns:cx3="http://schemas.microsoft.com/office/drawing/2016/5/9/chartex" xmlns:cx4="http://schemas.microsoft.com/office/drawing/2016/5/10/chartex" xmlns:cx5="http://schemas.microsoft.com/office/drawing/2016/5/11/chartex" xmlns:cx6="http://schemas.microsoft.com/office/drawing/2016/5/12/chartex" xmlns:cx7="http://schemas.microsoft.com/office/drawing/2016/5/13/chartex" xmlns:cx8="http://schemas.microsoft.com/office/drawing/2016/5/14/chartex" xmlns:mc="http://schemas.openxmlformats.org/markup-compatibility/2006" xmlns:aink="http://schemas.microsoft.com/office/drawing/2016/ink" xmlns:am3d="http://schemas.microsoft.com/office/drawing/2017/model3d" xmlns:o="urn:schemas-microsoft-com:office:office" xmlns:oel="http://schemas.microsoft.com/office/2019/extlst" xmlns:r="http://schemas.openxmlformats.org/officeDocument/2006/relationships" xmlns:m="http://schemas.openxmlformats.org/officeDocument/2006/math" xmlns:v="urn:schemas-microsoft-com:vml" xmlns:wp14="http://schemas.microsoft.com/office/word/2010/wordprocessingDrawing" xmlns:wp="http://schemas.openxmlformats.org/drawingml/2006/wordprocessingDrawing" xmlns:w10="urn:schemas-microsoft-com:office:word" xmlns:w="http://schemas.openxmlformats.org/wordprocessingml/2006/main" xmlns:w14="http://schemas.microsoft.com/office/word/2010/wordml" xmlns:w15="http://schemas.microsoft.com/office/word/2012/wordml" xmlns:w16cex="http://schemas.microsoft.com/office/word/2018/wordml/cex" xmlns:w16cid="http://schemas.microsoft.com/office/word/2016/wordml/cid" xmlns:w16="http://schemas.microsoft.com/office/word/2018/wordml" xmlns:w16sdtdh="http://schemas.microsoft.com/office/word/2020/wordml/sdtdatahash" xmlns:w16se="http://schemas.microsoft.com/office/word/2015/wordml/symex" xmlns:wpg="http://schemas.microsoft.com/office/word/2010/wordprocessingGroup" xmlns:wpi="http://schemas.microsoft.com/office/word/2010/wordprocessingInk" xmlns:wne="http://schemas.microsoft.com/office/word/2006/wordml" xmlns:wps="http://schemas.microsoft.com/office/word/2010/wordprocessingShape" mc:Ignorable="w14 w15 w16se w16cid w16 w16cex w16sdtdh wp14">
+<w:document xmlns:o="urn:schemas-microsoft-com:office:office" xmlns:r="http://schemas.openxmlformats.org/officeDocument/2006/relationships" xmlns:v="urn:schemas-microsoft-com:vml" xmlns:w="http://schemas.openxmlformats.org/wordprocessingml/2006/main" xmlns:w10="urn:schemas-microsoft-com:office:word" xmlns:wp="http://schemas.openxmlformats.org/drawingml/2006/wordprocessingDrawing" xmlns:wps="http://schemas.microsoft.com/office/word/2010/wordprocessingShape" xmlns:wpg="http://schemas.microsoft.com/office/word/2010/wordprocessingGroup" xmlns:mc="http://schemas.openxmlformats.org/markup-compatibility/2006" xmlns:wp14="http://schemas.microsoft.com/office/word/2010/wordprocessingDrawing" xmlns:w14="http://schemas.microsoft.com/office/word/2010/wordml" xmlns:w15="http://schemas.microsoft.com/office/word/2012/wordml" mc:Ignorable="w14 wp14 w15">
   <w:body>
     <w:p>
       <w:pPr>
+        <w:pStyle w:val="Normal"/>
         <w:jc w:val="center"/>
         <w:rPr>
           <w:rFonts w:ascii="Times New Roman" w:hAnsi="Times New Roman" w:cs="Times New Roman"/>
@@ -15,40 +16,85 @@
       </w:pPr>
       <w:r>
         <w:rPr>
+          <w:rFonts w:cs="Times New Roman" w:ascii="Times New Roman" w:hAnsi="Times New Roman"/>
+          <w:b/>
+          <w:sz w:val="24"/>
+          <w:szCs w:val="24"/>
+          <w:lang w:val="uk-UA"/>
+        </w:rPr>
+        <w:t>АКТ №</w:t>
+      </w:r>
+      <w:r>
+        <w:rPr>
+          <w:rFonts w:cs="Times New Roman" w:ascii="Times New Roman" w:hAnsi="Times New Roman"/>
+          <w:b/>
+          <w:sz w:val="24"/>
+          <w:szCs w:val="24"/>
+          <w:lang w:val="en-US"/>
+        </w:rPr>
+        <w:t xml:space="preserve"> </w:t>
+      </w:r>
+      <w:r>
+        <w:rPr>
+          <w:rFonts w:cs="Times New Roman" w:ascii="Times New Roman" w:hAnsi="Times New Roman"/>
+          <w:b/>
+          <w:sz w:val="24"/>
+          <w:szCs w:val="24"/>
+        </w:rPr>
+        <w:t>@act_name</w:t>
+      </w:r>
+    </w:p>
+    <w:p>
+      <w:pPr>
+        <w:pStyle w:val="Normal"/>
+        <w:jc w:val="center"/>
+        <w:rPr>
           <w:rFonts w:ascii="Times New Roman" w:hAnsi="Times New Roman" w:cs="Times New Roman"/>
           <w:b/>
           <w:sz w:val="24"/>
           <w:szCs w:val="24"/>
           <w:lang w:val="uk-UA"/>
         </w:rPr>
-        <w:t>АКТ №</w:t>
-      </w:r>
-      <w:r>
+      </w:pPr>
+      <w:r>
+        <w:rPr>
+          <w:rFonts w:cs="Times New Roman" w:ascii="Times New Roman" w:hAnsi="Times New Roman"/>
+          <w:b/>
+          <w:sz w:val="24"/>
+          <w:szCs w:val="24"/>
+          <w:lang w:val="uk-UA"/>
+        </w:rPr>
+        <w:t xml:space="preserve">приймання передачі послуг </w:t>
+      </w:r>
+    </w:p>
+    <w:p>
+      <w:pPr>
+        <w:pStyle w:val="Normal"/>
+        <w:jc w:val="center"/>
         <w:rPr>
           <w:rFonts w:ascii="Times New Roman" w:hAnsi="Times New Roman" w:cs="Times New Roman"/>
           <w:b/>
           <w:sz w:val="24"/>
           <w:szCs w:val="24"/>
-          <w:lang w:val="en-US"/>
-        </w:rPr>
-        <w:t xml:space="preserve"> </w:t>
-      </w:r>
-      <w:r>
-        <w:rPr>
-          <w:rFonts w:ascii="Times New Roman" w:hAnsi="Times New Roman" w:cs="Times New Roman"/>
+          <w:lang w:val="uk-UA"/>
+        </w:rPr>
+      </w:pPr>
+      <w:r>
+        <w:rPr>
+          <w:rFonts w:cs="Times New Roman" w:ascii="Times New Roman" w:hAnsi="Times New Roman"/>
           <w:b/>
           <w:sz w:val="24"/>
           <w:szCs w:val="24"/>
-        </w:rPr>
-        <w:t>@act_name</w:t>
+          <w:lang w:val="uk-UA"/>
+        </w:rPr>
       </w:r>
     </w:p>
     <w:p>
       <w:pPr>
+        <w:pStyle w:val="Normal"/>
         <w:jc w:val="center"/>
         <w:rPr>
           <w:rFonts w:ascii="Times New Roman" w:hAnsi="Times New Roman" w:cs="Times New Roman"/>
-          <w:b/>
           <w:sz w:val="24"/>
           <w:szCs w:val="24"/>
           <w:lang w:val="uk-UA"/>
@@ -56,193 +102,90 @@
       </w:pPr>
       <w:r>
         <w:rPr>
-          <w:rFonts w:ascii="Times New Roman" w:hAnsi="Times New Roman" w:cs="Times New Roman"/>
-          <w:b/>
+          <w:rFonts w:cs="Times New Roman" w:ascii="Times New Roman" w:hAnsi="Times New Roman"/>
           <w:sz w:val="24"/>
           <w:szCs w:val="24"/>
           <w:lang w:val="uk-UA"/>
         </w:rPr>
-        <w:t xml:space="preserve">приймання передачі послуг </w:t>
       </w:r>
     </w:p>
     <w:p>
       <w:pPr>
+        <w:pStyle w:val="Normal"/>
+        <w:ind w:left="374"/>
         <w:jc w:val="center"/>
         <w:rPr>
           <w:rFonts w:ascii="Times New Roman" w:hAnsi="Times New Roman" w:cs="Times New Roman"/>
-          <w:b/>
-          <w:sz w:val="24"/>
-          <w:szCs w:val="24"/>
-          <w:lang w:val="uk-UA"/>
+          <w:sz w:val="22"/>
+          <w:szCs w:val="22"/>
+          <w:lang w:val="uk-UA" w:eastAsia="en-US"/>
         </w:rPr>
       </w:pPr>
+      <w:r>
+        <w:rPr>
+          <w:rFonts w:cs="Times New Roman" w:ascii="Times New Roman" w:hAnsi="Times New Roman"/>
+          <w:sz w:val="22"/>
+          <w:szCs w:val="22"/>
+          <w:lang w:val="uk-UA"/>
+        </w:rPr>
+        <w:t>м. Київ</w:t>
+        <w:tab/>
+        <w:tab/>
+        <w:tab/>
+        <w:tab/>
+        <w:tab/>
+        <w:tab/>
+        <w:tab/>
+        <w:tab/>
+        <w:tab/>
+        <w:tab/>
+        <w:t xml:space="preserve">  </w:t>
+      </w:r>
+      <w:r>
+        <w:rPr>
+          <w:rFonts w:cs="Times New Roman" w:ascii="Times New Roman" w:hAnsi="Times New Roman"/>
+          <w:sz w:val="22"/>
+          <w:szCs w:val="22"/>
+        </w:rPr>
+        <w:t>@act_date</w:t>
+      </w:r>
     </w:p>
     <w:p>
       <w:pPr>
-        <w:jc w:val="center"/>
+        <w:pStyle w:val="Normal"/>
+        <w:jc w:val="both"/>
         <w:rPr>
           <w:rFonts w:ascii="Times New Roman" w:hAnsi="Times New Roman" w:cs="Times New Roman"/>
-          <w:sz w:val="24"/>
-          <w:szCs w:val="24"/>
-          <w:lang w:val="uk-UA"/>
+          <w:sz w:val="22"/>
+          <w:szCs w:val="22"/>
+          <w:lang w:eastAsia="en-US"/>
         </w:rPr>
       </w:pPr>
+      <w:r>
+        <w:rPr>
+          <w:rFonts w:cs="Times New Roman" w:ascii="Times New Roman" w:hAnsi="Times New Roman"/>
+          <w:sz w:val="22"/>
+          <w:szCs w:val="22"/>
+          <w:lang w:eastAsia="en-US"/>
+        </w:rPr>
+      </w:r>
     </w:p>
     <w:p>
       <w:pPr>
-        <w:ind w:left="374"/>
-        <w:jc w:val="center"/>
+        <w:pStyle w:val="Normal"/>
+        <w:jc w:val="both"/>
         <w:rPr>
           <w:rFonts w:ascii="Times New Roman" w:hAnsi="Times New Roman" w:cs="Times New Roman"/>
-          <w:sz w:val="22"/>
-          <w:szCs w:val="22"/>
-          <w:lang w:val="uk-UA" w:eastAsia="en-US"/>
+          <w:bCs/>
+          <w:color w:val="000000"/>
+          <w:sz w:val="22"/>
+          <w:szCs w:val="22"/>
+          <w:lang w:val="uk-UA"/>
         </w:rPr>
       </w:pPr>
       <w:r>
         <w:rPr>
-          <w:rFonts w:ascii="Times New Roman" w:hAnsi="Times New Roman" w:cs="Times New Roman"/>
-          <w:sz w:val="22"/>
-          <w:szCs w:val="22"/>
-          <w:lang w:val="uk-UA"/>
-        </w:rPr>
-        <w:t xml:space="preserve">м. </w:t>
-      </w:r>
-      <w:r>
-        <w:rPr>
-          <w:rFonts w:ascii="Times New Roman" w:hAnsi="Times New Roman" w:cs="Times New Roman"/>
-          <w:sz w:val="22"/>
-          <w:szCs w:val="22"/>
-          <w:lang w:val="uk-UA"/>
-        </w:rPr>
-        <w:t>Київ</w:t>
-      </w:r>
-      <w:r>
-        <w:rPr>
-          <w:rFonts w:ascii="Times New Roman" w:hAnsi="Times New Roman" w:cs="Times New Roman"/>
-          <w:sz w:val="22"/>
-          <w:szCs w:val="22"/>
-          <w:lang w:val="uk-UA"/>
-        </w:rPr>
-        <w:tab/>
-      </w:r>
-      <w:r>
-        <w:rPr>
-          <w:rFonts w:ascii="Times New Roman" w:hAnsi="Times New Roman" w:cs="Times New Roman"/>
-          <w:sz w:val="22"/>
-          <w:szCs w:val="22"/>
-          <w:lang w:val="uk-UA"/>
-        </w:rPr>
-        <w:tab/>
-      </w:r>
-      <w:r>
-        <w:rPr>
-          <w:rFonts w:ascii="Times New Roman" w:hAnsi="Times New Roman" w:cs="Times New Roman"/>
-          <w:sz w:val="22"/>
-          <w:szCs w:val="22"/>
-          <w:lang w:val="uk-UA"/>
-        </w:rPr>
-        <w:tab/>
-      </w:r>
-      <w:r>
-        <w:rPr>
-          <w:rFonts w:ascii="Times New Roman" w:hAnsi="Times New Roman" w:cs="Times New Roman"/>
-          <w:sz w:val="22"/>
-          <w:szCs w:val="22"/>
-          <w:lang w:val="uk-UA"/>
-        </w:rPr>
-        <w:tab/>
-      </w:r>
-      <w:r>
-        <w:rPr>
-          <w:rFonts w:ascii="Times New Roman" w:hAnsi="Times New Roman" w:cs="Times New Roman"/>
-          <w:sz w:val="22"/>
-          <w:szCs w:val="22"/>
-          <w:lang w:val="uk-UA"/>
-        </w:rPr>
-        <w:tab/>
-      </w:r>
-      <w:r>
-        <w:rPr>
-          <w:rFonts w:ascii="Times New Roman" w:hAnsi="Times New Roman" w:cs="Times New Roman"/>
-          <w:sz w:val="22"/>
-          <w:szCs w:val="22"/>
-          <w:lang w:val="uk-UA"/>
-        </w:rPr>
-        <w:tab/>
-      </w:r>
-      <w:r>
-        <w:rPr>
-          <w:rFonts w:ascii="Times New Roman" w:hAnsi="Times New Roman" w:cs="Times New Roman"/>
-          <w:sz w:val="22"/>
-          <w:szCs w:val="22"/>
-          <w:lang w:val="uk-UA"/>
-        </w:rPr>
-        <w:tab/>
-      </w:r>
-      <w:r>
-        <w:rPr>
-          <w:rFonts w:ascii="Times New Roman" w:hAnsi="Times New Roman" w:cs="Times New Roman"/>
-          <w:sz w:val="22"/>
-          <w:szCs w:val="22"/>
-          <w:lang w:val="uk-UA"/>
-        </w:rPr>
-        <w:tab/>
-      </w:r>
-      <w:r>
-        <w:rPr>
-          <w:rFonts w:ascii="Times New Roman" w:hAnsi="Times New Roman" w:cs="Times New Roman"/>
-          <w:sz w:val="22"/>
-          <w:szCs w:val="22"/>
-          <w:lang w:val="uk-UA"/>
-        </w:rPr>
-        <w:tab/>
-      </w:r>
-      <w:r>
-        <w:rPr>
-          <w:rFonts w:ascii="Times New Roman" w:hAnsi="Times New Roman" w:cs="Times New Roman"/>
-          <w:sz w:val="22"/>
-          <w:szCs w:val="22"/>
-          <w:lang w:val="uk-UA"/>
-        </w:rPr>
-        <w:tab/>
-        <w:t xml:space="preserve">  </w:t>
-      </w:r>
-      <w:r>
-        <w:rPr>
-          <w:rFonts w:ascii="Times New Roman" w:hAnsi="Times New Roman" w:cs="Times New Roman"/>
-          <w:sz w:val="22"/>
-          <w:szCs w:val="22"/>
-        </w:rPr>
-        <w:t>@act_date</w:t>
-      </w:r>
-    </w:p>
-    <w:p>
-      <w:pPr>
-        <w:jc w:val="both"/>
-        <w:rPr>
-          <w:rFonts w:ascii="Times New Roman" w:hAnsi="Times New Roman" w:cs="Times New Roman"/>
-          <w:sz w:val="22"/>
-          <w:szCs w:val="22"/>
-          <w:lang w:eastAsia="en-US"/>
-        </w:rPr>
-      </w:pPr>
-    </w:p>
-    <w:p>
-      <w:pPr>
-        <w:jc w:val="both"/>
-        <w:rPr>
-          <w:rFonts w:ascii="Times New Roman" w:hAnsi="Times New Roman" w:cs="Times New Roman"/>
-          <w:bCs/>
-          <w:color w:val="000000"/>
-          <w:sz w:val="22"/>
-          <w:szCs w:val="22"/>
-          <w:lang w:val="uk-UA"/>
-        </w:rPr>
-      </w:pPr>
-      <w:r>
-        <w:rPr>
-          <w:rFonts w:ascii="Times New Roman" w:hAnsi="Times New Roman" w:cs="Times New Roman"/>
+          <w:rFonts w:cs="Times New Roman" w:ascii="Times New Roman" w:hAnsi="Times New Roman"/>
           <w:bCs/>
           <w:color w:val="000000"/>
           <w:sz w:val="22"/>
@@ -256,7 +199,7 @@
       <w:pPr>
         <w:pStyle w:val="BodyText"/>
         <w:shd w:val="clear" w:color="auto" w:fill="auto"/>
-        <w:spacing w:before="0" w:line="240" w:lineRule="auto"/>
+        <w:spacing w:lineRule="auto" w:line="240" w:before="0" w:after="0"/>
         <w:ind w:left="40" w:right="60"/>
         <w:rPr>
           <w:rFonts w:ascii="Times New Roman" w:hAnsi="Times New Roman"/>
@@ -312,7 +255,7 @@
       <w:pPr>
         <w:pStyle w:val="BodyText"/>
         <w:shd w:val="clear" w:color="auto" w:fill="auto"/>
-        <w:spacing w:before="0" w:line="240" w:lineRule="auto"/>
+        <w:spacing w:lineRule="auto" w:line="240" w:before="0" w:after="0"/>
         <w:ind w:right="60"/>
         <w:rPr>
           <w:rFonts w:ascii="Times New Roman" w:hAnsi="Times New Roman"/>
@@ -330,14 +273,24 @@
           <w:szCs w:val="22"/>
           <w:lang w:val="uk-UA"/>
         </w:rPr>
-        <w:t xml:space="preserve"> та</w:t>
+        <w:t xml:space="preserve"> </w:t>
+      </w:r>
+      <w:r>
+        <w:rPr>
+          <w:rFonts w:ascii="Times New Roman" w:hAnsi="Times New Roman"/>
+          <w:bCs/>
+          <w:sz w:val="22"/>
+          <w:szCs w:val="22"/>
+          <w:lang w:val="uk-UA"/>
+        </w:rPr>
+        <w:t>та</w:t>
       </w:r>
     </w:p>
     <w:p>
       <w:pPr>
         <w:pStyle w:val="BodyText"/>
         <w:shd w:val="clear" w:color="auto" w:fill="auto"/>
-        <w:spacing w:before="0" w:line="240" w:lineRule="auto"/>
+        <w:spacing w:lineRule="auto" w:line="240" w:before="0" w:after="0"/>
         <w:ind w:right="60"/>
         <w:rPr>
           <w:rFonts w:ascii="Times New Roman" w:hAnsi="Times New Roman"/>
@@ -356,7 +309,7 @@
           <w:szCs w:val="22"/>
           <w:lang w:val="uk-UA"/>
         </w:rPr>
-        <w:t xml:space="preserve">Фізична особа – підприємець </w:t>
+        <w:t>Фізична особа – підприємець @</w:t>
       </w:r>
       <w:r>
         <w:rPr>
@@ -365,9 +318,8 @@
           <w:bCs/>
           <w:sz w:val="22"/>
           <w:szCs w:val="22"/>
-          <w:lang w:val="uk-UA"/>
-        </w:rPr>
-        <w:t>@</w:t>
+        </w:rPr>
+        <w:t>ri</w:t>
       </w:r>
       <w:r>
         <w:rPr>
@@ -376,8 +328,9 @@
           <w:bCs/>
           <w:sz w:val="22"/>
           <w:szCs w:val="22"/>
-        </w:rPr>
-        <w:t>ri</w:t>
+          <w:lang w:val="uk-UA"/>
+        </w:rPr>
+        <w:t>_</w:t>
       </w:r>
       <w:r>
         <w:rPr>
@@ -386,9 +339,75 @@
           <w:bCs/>
           <w:sz w:val="22"/>
           <w:szCs w:val="22"/>
+        </w:rPr>
+        <w:t>name</w:t>
+      </w:r>
+      <w:r>
+        <w:rPr>
+          <w:rFonts w:ascii="Times New Roman" w:hAnsi="Times New Roman"/>
+          <w:bCs/>
+          <w:sz w:val="22"/>
+          <w:szCs w:val="22"/>
+          <w:lang w:val="uk-UA"/>
+        </w:rPr>
+        <w:t xml:space="preserve"> (</w:t>
+      </w:r>
+      <w:r>
+        <w:rPr>
+          <w:rFonts w:ascii="Times New Roman" w:hAnsi="Times New Roman"/>
+          <w:sz w:val="22"/>
+          <w:szCs w:val="22"/>
+          <w:lang w:val="uk-UA"/>
+        </w:rPr>
+        <w:t>РНОКПП</w:t>
+      </w:r>
+      <w:r>
+        <w:rPr>
+          <w:rFonts w:ascii="Times New Roman" w:hAnsi="Times New Roman"/>
+          <w:bCs/>
+          <w:sz w:val="22"/>
+          <w:szCs w:val="22"/>
+          <w:lang w:val="uk-UA"/>
+        </w:rPr>
+        <w:t xml:space="preserve"> @</w:t>
+      </w:r>
+      <w:r>
+        <w:rPr>
+          <w:rFonts w:ascii="Times New Roman" w:hAnsi="Times New Roman"/>
+          <w:bCs/>
+          <w:sz w:val="22"/>
+          <w:szCs w:val="22"/>
+        </w:rPr>
+        <w:t>ri</w:t>
+      </w:r>
+      <w:r>
+        <w:rPr>
+          <w:rFonts w:ascii="Times New Roman" w:hAnsi="Times New Roman"/>
+          <w:bCs/>
+          <w:sz w:val="22"/>
+          <w:szCs w:val="22"/>
           <w:lang w:val="uk-UA"/>
         </w:rPr>
         <w:t>_</w:t>
+      </w:r>
+      <w:r>
+        <w:rPr>
+          <w:rFonts w:ascii="Times New Roman" w:hAnsi="Times New Roman"/>
+          <w:bCs/>
+          <w:sz w:val="22"/>
+          <w:szCs w:val="22"/>
+        </w:rPr>
+        <w:t>inn</w:t>
+      </w:r>
+      <w:r>
+        <w:rPr>
+          <w:rFonts w:ascii="Times New Roman" w:hAnsi="Times New Roman"/>
+          <w:bCs/>
+          <w:sz w:val="22"/>
+          <w:szCs w:val="22"/>
+          <w:lang w:val="uk-UA"/>
+        </w:rPr>
+        <w:t xml:space="preserve">), іменований надалі </w:t>
       </w:r>
       <w:r>
         <w:rPr>
@@ -397,8 +416,9 @@
           <w:bCs/>
           <w:sz w:val="22"/>
           <w:szCs w:val="22"/>
-        </w:rPr>
-        <w:t>name</w:t>
+          <w:lang w:val="uk-UA"/>
+        </w:rPr>
+        <w:t>Виконавець</w:t>
       </w:r>
       <w:r>
         <w:rPr>
@@ -408,16 +428,17 @@
           <w:szCs w:val="22"/>
           <w:lang w:val="uk-UA"/>
         </w:rPr>
-        <w:t xml:space="preserve"> (</w:t>
+        <w:t>, який діє на підставі @</w:t>
       </w:r>
       <w:r>
         <w:rPr>
           <w:rFonts w:ascii="Times New Roman" w:hAnsi="Times New Roman"/>
-          <w:sz w:val="22"/>
-          <w:szCs w:val="22"/>
-          <w:lang w:val="uk-UA"/>
-        </w:rPr>
-        <w:t>РНОКПП</w:t>
+          <w:bCs/>
+          <w:sz w:val="22"/>
+          <w:szCs w:val="22"/>
+          <w:lang w:val="en-US"/>
+        </w:rPr>
+        <w:t>ri</w:t>
       </w:r>
       <w:r>
         <w:rPr>
@@ -427,7 +448,7 @@
           <w:szCs w:val="22"/>
           <w:lang w:val="uk-UA"/>
         </w:rPr>
-        <w:t xml:space="preserve"> </w:t>
+        <w:t>_</w:t>
       </w:r>
       <w:r>
         <w:rPr>
@@ -435,113 +456,10 @@
           <w:bCs/>
           <w:sz w:val="22"/>
           <w:szCs w:val="22"/>
-          <w:lang w:val="uk-UA"/>
-        </w:rPr>
-        <w:t>@</w:t>
-      </w:r>
-      <w:r>
-        <w:rPr>
-          <w:rFonts w:ascii="Times New Roman" w:hAnsi="Times New Roman"/>
-          <w:bCs/>
-          <w:sz w:val="22"/>
-          <w:szCs w:val="22"/>
-        </w:rPr>
-        <w:t>ri</w:t>
-      </w:r>
-      <w:r>
-        <w:rPr>
-          <w:rFonts w:ascii="Times New Roman" w:hAnsi="Times New Roman"/>
-          <w:bCs/>
-          <w:sz w:val="22"/>
-          <w:szCs w:val="22"/>
-          <w:lang w:val="uk-UA"/>
-        </w:rPr>
-        <w:t>_</w:t>
-      </w:r>
-      <w:r>
-        <w:rPr>
-          <w:rFonts w:ascii="Times New Roman" w:hAnsi="Times New Roman"/>
-          <w:bCs/>
-          <w:sz w:val="22"/>
-          <w:szCs w:val="22"/>
-        </w:rPr>
-        <w:t>inn</w:t>
-      </w:r>
-      <w:r>
-        <w:rPr>
-          <w:rFonts w:ascii="Times New Roman" w:hAnsi="Times New Roman"/>
-          <w:bCs/>
-          <w:sz w:val="22"/>
-          <w:szCs w:val="22"/>
-          <w:lang w:val="uk-UA"/>
-        </w:rPr>
-        <w:t xml:space="preserve">), іменований надалі </w:t>
-      </w:r>
-      <w:r>
-        <w:rPr>
-          <w:rFonts w:ascii="Times New Roman" w:hAnsi="Times New Roman"/>
-          <w:b/>
-          <w:bCs/>
-          <w:sz w:val="22"/>
-          <w:szCs w:val="22"/>
-          <w:lang w:val="uk-UA"/>
-        </w:rPr>
-        <w:t>Виконавець</w:t>
-      </w:r>
-      <w:r>
-        <w:rPr>
-          <w:rFonts w:ascii="Times New Roman" w:hAnsi="Times New Roman"/>
-          <w:bCs/>
-          <w:sz w:val="22"/>
-          <w:szCs w:val="22"/>
-          <w:lang w:val="uk-UA"/>
-        </w:rPr>
-        <w:t xml:space="preserve">, який діє на підставі </w:t>
-      </w:r>
-      <w:r>
-        <w:rPr>
-          <w:rFonts w:ascii="Times New Roman" w:hAnsi="Times New Roman"/>
-          <w:bCs/>
-          <w:sz w:val="22"/>
-          <w:szCs w:val="22"/>
-          <w:lang w:val="uk-UA"/>
-        </w:rPr>
-        <w:t>@</w:t>
-      </w:r>
-      <w:proofErr w:type="spellStart"/>
-      <w:r>
-        <w:rPr>
-          <w:rFonts w:ascii="Times New Roman" w:hAnsi="Times New Roman"/>
-          <w:bCs/>
-          <w:sz w:val="22"/>
-          <w:szCs w:val="22"/>
           <w:lang w:val="en-US"/>
         </w:rPr>
-        <w:t>ri</w:t>
-      </w:r>
-      <w:proofErr w:type="spellEnd"/>
-      <w:r>
-        <w:rPr>
-          <w:rFonts w:ascii="Times New Roman" w:hAnsi="Times New Roman"/>
-          <w:bCs/>
-          <w:sz w:val="22"/>
-          <w:szCs w:val="22"/>
-          <w:lang w:val="uk-UA"/>
-        </w:rPr>
-        <w:t>_</w:t>
-      </w:r>
-      <w:proofErr w:type="spellStart"/>
-      <w:r>
-        <w:rPr>
-          <w:rFonts w:ascii="Times New Roman" w:hAnsi="Times New Roman"/>
-          <w:bCs/>
-          <w:sz w:val="22"/>
-          <w:szCs w:val="22"/>
-          <w:lang w:val="en-US"/>
-        </w:rPr>
         <w:t>pidstava</w:t>
       </w:r>
-      <w:proofErr w:type="spellEnd"/>
       <w:r>
         <w:rPr>
           <w:rFonts w:ascii="Times New Roman" w:hAnsi="Times New Roman"/>
@@ -555,6 +473,7 @@
     </w:p>
     <w:p>
       <w:pPr>
+        <w:pStyle w:val="Normal"/>
         <w:jc w:val="both"/>
         <w:rPr>
           <w:rFonts w:ascii="Times New Roman" w:hAnsi="Times New Roman" w:cs="Times New Roman"/>
@@ -567,7 +486,7 @@
       </w:pPr>
       <w:r>
         <w:rPr>
-          <w:rFonts w:ascii="Times New Roman" w:hAnsi="Times New Roman" w:cs="Times New Roman"/>
+          <w:rFonts w:cs="Times New Roman" w:ascii="Times New Roman" w:hAnsi="Times New Roman"/>
           <w:bCs/>
           <w:sz w:val="22"/>
           <w:szCs w:val="22"/>
@@ -576,7 +495,7 @@
       </w:r>
       <w:r>
         <w:rPr>
-          <w:rFonts w:ascii="Times New Roman" w:hAnsi="Times New Roman" w:cs="Times New Roman"/>
+          <w:rFonts w:cs="Times New Roman" w:ascii="Times New Roman" w:hAnsi="Times New Roman"/>
           <w:bCs/>
           <w:color w:val="000000"/>
           <w:sz w:val="22"/>
@@ -588,6 +507,7 @@
     </w:p>
     <w:p>
       <w:pPr>
+        <w:pStyle w:val="Normal"/>
         <w:jc w:val="both"/>
         <w:rPr>
           <w:rFonts w:ascii="Times New Roman" w:hAnsi="Times New Roman" w:cs="Times New Roman"/>
@@ -600,7 +520,7 @@
       </w:pPr>
       <w:r>
         <w:rPr>
-          <w:rFonts w:ascii="Times New Roman" w:hAnsi="Times New Roman" w:cs="Times New Roman"/>
+          <w:rFonts w:cs="Times New Roman" w:ascii="Times New Roman" w:hAnsi="Times New Roman"/>
           <w:bCs/>
           <w:color w:val="000000"/>
           <w:sz w:val="22"/>
@@ -611,7 +531,7 @@
       </w:r>
       <w:r>
         <w:rPr>
-          <w:rFonts w:ascii="Times New Roman" w:hAnsi="Times New Roman" w:cs="Times New Roman"/>
+          <w:rFonts w:cs="Times New Roman" w:ascii="Times New Roman" w:hAnsi="Times New Roman"/>
           <w:sz w:val="22"/>
           <w:szCs w:val="22"/>
         </w:rPr>
@@ -626,7 +546,7 @@
       </w:r>
       <w:r>
         <w:rPr>
-          <w:rFonts w:ascii="Times New Roman" w:hAnsi="Times New Roman" w:cs="Times New Roman"/>
+          <w:rFonts w:cs="Times New Roman" w:ascii="Times New Roman" w:hAnsi="Times New Roman"/>
           <w:bCs/>
           <w:color w:val="000000"/>
           <w:sz w:val="22"/>
@@ -637,7 +557,7 @@
       </w:r>
       <w:r>
         <w:rPr>
-          <w:rFonts w:ascii="Times New Roman" w:hAnsi="Times New Roman" w:cs="Times New Roman"/>
+          <w:rFonts w:cs="Times New Roman" w:ascii="Times New Roman" w:hAnsi="Times New Roman"/>
           <w:bCs/>
           <w:color w:val="000000"/>
           <w:sz w:val="22"/>
@@ -647,7 +567,7 @@
       </w:r>
       <w:r>
         <w:rPr>
-          <w:rFonts w:ascii="Times New Roman" w:hAnsi="Times New Roman" w:cs="Times New Roman"/>
+          <w:rFonts w:cs="Times New Roman" w:ascii="Times New Roman" w:hAnsi="Times New Roman"/>
           <w:bCs/>
           <w:color w:val="000000"/>
           <w:sz w:val="22"/>
@@ -659,6 +579,7 @@
     </w:p>
     <w:p>
       <w:pPr>
+        <w:pStyle w:val="Normal"/>
         <w:jc w:val="both"/>
         <w:rPr>
           <w:rFonts w:ascii="Times New Roman" w:hAnsi="Times New Roman" w:cs="Times New Roman"/>
@@ -671,40 +592,18 @@
       </w:pPr>
       <w:r>
         <w:rPr>
-          <w:rFonts w:ascii="Times New Roman" w:hAnsi="Times New Roman" w:cs="Times New Roman"/>
-          <w:bCs/>
-          <w:color w:val="000000"/>
-          <w:sz w:val="22"/>
-          <w:szCs w:val="22"/>
-          <w:lang w:val="uk-UA"/>
-        </w:rPr>
-        <w:t xml:space="preserve">Виконавцем в період часу з </w:t>
-      </w:r>
-      <w:r>
-        <w:rPr>
-          <w:rFonts w:ascii="Times New Roman" w:hAnsi="Times New Roman" w:cs="Times New Roman"/>
-          <w:bCs/>
-          <w:color w:val="000000"/>
-          <w:sz w:val="22"/>
-          <w:szCs w:val="22"/>
-          <w:lang w:val="uk-UA"/>
-        </w:rPr>
-        <w:t>0</w:t>
-      </w:r>
-      <w:r>
-        <w:rPr>
-          <w:rFonts w:ascii="Times New Roman" w:hAnsi="Times New Roman" w:cs="Times New Roman"/>
-          <w:bCs/>
-          <w:color w:val="000000"/>
-          <w:sz w:val="22"/>
-          <w:szCs w:val="22"/>
-          <w:lang w:val="uk-UA"/>
-        </w:rPr>
-        <w:t xml:space="preserve">1 </w:t>
-      </w:r>
-      <w:r>
-        <w:rPr>
-          <w:rFonts w:ascii="Times New Roman" w:hAnsi="Times New Roman" w:cs="Times New Roman"/>
+          <w:rFonts w:cs="Times New Roman" w:ascii="Times New Roman" w:hAnsi="Times New Roman"/>
+          <w:bCs/>
+          <w:color w:val="000000"/>
+          <w:sz w:val="22"/>
+          <w:szCs w:val="22"/>
+          <w:lang w:val="uk-UA"/>
+        </w:rPr>
+        <w:t xml:space="preserve">Виконавцем в період часу з 01 </w:t>
+      </w:r>
+      <w:r>
+        <w:rPr>
+          <w:rFonts w:cs="Times New Roman" w:ascii="Times New Roman" w:hAnsi="Times New Roman"/>
           <w:bCs/>
           <w:color w:val="000000"/>
           <w:sz w:val="22"/>
@@ -714,7 +613,7 @@
       </w:r>
       <w:r>
         <w:rPr>
-          <w:rFonts w:ascii="Times New Roman" w:hAnsi="Times New Roman" w:cs="Times New Roman"/>
+          <w:rFonts w:cs="Times New Roman" w:ascii="Times New Roman" w:hAnsi="Times New Roman"/>
           <w:bCs/>
           <w:color w:val="000000"/>
           <w:sz w:val="22"/>
@@ -725,7 +624,7 @@
       </w:r>
       <w:r>
         <w:rPr>
-          <w:rFonts w:ascii="Times New Roman" w:hAnsi="Times New Roman" w:cs="Times New Roman"/>
+          <w:rFonts w:cs="Times New Roman" w:ascii="Times New Roman" w:hAnsi="Times New Roman"/>
           <w:bCs/>
           <w:color w:val="000000"/>
           <w:sz w:val="22"/>
@@ -735,7 +634,7 @@
       </w:r>
       <w:r>
         <w:rPr>
-          <w:rFonts w:ascii="Times New Roman" w:hAnsi="Times New Roman" w:cs="Times New Roman"/>
+          <w:rFonts w:cs="Times New Roman" w:ascii="Times New Roman" w:hAnsi="Times New Roman"/>
           <w:bCs/>
           <w:color w:val="000000"/>
           <w:sz w:val="22"/>
@@ -746,7 +645,7 @@
       </w:r>
       <w:r>
         <w:rPr>
-          <w:rFonts w:ascii="Times New Roman" w:hAnsi="Times New Roman" w:cs="Times New Roman"/>
+          <w:rFonts w:cs="Times New Roman" w:ascii="Times New Roman" w:hAnsi="Times New Roman"/>
           <w:bCs/>
           <w:color w:val="000000"/>
           <w:sz w:val="22"/>
@@ -756,7 +655,7 @@
       </w:r>
       <w:r>
         <w:rPr>
-          <w:rFonts w:ascii="Times New Roman" w:hAnsi="Times New Roman" w:cs="Times New Roman"/>
+          <w:rFonts w:cs="Times New Roman" w:ascii="Times New Roman" w:hAnsi="Times New Roman"/>
           <w:bCs/>
           <w:color w:val="000000"/>
           <w:sz w:val="22"/>
@@ -767,7 +666,7 @@
       </w:r>
       <w:r>
         <w:rPr>
-          <w:rFonts w:ascii="Times New Roman" w:hAnsi="Times New Roman" w:cs="Times New Roman"/>
+          <w:rFonts w:cs="Times New Roman" w:ascii="Times New Roman" w:hAnsi="Times New Roman"/>
           <w:bCs/>
           <w:color w:val="000000"/>
           <w:sz w:val="22"/>
@@ -778,7 +677,7 @@
       </w:r>
       <w:r>
         <w:rPr>
-          <w:rFonts w:ascii="Times New Roman" w:hAnsi="Times New Roman" w:cs="Times New Roman"/>
+          <w:rFonts w:cs="Times New Roman" w:ascii="Times New Roman" w:hAnsi="Times New Roman"/>
           <w:bCs/>
           <w:color w:val="000000"/>
           <w:sz w:val="22"/>
@@ -788,7 +687,7 @@
       </w:r>
       <w:r>
         <w:rPr>
-          <w:rFonts w:ascii="Times New Roman" w:hAnsi="Times New Roman" w:cs="Times New Roman"/>
+          <w:rFonts w:cs="Times New Roman" w:ascii="Times New Roman" w:hAnsi="Times New Roman"/>
           <w:bCs/>
           <w:color w:val="000000"/>
           <w:sz w:val="22"/>
@@ -799,7 +698,7 @@
       </w:r>
       <w:r>
         <w:rPr>
-          <w:rFonts w:ascii="Times New Roman" w:hAnsi="Times New Roman" w:cs="Times New Roman"/>
+          <w:rFonts w:cs="Times New Roman" w:ascii="Times New Roman" w:hAnsi="Times New Roman"/>
           <w:bCs/>
           <w:color w:val="000000"/>
           <w:sz w:val="22"/>
@@ -809,7 +708,7 @@
       </w:r>
       <w:r>
         <w:rPr>
-          <w:rFonts w:ascii="Times New Roman" w:hAnsi="Times New Roman" w:cs="Times New Roman"/>
+          <w:rFonts w:cs="Times New Roman" w:ascii="Times New Roman" w:hAnsi="Times New Roman"/>
           <w:bCs/>
           <w:color w:val="000000"/>
           <w:sz w:val="22"/>
@@ -820,7 +719,7 @@
       </w:r>
       <w:r>
         <w:rPr>
-          <w:rFonts w:ascii="Times New Roman" w:hAnsi="Times New Roman" w:cs="Times New Roman"/>
+          <w:rFonts w:cs="Times New Roman" w:ascii="Times New Roman" w:hAnsi="Times New Roman"/>
           <w:bCs/>
           <w:color w:val="000000"/>
           <w:sz w:val="22"/>
@@ -830,7 +729,7 @@
       </w:r>
       <w:r>
         <w:rPr>
-          <w:rFonts w:ascii="Times New Roman" w:hAnsi="Times New Roman" w:cs="Times New Roman"/>
+          <w:rFonts w:cs="Times New Roman" w:ascii="Times New Roman" w:hAnsi="Times New Roman"/>
           <w:bCs/>
           <w:color w:val="000000"/>
           <w:sz w:val="22"/>
@@ -841,7 +740,7 @@
       </w:r>
       <w:r>
         <w:rPr>
-          <w:rFonts w:ascii="Times New Roman" w:hAnsi="Times New Roman" w:cs="Times New Roman"/>
+          <w:rFonts w:cs="Times New Roman" w:ascii="Times New Roman" w:hAnsi="Times New Roman"/>
           <w:bCs/>
           <w:color w:val="000000"/>
           <w:sz w:val="22"/>
@@ -851,7 +750,7 @@
       </w:r>
       <w:r>
         <w:rPr>
-          <w:rFonts w:ascii="Times New Roman" w:hAnsi="Times New Roman" w:cs="Times New Roman"/>
+          <w:rFonts w:cs="Times New Roman" w:ascii="Times New Roman" w:hAnsi="Times New Roman"/>
           <w:bCs/>
           <w:color w:val="000000"/>
           <w:sz w:val="22"/>
@@ -862,7 +761,7 @@
       </w:r>
       <w:r>
         <w:rPr>
-          <w:rFonts w:ascii="Times New Roman" w:hAnsi="Times New Roman" w:cs="Times New Roman"/>
+          <w:rFonts w:cs="Times New Roman" w:ascii="Times New Roman" w:hAnsi="Times New Roman"/>
           <w:bCs/>
           <w:color w:val="000000"/>
           <w:sz w:val="22"/>
@@ -872,7 +771,7 @@
       </w:r>
       <w:r>
         <w:rPr>
-          <w:rFonts w:ascii="Times New Roman" w:hAnsi="Times New Roman" w:cs="Times New Roman"/>
+          <w:rFonts w:cs="Times New Roman" w:ascii="Times New Roman" w:hAnsi="Times New Roman"/>
           <w:bCs/>
           <w:color w:val="000000"/>
           <w:sz w:val="22"/>
@@ -883,7 +782,7 @@
       </w:r>
       <w:r>
         <w:rPr>
-          <w:rFonts w:ascii="Times New Roman" w:hAnsi="Times New Roman" w:cs="Times New Roman"/>
+          <w:rFonts w:cs="Times New Roman" w:ascii="Times New Roman" w:hAnsi="Times New Roman"/>
           <w:bCs/>
           <w:color w:val="000000"/>
           <w:sz w:val="22"/>
@@ -894,7 +793,7 @@
       </w:r>
       <w:r>
         <w:rPr>
-          <w:rFonts w:ascii="Times New Roman" w:hAnsi="Times New Roman" w:cs="Times New Roman"/>
+          <w:rFonts w:cs="Times New Roman" w:ascii="Times New Roman" w:hAnsi="Times New Roman"/>
           <w:bCs/>
           <w:color w:val="000000"/>
           <w:sz w:val="22"/>
@@ -904,7 +803,7 @@
       </w:r>
       <w:r>
         <w:rPr>
-          <w:rFonts w:ascii="Times New Roman" w:hAnsi="Times New Roman" w:cs="Times New Roman"/>
+          <w:rFonts w:cs="Times New Roman" w:ascii="Times New Roman" w:hAnsi="Times New Roman"/>
           <w:bCs/>
           <w:color w:val="000000"/>
           <w:sz w:val="22"/>
@@ -915,7 +814,7 @@
       </w:r>
       <w:r>
         <w:rPr>
-          <w:rFonts w:ascii="Times New Roman" w:hAnsi="Times New Roman" w:cs="Times New Roman"/>
+          <w:rFonts w:cs="Times New Roman" w:ascii="Times New Roman" w:hAnsi="Times New Roman"/>
           <w:bCs/>
           <w:color w:val="000000"/>
           <w:sz w:val="22"/>
@@ -925,7 +824,7 @@
       </w:r>
       <w:r>
         <w:rPr>
-          <w:rFonts w:ascii="Times New Roman" w:hAnsi="Times New Roman" w:cs="Times New Roman"/>
+          <w:rFonts w:cs="Times New Roman" w:ascii="Times New Roman" w:hAnsi="Times New Roman"/>
           <w:bCs/>
           <w:color w:val="000000"/>
           <w:sz w:val="22"/>
@@ -936,7 +835,7 @@
       </w:r>
       <w:r>
         <w:rPr>
-          <w:rFonts w:ascii="Times New Roman" w:hAnsi="Times New Roman" w:cs="Times New Roman"/>
+          <w:rFonts w:cs="Times New Roman" w:ascii="Times New Roman" w:hAnsi="Times New Roman"/>
           <w:bCs/>
           <w:color w:val="000000"/>
           <w:sz w:val="22"/>
@@ -946,7 +845,7 @@
       </w:r>
       <w:r>
         <w:rPr>
-          <w:rFonts w:ascii="Times New Roman" w:hAnsi="Times New Roman" w:cs="Times New Roman"/>
+          <w:rFonts w:cs="Times New Roman" w:ascii="Times New Roman" w:hAnsi="Times New Roman"/>
           <w:bCs/>
           <w:color w:val="000000"/>
           <w:sz w:val="22"/>
@@ -957,7 +856,7 @@
       </w:r>
       <w:r>
         <w:rPr>
-          <w:rFonts w:ascii="Times New Roman" w:hAnsi="Times New Roman" w:cs="Times New Roman"/>
+          <w:rFonts w:cs="Times New Roman" w:ascii="Times New Roman" w:hAnsi="Times New Roman"/>
           <w:bCs/>
           <w:color w:val="000000"/>
           <w:sz w:val="22"/>
@@ -967,29 +866,19 @@
       </w:r>
       <w:r>
         <w:rPr>
-          <w:rFonts w:ascii="Times New Roman" w:hAnsi="Times New Roman" w:cs="Times New Roman"/>
-          <w:bCs/>
-          <w:color w:val="000000"/>
-          <w:sz w:val="22"/>
-          <w:szCs w:val="22"/>
-          <w:lang w:val="uk-UA"/>
-        </w:rPr>
-        <w:t>року</w:t>
-      </w:r>
-      <w:r>
-        <w:rPr>
-          <w:rFonts w:ascii="Times New Roman" w:hAnsi="Times New Roman" w:cs="Times New Roman"/>
-          <w:bCs/>
-          <w:color w:val="000000"/>
-          <w:sz w:val="22"/>
-          <w:szCs w:val="22"/>
-          <w:lang w:val="uk-UA"/>
-        </w:rPr>
-        <w:t xml:space="preserve"> були надані наступні послуги :</w:t>
+          <w:rFonts w:cs="Times New Roman" w:ascii="Times New Roman" w:hAnsi="Times New Roman"/>
+          <w:bCs/>
+          <w:color w:val="000000"/>
+          <w:sz w:val="22"/>
+          <w:szCs w:val="22"/>
+          <w:lang w:val="uk-UA"/>
+        </w:rPr>
+        <w:t>року були надані наступні послуги :</w:t>
       </w:r>
     </w:p>
     <w:p>
       <w:pPr>
+        <w:pStyle w:val="Normal"/>
         <w:jc w:val="both"/>
         <w:rPr>
           <w:rFonts w:ascii="Times New Roman" w:hAnsi="Times New Roman" w:cs="Times New Roman"/>
@@ -1000,34 +889,53 @@
           <w:lang w:val="uk-UA"/>
         </w:rPr>
       </w:pPr>
+      <w:r>
+        <w:rPr>
+          <w:rFonts w:cs="Times New Roman" w:ascii="Times New Roman" w:hAnsi="Times New Roman"/>
+          <w:bCs/>
+          <w:color w:val="000000"/>
+          <w:sz w:val="22"/>
+          <w:szCs w:val="22"/>
+          <w:lang w:val="uk-UA"/>
+        </w:rPr>
+      </w:r>
     </w:p>
     <w:tbl>
       <w:tblPr>
         <w:tblStyle w:val="TableGrid"/>
         <w:tblW w:w="10987" w:type="dxa"/>
-        <w:tblLook w:val="04A0" w:firstRow="1" w:lastRow="0" w:firstColumn="1" w:lastColumn="0" w:noHBand="0" w:noVBand="1"/>
+        <w:jc w:val="left"/>
+        <w:tblInd w:w="0" w:type="dxa"/>
+        <w:tblLayout w:type="fixed"/>
+        <w:tblCellMar>
+          <w:top w:w="0" w:type="dxa"/>
+          <w:left w:w="108" w:type="dxa"/>
+          <w:bottom w:w="0" w:type="dxa"/>
+          <w:right w:w="108" w:type="dxa"/>
+        </w:tblCellMar>
+        <w:tblLook w:val="04a0" w:noHBand="0" w:noVBand="1" w:firstColumn="1" w:lastRow="0" w:lastColumn="0" w:firstRow="1"/>
       </w:tblPr>
       <w:tblGrid>
-        <w:gridCol w:w="555"/>
-        <w:gridCol w:w="4637"/>
-        <w:gridCol w:w="1519"/>
+        <w:gridCol w:w="554"/>
+        <w:gridCol w:w="4638"/>
+        <w:gridCol w:w="1518"/>
         <w:gridCol w:w="1266"/>
-        <w:gridCol w:w="1521"/>
-        <w:gridCol w:w="16"/>
+        <w:gridCol w:w="1522"/>
+        <w:gridCol w:w="15"/>
         <w:gridCol w:w="1458"/>
         <w:gridCol w:w="15"/>
       </w:tblGrid>
       <w:tr>
-        <w:trPr>
-          <w:gridAfter w:val="1"/>
-          <w:wAfter w:w="16" w:type="dxa"/>
-        </w:trPr>
+        <w:trPr/>
         <w:tc>
           <w:tcPr>
-            <w:tcW w:w="562" w:type="dxa"/>
+            <w:tcW w:w="554" w:type="dxa"/>
+            <w:tcBorders/>
           </w:tcPr>
           <w:p>
             <w:pPr>
+              <w:pStyle w:val="Normal"/>
+              <w:spacing w:before="0" w:after="0"/>
               <w:jc w:val="both"/>
               <w:rPr>
                 <w:rFonts w:ascii="Times New Roman" w:hAnsi="Times New Roman" w:cs="Times New Roman"/>
@@ -1041,13 +949,14 @@
             </w:pPr>
             <w:r>
               <w:rPr>
-                <w:rFonts w:ascii="Times New Roman" w:hAnsi="Times New Roman" w:cs="Times New Roman"/>
-                <w:b/>
-                <w:bCs/>
-                <w:color w:val="000000"/>
-                <w:sz w:val="22"/>
-                <w:szCs w:val="22"/>
-                <w:lang w:val="uk-UA"/>
+                <w:rFonts w:cs="Times New Roman" w:ascii="Times New Roman" w:hAnsi="Times New Roman"/>
+                <w:b/>
+                <w:bCs/>
+                <w:color w:val="000000"/>
+                <w:kern w:val="0"/>
+                <w:sz w:val="22"/>
+                <w:szCs w:val="22"/>
+                <w:lang w:val="uk-UA" w:bidi="ar-SA"/>
               </w:rPr>
               <w:t>№</w:t>
             </w:r>
@@ -1055,10 +964,13 @@
         </w:tc>
         <w:tc>
           <w:tcPr>
-            <w:tcW w:w="4820" w:type="dxa"/>
+            <w:tcW w:w="4638" w:type="dxa"/>
+            <w:tcBorders/>
           </w:tcPr>
           <w:p>
             <w:pPr>
+              <w:pStyle w:val="Normal"/>
+              <w:spacing w:before="0" w:after="0"/>
               <w:jc w:val="center"/>
               <w:rPr>
                 <w:rFonts w:ascii="Times New Roman" w:hAnsi="Times New Roman" w:cs="Times New Roman"/>
@@ -1072,13 +984,14 @@
             </w:pPr>
             <w:r>
               <w:rPr>
-                <w:rFonts w:ascii="Times New Roman" w:hAnsi="Times New Roman" w:cs="Times New Roman"/>
-                <w:b/>
-                <w:bCs/>
-                <w:color w:val="000000"/>
-                <w:sz w:val="22"/>
-                <w:szCs w:val="22"/>
-                <w:lang w:val="uk-UA"/>
+                <w:rFonts w:cs="Times New Roman" w:ascii="Times New Roman" w:hAnsi="Times New Roman"/>
+                <w:b/>
+                <w:bCs/>
+                <w:color w:val="000000"/>
+                <w:kern w:val="0"/>
+                <w:sz w:val="22"/>
+                <w:szCs w:val="22"/>
+                <w:lang w:val="uk-UA" w:bidi="ar-SA"/>
               </w:rPr>
               <w:t>Найменування послуги</w:t>
             </w:r>
@@ -1086,10 +999,13 @@
         </w:tc>
         <w:tc>
           <w:tcPr>
-            <w:tcW w:w="1276" w:type="dxa"/>
+            <w:tcW w:w="1518" w:type="dxa"/>
+            <w:tcBorders/>
           </w:tcPr>
           <w:p>
             <w:pPr>
+              <w:pStyle w:val="Normal"/>
+              <w:spacing w:before="0" w:after="0"/>
               <w:jc w:val="center"/>
               <w:rPr>
                 <w:rFonts w:ascii="Times New Roman" w:hAnsi="Times New Roman" w:cs="Times New Roman"/>
@@ -1103,19 +1019,22 @@
             </w:pPr>
             <w:r>
               <w:rPr>
-                <w:rFonts w:ascii="Times New Roman" w:hAnsi="Times New Roman" w:cs="Times New Roman"/>
-                <w:b/>
-                <w:bCs/>
-                <w:color w:val="000000"/>
-                <w:sz w:val="22"/>
-                <w:szCs w:val="22"/>
-                <w:lang w:val="uk-UA"/>
+                <w:rFonts w:cs="Times New Roman" w:ascii="Times New Roman" w:hAnsi="Times New Roman"/>
+                <w:b/>
+                <w:bCs/>
+                <w:color w:val="000000"/>
+                <w:kern w:val="0"/>
+                <w:sz w:val="22"/>
+                <w:szCs w:val="22"/>
+                <w:lang w:val="uk-UA" w:bidi="ar-SA"/>
               </w:rPr>
               <w:t>Кількість</w:t>
             </w:r>
           </w:p>
           <w:p>
             <w:pPr>
+              <w:pStyle w:val="Normal"/>
+              <w:spacing w:before="0" w:after="0"/>
               <w:jc w:val="center"/>
               <w:rPr>
                 <w:rFonts w:ascii="Times New Roman" w:hAnsi="Times New Roman" w:cs="Times New Roman"/>
@@ -1127,14 +1046,29 @@
                 <w:lang w:val="uk-UA"/>
               </w:rPr>
             </w:pPr>
+            <w:r>
+              <w:rPr>
+                <w:rFonts w:cs="Times New Roman" w:ascii="Times New Roman" w:hAnsi="Times New Roman"/>
+                <w:b/>
+                <w:bCs/>
+                <w:color w:val="000000"/>
+                <w:kern w:val="0"/>
+                <w:sz w:val="22"/>
+                <w:szCs w:val="22"/>
+                <w:lang w:val="uk-UA" w:bidi="ar-SA"/>
+              </w:rPr>
+            </w:r>
           </w:p>
         </w:tc>
         <w:tc>
           <w:tcPr>
-            <w:tcW w:w="1275" w:type="dxa"/>
+            <w:tcW w:w="1266" w:type="dxa"/>
+            <w:tcBorders/>
           </w:tcPr>
           <w:p>
             <w:pPr>
+              <w:pStyle w:val="Normal"/>
+              <w:spacing w:before="0" w:after="0"/>
               <w:jc w:val="center"/>
               <w:rPr>
                 <w:rFonts w:ascii="Times New Roman" w:hAnsi="Times New Roman" w:cs="Times New Roman"/>
@@ -1148,19 +1082,22 @@
             </w:pPr>
             <w:r>
               <w:rPr>
-                <w:rFonts w:ascii="Times New Roman" w:hAnsi="Times New Roman" w:cs="Times New Roman"/>
-                <w:b/>
-                <w:bCs/>
-                <w:color w:val="000000"/>
-                <w:sz w:val="22"/>
-                <w:szCs w:val="22"/>
-                <w:lang w:val="uk-UA"/>
+                <w:rFonts w:cs="Times New Roman" w:ascii="Times New Roman" w:hAnsi="Times New Roman"/>
+                <w:b/>
+                <w:bCs/>
+                <w:color w:val="000000"/>
+                <w:kern w:val="0"/>
+                <w:sz w:val="22"/>
+                <w:szCs w:val="22"/>
+                <w:lang w:val="uk-UA" w:bidi="ar-SA"/>
               </w:rPr>
               <w:t>Одиниця</w:t>
             </w:r>
           </w:p>
           <w:p>
             <w:pPr>
+              <w:pStyle w:val="Normal"/>
+              <w:spacing w:before="0" w:after="0"/>
               <w:jc w:val="center"/>
               <w:rPr>
                 <w:rFonts w:ascii="Times New Roman" w:hAnsi="Times New Roman" w:cs="Times New Roman"/>
@@ -1174,19 +1111,22 @@
             </w:pPr>
             <w:r>
               <w:rPr>
-                <w:rFonts w:ascii="Times New Roman" w:hAnsi="Times New Roman" w:cs="Times New Roman"/>
-                <w:b/>
-                <w:bCs/>
-                <w:color w:val="000000"/>
-                <w:sz w:val="22"/>
-                <w:szCs w:val="22"/>
-                <w:lang w:val="uk-UA"/>
+                <w:rFonts w:cs="Times New Roman" w:ascii="Times New Roman" w:hAnsi="Times New Roman"/>
+                <w:b/>
+                <w:bCs/>
+                <w:color w:val="000000"/>
+                <w:kern w:val="0"/>
+                <w:sz w:val="22"/>
+                <w:szCs w:val="22"/>
+                <w:lang w:val="uk-UA" w:bidi="ar-SA"/>
               </w:rPr>
               <w:t>Виміру</w:t>
             </w:r>
           </w:p>
           <w:p>
             <w:pPr>
+              <w:pStyle w:val="Normal"/>
+              <w:spacing w:before="0" w:after="0"/>
               <w:jc w:val="center"/>
               <w:rPr>
                 <w:rFonts w:ascii="Times New Roman" w:hAnsi="Times New Roman" w:cs="Times New Roman"/>
@@ -1198,14 +1138,29 @@
                 <w:lang w:val="uk-UA"/>
               </w:rPr>
             </w:pPr>
+            <w:r>
+              <w:rPr>
+                <w:rFonts w:cs="Times New Roman" w:ascii="Times New Roman" w:hAnsi="Times New Roman"/>
+                <w:b/>
+                <w:bCs/>
+                <w:color w:val="000000"/>
+                <w:kern w:val="0"/>
+                <w:sz w:val="22"/>
+                <w:szCs w:val="22"/>
+                <w:lang w:val="uk-UA" w:bidi="ar-SA"/>
+              </w:rPr>
+            </w:r>
           </w:p>
         </w:tc>
         <w:tc>
           <w:tcPr>
-            <w:tcW w:w="1559" w:type="dxa"/>
+            <w:tcW w:w="1522" w:type="dxa"/>
+            <w:tcBorders/>
           </w:tcPr>
           <w:p>
             <w:pPr>
+              <w:pStyle w:val="Normal"/>
+              <w:spacing w:before="0" w:after="0"/>
               <w:jc w:val="center"/>
               <w:rPr>
                 <w:rFonts w:ascii="Times New Roman" w:hAnsi="Times New Roman" w:cs="Times New Roman"/>
@@ -1219,31 +1174,22 @@
             </w:pPr>
             <w:r>
               <w:rPr>
-                <w:rFonts w:ascii="Times New Roman" w:hAnsi="Times New Roman" w:cs="Times New Roman"/>
-                <w:b/>
-                <w:bCs/>
-                <w:color w:val="000000"/>
-                <w:sz w:val="22"/>
-                <w:szCs w:val="22"/>
-                <w:lang w:val="uk-UA"/>
-              </w:rPr>
-              <w:t>Ціна</w:t>
-            </w:r>
-            <w:r>
-              <w:rPr>
-                <w:rFonts w:ascii="Times New Roman" w:hAnsi="Times New Roman" w:cs="Times New Roman"/>
-                <w:b/>
-                <w:bCs/>
-                <w:color w:val="000000"/>
-                <w:sz w:val="22"/>
-                <w:szCs w:val="22"/>
-                <w:lang w:val="uk-UA"/>
-              </w:rPr>
-              <w:t xml:space="preserve"> </w:t>
-            </w:r>
-          </w:p>
-          <w:p>
-            <w:pPr>
+                <w:rFonts w:cs="Times New Roman" w:ascii="Times New Roman" w:hAnsi="Times New Roman"/>
+                <w:b/>
+                <w:bCs/>
+                <w:color w:val="000000"/>
+                <w:kern w:val="0"/>
+                <w:sz w:val="22"/>
+                <w:szCs w:val="22"/>
+                <w:lang w:val="uk-UA" w:bidi="ar-SA"/>
+              </w:rPr>
+              <w:t xml:space="preserve">Ціна </w:t>
+            </w:r>
+          </w:p>
+          <w:p>
+            <w:pPr>
+              <w:pStyle w:val="Normal"/>
+              <w:spacing w:before="0" w:after="0"/>
               <w:jc w:val="center"/>
               <w:rPr>
                 <w:rFonts w:ascii="Times New Roman" w:hAnsi="Times New Roman" w:cs="Times New Roman"/>
@@ -1257,19 +1203,22 @@
             </w:pPr>
             <w:r>
               <w:rPr>
-                <w:rFonts w:ascii="Times New Roman" w:hAnsi="Times New Roman" w:cs="Times New Roman"/>
-                <w:b/>
-                <w:bCs/>
-                <w:color w:val="000000"/>
-                <w:sz w:val="22"/>
-                <w:szCs w:val="22"/>
-                <w:lang w:val="uk-UA"/>
+                <w:rFonts w:cs="Times New Roman" w:ascii="Times New Roman" w:hAnsi="Times New Roman"/>
+                <w:b/>
+                <w:bCs/>
+                <w:color w:val="000000"/>
+                <w:kern w:val="0"/>
+                <w:sz w:val="22"/>
+                <w:szCs w:val="22"/>
+                <w:lang w:val="uk-UA" w:bidi="ar-SA"/>
               </w:rPr>
               <w:t>без ПДВ</w:t>
             </w:r>
           </w:p>
           <w:p>
             <w:pPr>
+              <w:pStyle w:val="Normal"/>
+              <w:spacing w:before="0" w:after="0"/>
               <w:jc w:val="center"/>
               <w:rPr>
                 <w:rFonts w:ascii="Times New Roman" w:hAnsi="Times New Roman" w:cs="Times New Roman"/>
@@ -1281,15 +1230,30 @@
                 <w:lang w:val="uk-UA"/>
               </w:rPr>
             </w:pPr>
+            <w:r>
+              <w:rPr>
+                <w:rFonts w:cs="Times New Roman" w:ascii="Times New Roman" w:hAnsi="Times New Roman"/>
+                <w:b/>
+                <w:bCs/>
+                <w:color w:val="000000"/>
+                <w:kern w:val="0"/>
+                <w:sz w:val="22"/>
+                <w:szCs w:val="22"/>
+                <w:lang w:val="uk-UA" w:bidi="ar-SA"/>
+              </w:rPr>
+            </w:r>
           </w:p>
         </w:tc>
         <w:tc>
           <w:tcPr>
-            <w:tcW w:w="1479" w:type="dxa"/>
+            <w:tcW w:w="1473" w:type="dxa"/>
             <w:gridSpan w:val="2"/>
+            <w:tcBorders/>
           </w:tcPr>
           <w:p>
             <w:pPr>
+              <w:pStyle w:val="Normal"/>
+              <w:spacing w:before="0" w:after="0"/>
               <w:jc w:val="center"/>
               <w:rPr>
                 <w:rFonts w:ascii="Times New Roman" w:hAnsi="Times New Roman" w:cs="Times New Roman"/>
@@ -1303,31 +1267,61 @@
             </w:pPr>
             <w:r>
               <w:rPr>
-                <w:rFonts w:ascii="Times New Roman" w:hAnsi="Times New Roman" w:cs="Times New Roman"/>
-                <w:b/>
-                <w:bCs/>
-                <w:color w:val="000000"/>
-                <w:sz w:val="22"/>
-                <w:szCs w:val="22"/>
-                <w:lang w:val="uk-UA"/>
+                <w:rFonts w:cs="Times New Roman" w:ascii="Times New Roman" w:hAnsi="Times New Roman"/>
+                <w:b/>
+                <w:bCs/>
+                <w:color w:val="000000"/>
+                <w:kern w:val="0"/>
+                <w:sz w:val="22"/>
+                <w:szCs w:val="22"/>
+                <w:lang w:val="uk-UA" w:bidi="ar-SA"/>
               </w:rPr>
               <w:t>Сума без ПДВ</w:t>
+            </w:r>
+          </w:p>
+        </w:tc>
+        <w:tc>
+          <w:tcPr>
+            <w:tcW w:w="15" w:type="dxa"/>
+            <w:tcBorders>
+              <w:top w:val="nil"/>
+              <w:left w:val="nil"/>
+              <w:bottom w:val="nil"/>
+              <w:right w:val="nil"/>
+            </w:tcBorders>
+          </w:tcPr>
+          <w:p>
+            <w:pPr>
+              <w:pStyle w:val="Normal"/>
+              <w:spacing w:before="0" w:after="0"/>
+              <w:jc w:val="left"/>
+              <w:rPr>
+                <w:kern w:val="0"/>
+                <w:lang w:bidi="ar-SA"/>
+              </w:rPr>
+            </w:pPr>
+            <w:r>
+              <w:rPr>
+                <w:kern w:val="0"/>
+                <w:lang w:bidi="ar-SA"/>
+              </w:rPr>
             </w:r>
           </w:p>
         </w:tc>
       </w:tr>
       <w:tr>
         <w:trPr>
-          <w:gridAfter w:val="1"/>
-          <w:wAfter w:w="16" w:type="dxa"/>
-          <w:trHeight w:val="1156"/>
+          <w:trHeight w:val="1156" w:hRule="atLeast"/>
         </w:trPr>
         <w:tc>
           <w:tcPr>
-            <w:tcW w:w="562" w:type="dxa"/>
+            <w:tcW w:w="554" w:type="dxa"/>
+            <w:tcBorders/>
           </w:tcPr>
           <w:p>
             <w:pPr>
+              <w:pStyle w:val="Normal"/>
+              <w:spacing w:before="0" w:after="0"/>
               <w:jc w:val="both"/>
               <w:rPr>
                 <w:rFonts w:ascii="Times New Roman" w:hAnsi="Times New Roman" w:cs="Times New Roman"/>
@@ -1340,12 +1334,13 @@
             </w:pPr>
             <w:r>
               <w:rPr>
-                <w:rFonts w:ascii="Times New Roman" w:hAnsi="Times New Roman" w:cs="Times New Roman"/>
-                <w:bCs/>
-                <w:color w:val="000000"/>
-                <w:sz w:val="22"/>
-                <w:szCs w:val="22"/>
-                <w:lang w:val="uk-UA"/>
+                <w:rFonts w:cs="Times New Roman" w:ascii="Times New Roman" w:hAnsi="Times New Roman"/>
+                <w:bCs/>
+                <w:color w:val="000000"/>
+                <w:kern w:val="0"/>
+                <w:sz w:val="22"/>
+                <w:szCs w:val="22"/>
+                <w:lang w:val="uk-UA" w:bidi="ar-SA"/>
               </w:rPr>
               <w:t>1</w:t>
             </w:r>
@@ -1353,47 +1348,39 @@
         </w:tc>
         <w:tc>
           <w:tcPr>
-            <w:tcW w:w="4820" w:type="dxa"/>
+            <w:tcW w:w="4638" w:type="dxa"/>
+            <w:tcBorders/>
           </w:tcPr>
           <w:p>
             <w:pPr>
-              <w:rPr>
-                <w:rFonts w:ascii="Times New Roman" w:hAnsi="Times New Roman" w:cs="Times New Roman"/>
-                <w:bCs/>
-                <w:color w:val="000000"/>
-                <w:sz w:val="22"/>
-                <w:szCs w:val="22"/>
-              </w:rPr>
-            </w:pPr>
-            <w:r>
-              <w:rPr>
-                <w:rFonts w:ascii="Times New Roman" w:eastAsia="Calibri" w:hAnsi="Times New Roman" w:cs="Times New Roman"/>
-                <w:sz w:val="22"/>
-                <w:szCs w:val="22"/>
-              </w:rPr>
-              <w:t xml:space="preserve">Перевірка, налаштування,  моніторинг стану програмного забезпечення  технічних засобів електронних комунікацій </w:t>
-            </w:r>
-            <w:r>
-              <w:rPr>
-                <w:rFonts w:ascii="Times New Roman" w:eastAsia="Calibri" w:hAnsi="Times New Roman" w:cs="Times New Roman"/>
-                <w:sz w:val="22"/>
-                <w:szCs w:val="22"/>
-              </w:rPr>
-              <w:t>1</w:t>
-            </w:r>
-            <w:r>
-              <w:rPr>
-                <w:rFonts w:ascii="Times New Roman" w:eastAsia="Calibri" w:hAnsi="Times New Roman" w:cs="Times New Roman"/>
-                <w:sz w:val="22"/>
-                <w:szCs w:val="22"/>
-              </w:rPr>
-              <w:t xml:space="preserve"> рівня </w:t>
-            </w:r>
-            <w:r>
-              <w:rPr>
-                <w:rFonts w:ascii="Times New Roman" w:hAnsi="Times New Roman" w:cs="Times New Roman"/>
-                <w:sz w:val="22"/>
-                <w:szCs w:val="22"/>
+              <w:pStyle w:val="Normal"/>
+              <w:spacing w:before="0" w:after="0"/>
+              <w:jc w:val="left"/>
+              <w:rPr>
+                <w:rFonts w:ascii="Times New Roman" w:hAnsi="Times New Roman" w:cs="Times New Roman"/>
+                <w:bCs/>
+                <w:color w:val="000000"/>
+                <w:sz w:val="22"/>
+                <w:szCs w:val="22"/>
+              </w:rPr>
+            </w:pPr>
+            <w:r>
+              <w:rPr>
+                <w:rFonts w:eastAsia="Calibri" w:cs="Times New Roman" w:ascii="Times New Roman" w:hAnsi="Times New Roman"/>
+                <w:kern w:val="0"/>
+                <w:sz w:val="22"/>
+                <w:szCs w:val="22"/>
+                <w:lang w:bidi="ar-SA"/>
+              </w:rPr>
+              <w:t xml:space="preserve">Перевірка, налаштування,  моніторинг стану програмного забезпечення  технічних засобів електронних комунікацій 1 рівня </w:t>
+            </w:r>
+            <w:r>
+              <w:rPr>
+                <w:rFonts w:cs="Times New Roman" w:ascii="Times New Roman" w:hAnsi="Times New Roman"/>
+                <w:kern w:val="0"/>
+                <w:sz w:val="22"/>
+                <w:szCs w:val="22"/>
+                <w:lang w:bidi="ar-SA"/>
               </w:rPr>
               <w:t>(встановлення, оновлення, виправлення помилок тощо).</w:t>
             </w:r>
@@ -1401,10 +1388,13 @@
         </w:tc>
         <w:tc>
           <w:tcPr>
-            <w:tcW w:w="1276" w:type="dxa"/>
+            <w:tcW w:w="1518" w:type="dxa"/>
+            <w:tcBorders/>
           </w:tcPr>
           <w:p>
             <w:pPr>
+              <w:pStyle w:val="Normal"/>
+              <w:spacing w:before="0" w:after="0"/>
               <w:jc w:val="center"/>
               <w:rPr>
                 <w:rFonts w:ascii="Times New Roman" w:hAnsi="Times New Roman" w:cs="Times New Roman"/>
@@ -1417,18 +1407,22 @@
             </w:pPr>
             <w:r>
               <w:rPr>
-                <w:rFonts w:ascii="Times New Roman" w:hAnsi="Times New Roman" w:cs="Times New Roman"/>
-                <w:bCs/>
-                <w:color w:val="000000"/>
+                <w:rFonts w:cs="Times New Roman" w:ascii="Times New Roman" w:hAnsi="Times New Roman"/>
+                <w:bCs/>
+                <w:color w:val="000000"/>
+                <w:kern w:val="0"/>
                 <w:sz w:val="22"/>
                 <w:szCs w:val="22"/>
                 <w:highlight w:val="yellow"/>
+                <w:lang w:bidi="ar-SA"/>
               </w:rPr>
               <w:t>@rank1_count</w:t>
             </w:r>
           </w:p>
           <w:p>
             <w:pPr>
+              <w:pStyle w:val="Normal"/>
+              <w:spacing w:before="0" w:after="0"/>
               <w:jc w:val="center"/>
               <w:rPr>
                 <w:rFonts w:ascii="Times New Roman" w:hAnsi="Times New Roman" w:cs="Times New Roman"/>
@@ -1439,14 +1433,28 @@
                 <w:lang w:val="uk-UA"/>
               </w:rPr>
             </w:pPr>
+            <w:r>
+              <w:rPr>
+                <w:rFonts w:cs="Times New Roman" w:ascii="Times New Roman" w:hAnsi="Times New Roman"/>
+                <w:bCs/>
+                <w:color w:val="000000"/>
+                <w:kern w:val="0"/>
+                <w:sz w:val="22"/>
+                <w:szCs w:val="22"/>
+                <w:lang w:val="uk-UA" w:bidi="ar-SA"/>
+              </w:rPr>
+            </w:r>
           </w:p>
         </w:tc>
         <w:tc>
           <w:tcPr>
-            <w:tcW w:w="1275" w:type="dxa"/>
+            <w:tcW w:w="1266" w:type="dxa"/>
+            <w:tcBorders/>
           </w:tcPr>
           <w:p>
             <w:pPr>
+              <w:pStyle w:val="Normal"/>
+              <w:spacing w:before="0" w:after="0"/>
               <w:jc w:val="center"/>
               <w:rPr>
                 <w:rFonts w:ascii="Times New Roman" w:hAnsi="Times New Roman" w:cs="Times New Roman"/>
@@ -1459,12 +1467,13 @@
             </w:pPr>
             <w:r>
               <w:rPr>
-                <w:rFonts w:ascii="Times New Roman" w:hAnsi="Times New Roman" w:cs="Times New Roman"/>
-                <w:bCs/>
-                <w:color w:val="000000"/>
-                <w:sz w:val="22"/>
-                <w:szCs w:val="22"/>
-                <w:lang w:val="uk-UA"/>
+                <w:rFonts w:cs="Times New Roman" w:ascii="Times New Roman" w:hAnsi="Times New Roman"/>
+                <w:bCs/>
+                <w:color w:val="000000"/>
+                <w:kern w:val="0"/>
+                <w:sz w:val="22"/>
+                <w:szCs w:val="22"/>
+                <w:lang w:val="uk-UA" w:bidi="ar-SA"/>
               </w:rPr>
               <w:t>шт</w:t>
             </w:r>
@@ -1472,10 +1481,13 @@
         </w:tc>
         <w:tc>
           <w:tcPr>
-            <w:tcW w:w="1559" w:type="dxa"/>
+            <w:tcW w:w="1522" w:type="dxa"/>
+            <w:tcBorders/>
           </w:tcPr>
           <w:p>
             <w:pPr>
+              <w:pStyle w:val="Normal"/>
+              <w:spacing w:before="0" w:after="0"/>
               <w:jc w:val="center"/>
               <w:rPr>
                 <w:rFonts w:ascii="Times New Roman" w:hAnsi="Times New Roman" w:cs="Times New Roman"/>
@@ -1488,35 +1500,28 @@
             </w:pPr>
             <w:r>
               <w:rPr>
-                <w:rFonts w:ascii="Times New Roman" w:hAnsi="Times New Roman" w:cs="Times New Roman"/>
-                <w:bCs/>
-                <w:color w:val="000000"/>
-                <w:sz w:val="22"/>
-                <w:szCs w:val="22"/>
-                <w:lang w:val="uk-UA"/>
-              </w:rPr>
-              <w:t>10</w:t>
-            </w:r>
-            <w:r>
-              <w:rPr>
-                <w:rFonts w:ascii="Times New Roman" w:hAnsi="Times New Roman" w:cs="Times New Roman"/>
-                <w:bCs/>
-                <w:color w:val="000000"/>
-                <w:sz w:val="22"/>
-                <w:szCs w:val="22"/>
-                <w:lang w:val="uk-UA"/>
-              </w:rPr>
-              <w:t>00,00</w:t>
+                <w:rFonts w:cs="Times New Roman" w:ascii="Times New Roman" w:hAnsi="Times New Roman"/>
+                <w:bCs/>
+                <w:color w:val="000000"/>
+                <w:kern w:val="0"/>
+                <w:sz w:val="22"/>
+                <w:szCs w:val="22"/>
+                <w:lang w:val="uk-UA" w:bidi="ar-SA"/>
+              </w:rPr>
+              <w:t>1000,00</w:t>
             </w:r>
           </w:p>
         </w:tc>
         <w:tc>
           <w:tcPr>
-            <w:tcW w:w="1479" w:type="dxa"/>
+            <w:tcW w:w="1473" w:type="dxa"/>
             <w:gridSpan w:val="2"/>
+            <w:tcBorders/>
           </w:tcPr>
           <w:p>
             <w:pPr>
+              <w:pStyle w:val="Normal"/>
+              <w:spacing w:before="0" w:after="0"/>
               <w:jc w:val="both"/>
               <w:rPr>
                 <w:rFonts w:ascii="Times New Roman" w:hAnsi="Times New Roman" w:cs="Times New Roman"/>
@@ -1529,18 +1534,22 @@
             </w:pPr>
             <w:r>
               <w:rPr>
-                <w:rFonts w:ascii="Times New Roman" w:hAnsi="Times New Roman" w:cs="Times New Roman"/>
-                <w:bCs/>
-                <w:color w:val="000000"/>
+                <w:rFonts w:cs="Times New Roman" w:ascii="Times New Roman" w:hAnsi="Times New Roman"/>
+                <w:bCs/>
+                <w:color w:val="000000"/>
+                <w:kern w:val="0"/>
                 <w:sz w:val="22"/>
                 <w:szCs w:val="22"/>
                 <w:highlight w:val="yellow"/>
+                <w:lang w:bidi="ar-SA"/>
               </w:rPr>
               <w:t>@rank1_sum</w:t>
             </w:r>
           </w:p>
           <w:p>
             <w:pPr>
+              <w:pStyle w:val="Normal"/>
+              <w:spacing w:before="0" w:after="0"/>
               <w:jc w:val="both"/>
               <w:rPr>
                 <w:rFonts w:ascii="Times New Roman" w:hAnsi="Times New Roman" w:cs="Times New Roman"/>
@@ -1551,21 +1560,61 @@
                 <w:lang w:val="uk-UA"/>
               </w:rPr>
             </w:pPr>
+            <w:r>
+              <w:rPr>
+                <w:rFonts w:cs="Times New Roman" w:ascii="Times New Roman" w:hAnsi="Times New Roman"/>
+                <w:bCs/>
+                <w:color w:val="000000"/>
+                <w:kern w:val="0"/>
+                <w:sz w:val="22"/>
+                <w:szCs w:val="22"/>
+                <w:lang w:val="uk-UA" w:bidi="ar-SA"/>
+              </w:rPr>
+            </w:r>
+          </w:p>
+        </w:tc>
+        <w:tc>
+          <w:tcPr>
+            <w:tcW w:w="15" w:type="dxa"/>
+            <w:tcBorders>
+              <w:top w:val="nil"/>
+              <w:left w:val="nil"/>
+              <w:bottom w:val="nil"/>
+              <w:right w:val="nil"/>
+            </w:tcBorders>
+          </w:tcPr>
+          <w:p>
+            <w:pPr>
+              <w:pStyle w:val="Normal"/>
+              <w:spacing w:before="0" w:after="0"/>
+              <w:jc w:val="left"/>
+              <w:rPr>
+                <w:kern w:val="0"/>
+                <w:lang w:bidi="ar-SA"/>
+              </w:rPr>
+            </w:pPr>
+            <w:r>
+              <w:rPr>
+                <w:kern w:val="0"/>
+                <w:lang w:bidi="ar-SA"/>
+              </w:rPr>
+            </w:r>
           </w:p>
         </w:tc>
       </w:tr>
       <w:tr>
         <w:trPr>
-          <w:gridAfter w:val="1"/>
-          <w:wAfter w:w="16" w:type="dxa"/>
-          <w:trHeight w:val="1014"/>
+          <w:trHeight w:val="1014" w:hRule="atLeast"/>
         </w:trPr>
         <w:tc>
           <w:tcPr>
-            <w:tcW w:w="562" w:type="dxa"/>
+            <w:tcW w:w="554" w:type="dxa"/>
+            <w:tcBorders/>
           </w:tcPr>
           <w:p>
             <w:pPr>
+              <w:pStyle w:val="Normal"/>
+              <w:spacing w:before="0" w:after="0"/>
               <w:jc w:val="both"/>
               <w:rPr>
                 <w:rFonts w:ascii="Times New Roman" w:hAnsi="Times New Roman" w:cs="Times New Roman"/>
@@ -1578,12 +1627,13 @@
             </w:pPr>
             <w:r>
               <w:rPr>
-                <w:rFonts w:ascii="Times New Roman" w:hAnsi="Times New Roman" w:cs="Times New Roman"/>
-                <w:bCs/>
-                <w:color w:val="000000"/>
-                <w:sz w:val="22"/>
-                <w:szCs w:val="22"/>
-                <w:lang w:val="uk-UA"/>
+                <w:rFonts w:cs="Times New Roman" w:ascii="Times New Roman" w:hAnsi="Times New Roman"/>
+                <w:bCs/>
+                <w:color w:val="000000"/>
+                <w:kern w:val="0"/>
+                <w:sz w:val="22"/>
+                <w:szCs w:val="22"/>
+                <w:lang w:val="uk-UA" w:bidi="ar-SA"/>
               </w:rPr>
               <w:t>2.</w:t>
             </w:r>
@@ -1591,73 +1641,83 @@
         </w:tc>
         <w:tc>
           <w:tcPr>
-            <w:tcW w:w="4820" w:type="dxa"/>
+            <w:tcW w:w="4638" w:type="dxa"/>
+            <w:tcBorders/>
           </w:tcPr>
           <w:p>
             <w:pPr>
-              <w:rPr>
-                <w:rFonts w:ascii="Times New Roman" w:eastAsia="Calibri" w:hAnsi="Times New Roman" w:cs="Times New Roman"/>
-                <w:sz w:val="22"/>
-                <w:szCs w:val="22"/>
-              </w:rPr>
-            </w:pPr>
-            <w:r>
-              <w:rPr>
-                <w:rFonts w:ascii="Times New Roman" w:eastAsia="Calibri" w:hAnsi="Times New Roman" w:cs="Times New Roman"/>
-                <w:sz w:val="22"/>
-                <w:szCs w:val="22"/>
-              </w:rPr>
-              <w:t xml:space="preserve">Перевірка, налаштування,  моніторинг стану програмного забезпечення  технічних засобів електронних комунікацій </w:t>
-            </w:r>
-            <w:r>
-              <w:rPr>
-                <w:rFonts w:ascii="Times New Roman" w:eastAsia="Calibri" w:hAnsi="Times New Roman" w:cs="Times New Roman"/>
-                <w:sz w:val="22"/>
-                <w:szCs w:val="22"/>
-              </w:rPr>
-              <w:t>2</w:t>
-            </w:r>
-            <w:r>
-              <w:rPr>
-                <w:rFonts w:ascii="Times New Roman" w:eastAsia="Calibri" w:hAnsi="Times New Roman" w:cs="Times New Roman"/>
-                <w:sz w:val="22"/>
-                <w:szCs w:val="22"/>
-              </w:rPr>
-              <w:t xml:space="preserve"> рівня </w:t>
-            </w:r>
-            <w:r>
-              <w:rPr>
-                <w:rFonts w:ascii="Times New Roman" w:hAnsi="Times New Roman" w:cs="Times New Roman"/>
-                <w:sz w:val="22"/>
-                <w:szCs w:val="22"/>
+              <w:pStyle w:val="Normal"/>
+              <w:spacing w:before="0" w:after="0"/>
+              <w:jc w:val="left"/>
+              <w:rPr>
+                <w:rFonts w:ascii="Times New Roman" w:hAnsi="Times New Roman" w:eastAsia="Calibri" w:cs="Times New Roman"/>
+                <w:sz w:val="22"/>
+                <w:szCs w:val="22"/>
+              </w:rPr>
+            </w:pPr>
+            <w:r>
+              <w:rPr>
+                <w:rFonts w:eastAsia="Calibri" w:cs="Times New Roman" w:ascii="Times New Roman" w:hAnsi="Times New Roman"/>
+                <w:kern w:val="0"/>
+                <w:sz w:val="22"/>
+                <w:szCs w:val="22"/>
+                <w:lang w:bidi="ar-SA"/>
+              </w:rPr>
+              <w:t xml:space="preserve">Перевірка, налаштування,  моніторинг стану програмного забезпечення  технічних засобів електронних комунікацій 2 рівня </w:t>
+            </w:r>
+            <w:r>
+              <w:rPr>
+                <w:rFonts w:cs="Times New Roman" w:ascii="Times New Roman" w:hAnsi="Times New Roman"/>
+                <w:kern w:val="0"/>
+                <w:sz w:val="22"/>
+                <w:szCs w:val="22"/>
+                <w:lang w:bidi="ar-SA"/>
               </w:rPr>
               <w:t xml:space="preserve">(встановлення, оновлення, виправлення помилок тощо), </w:t>
             </w:r>
           </w:p>
           <w:p>
             <w:pPr>
-              <w:rPr>
-                <w:rFonts w:ascii="Times New Roman" w:eastAsia="Calibri" w:hAnsi="Times New Roman" w:cs="Times New Roman"/>
-                <w:sz w:val="22"/>
-                <w:szCs w:val="22"/>
-              </w:rPr>
-            </w:pPr>
-            <w:r>
-              <w:rPr>
-                <w:rFonts w:ascii="Times New Roman" w:eastAsia="Calibri" w:hAnsi="Times New Roman" w:cs="Times New Roman"/>
-                <w:sz w:val="22"/>
-                <w:szCs w:val="22"/>
-              </w:rPr>
-              <w:t xml:space="preserve"> в тому числі після налаштування третіми особами – контрагентами замовника.</w:t>
+              <w:pStyle w:val="Normal"/>
+              <w:spacing w:before="0" w:after="0"/>
+              <w:jc w:val="left"/>
+              <w:rPr>
+                <w:rFonts w:ascii="Times New Roman" w:hAnsi="Times New Roman" w:eastAsia="Calibri" w:cs="Times New Roman"/>
+                <w:sz w:val="22"/>
+                <w:szCs w:val="22"/>
+              </w:rPr>
+            </w:pPr>
+            <w:r>
+              <w:rPr>
+                <w:rFonts w:eastAsia="Calibri" w:cs="Times New Roman" w:ascii="Times New Roman" w:hAnsi="Times New Roman"/>
+                <w:kern w:val="0"/>
+                <w:sz w:val="22"/>
+                <w:szCs w:val="22"/>
+                <w:lang w:bidi="ar-SA"/>
+              </w:rPr>
+              <w:t xml:space="preserve"> </w:t>
+            </w:r>
+            <w:r>
+              <w:rPr>
+                <w:rFonts w:eastAsia="Calibri" w:cs="Times New Roman" w:ascii="Times New Roman" w:hAnsi="Times New Roman"/>
+                <w:kern w:val="0"/>
+                <w:sz w:val="22"/>
+                <w:szCs w:val="22"/>
+                <w:lang w:bidi="ar-SA"/>
+              </w:rPr>
+              <w:t>в тому числі після налаштування третіми особами – контрагентами замовника.</w:t>
             </w:r>
           </w:p>
         </w:tc>
         <w:tc>
           <w:tcPr>
-            <w:tcW w:w="1276" w:type="dxa"/>
+            <w:tcW w:w="1518" w:type="dxa"/>
+            <w:tcBorders/>
           </w:tcPr>
           <w:p>
             <w:pPr>
+              <w:pStyle w:val="Normal"/>
+              <w:spacing w:before="0" w:after="0"/>
               <w:jc w:val="center"/>
               <w:rPr>
                 <w:rFonts w:ascii="Times New Roman" w:hAnsi="Times New Roman" w:cs="Times New Roman"/>
@@ -1670,18 +1730,22 @@
             </w:pPr>
             <w:r>
               <w:rPr>
-                <w:rFonts w:ascii="Times New Roman" w:hAnsi="Times New Roman" w:cs="Times New Roman"/>
-                <w:bCs/>
-                <w:color w:val="000000"/>
+                <w:rFonts w:cs="Times New Roman" w:ascii="Times New Roman" w:hAnsi="Times New Roman"/>
+                <w:bCs/>
+                <w:color w:val="000000"/>
+                <w:kern w:val="0"/>
                 <w:sz w:val="22"/>
                 <w:szCs w:val="22"/>
                 <w:highlight w:val="yellow"/>
+                <w:lang w:bidi="ar-SA"/>
               </w:rPr>
               <w:t>@rank2_count</w:t>
             </w:r>
           </w:p>
           <w:p>
             <w:pPr>
+              <w:pStyle w:val="Normal"/>
+              <w:spacing w:before="0" w:after="0"/>
               <w:jc w:val="center"/>
               <w:rPr>
                 <w:rFonts w:ascii="Times New Roman" w:hAnsi="Times New Roman" w:cs="Times New Roman"/>
@@ -1692,14 +1756,28 @@
                 <w:lang w:val="uk-UA"/>
               </w:rPr>
             </w:pPr>
+            <w:r>
+              <w:rPr>
+                <w:rFonts w:cs="Times New Roman" w:ascii="Times New Roman" w:hAnsi="Times New Roman"/>
+                <w:bCs/>
+                <w:color w:val="000000"/>
+                <w:kern w:val="0"/>
+                <w:sz w:val="22"/>
+                <w:szCs w:val="22"/>
+                <w:lang w:val="uk-UA" w:bidi="ar-SA"/>
+              </w:rPr>
+            </w:r>
           </w:p>
         </w:tc>
         <w:tc>
           <w:tcPr>
-            <w:tcW w:w="1275" w:type="dxa"/>
+            <w:tcW w:w="1266" w:type="dxa"/>
+            <w:tcBorders/>
           </w:tcPr>
           <w:p>
             <w:pPr>
+              <w:pStyle w:val="Normal"/>
+              <w:spacing w:before="0" w:after="0"/>
               <w:jc w:val="center"/>
               <w:rPr>
                 <w:rFonts w:ascii="Times New Roman" w:hAnsi="Times New Roman" w:cs="Times New Roman"/>
@@ -1712,12 +1790,13 @@
             </w:pPr>
             <w:r>
               <w:rPr>
-                <w:rFonts w:ascii="Times New Roman" w:hAnsi="Times New Roman" w:cs="Times New Roman"/>
-                <w:bCs/>
-                <w:color w:val="000000"/>
-                <w:sz w:val="22"/>
-                <w:szCs w:val="22"/>
-                <w:lang w:val="uk-UA"/>
+                <w:rFonts w:cs="Times New Roman" w:ascii="Times New Roman" w:hAnsi="Times New Roman"/>
+                <w:bCs/>
+                <w:color w:val="000000"/>
+                <w:kern w:val="0"/>
+                <w:sz w:val="22"/>
+                <w:szCs w:val="22"/>
+                <w:lang w:val="uk-UA" w:bidi="ar-SA"/>
               </w:rPr>
               <w:t>шт</w:t>
             </w:r>
@@ -1725,10 +1804,13 @@
         </w:tc>
         <w:tc>
           <w:tcPr>
-            <w:tcW w:w="1559" w:type="dxa"/>
+            <w:tcW w:w="1522" w:type="dxa"/>
+            <w:tcBorders/>
           </w:tcPr>
           <w:p>
             <w:pPr>
+              <w:pStyle w:val="Normal"/>
+              <w:spacing w:before="0" w:after="0"/>
               <w:jc w:val="center"/>
               <w:rPr>
                 <w:rFonts w:ascii="Times New Roman" w:hAnsi="Times New Roman" w:cs="Times New Roman"/>
@@ -1742,12 +1824,13 @@
             </w:pPr>
             <w:r>
               <w:rPr>
-                <w:rFonts w:ascii="Times New Roman" w:hAnsi="Times New Roman" w:cs="Times New Roman"/>
-                <w:bCs/>
-                <w:color w:val="000000"/>
-                <w:sz w:val="22"/>
-                <w:szCs w:val="22"/>
-                <w:lang w:val="uk-UA"/>
+                <w:rFonts w:cs="Times New Roman" w:ascii="Times New Roman" w:hAnsi="Times New Roman"/>
+                <w:bCs/>
+                <w:color w:val="000000"/>
+                <w:kern w:val="0"/>
+                <w:sz w:val="22"/>
+                <w:szCs w:val="22"/>
+                <w:lang w:val="uk-UA" w:bidi="ar-SA"/>
               </w:rPr>
               <w:t>1000, 00</w:t>
             </w:r>
@@ -1755,11 +1838,14 @@
         </w:tc>
         <w:tc>
           <w:tcPr>
-            <w:tcW w:w="1479" w:type="dxa"/>
+            <w:tcW w:w="1473" w:type="dxa"/>
             <w:gridSpan w:val="2"/>
+            <w:tcBorders/>
           </w:tcPr>
           <w:p>
             <w:pPr>
+              <w:pStyle w:val="Normal"/>
+              <w:spacing w:before="0" w:after="0"/>
               <w:jc w:val="both"/>
               <w:rPr>
                 <w:rFonts w:ascii="Times New Roman" w:hAnsi="Times New Roman" w:cs="Times New Roman"/>
@@ -1772,18 +1858,22 @@
             </w:pPr>
             <w:r>
               <w:rPr>
-                <w:rFonts w:ascii="Times New Roman" w:hAnsi="Times New Roman" w:cs="Times New Roman"/>
-                <w:bCs/>
-                <w:color w:val="000000"/>
+                <w:rFonts w:cs="Times New Roman" w:ascii="Times New Roman" w:hAnsi="Times New Roman"/>
+                <w:bCs/>
+                <w:color w:val="000000"/>
+                <w:kern w:val="0"/>
                 <w:sz w:val="22"/>
                 <w:szCs w:val="22"/>
                 <w:highlight w:val="yellow"/>
+                <w:lang w:bidi="ar-SA"/>
               </w:rPr>
               <w:t>@rank2_sum</w:t>
             </w:r>
           </w:p>
           <w:p>
             <w:pPr>
+              <w:pStyle w:val="Normal"/>
+              <w:spacing w:before="0" w:after="0"/>
               <w:jc w:val="both"/>
               <w:rPr>
                 <w:rFonts w:ascii="Times New Roman" w:hAnsi="Times New Roman" w:cs="Times New Roman"/>
@@ -1795,21 +1885,62 @@
                 <w:lang w:val="uk-UA"/>
               </w:rPr>
             </w:pPr>
+            <w:r>
+              <w:rPr>
+                <w:rFonts w:cs="Times New Roman" w:ascii="Times New Roman" w:hAnsi="Times New Roman"/>
+                <w:bCs/>
+                <w:color w:val="000000"/>
+                <w:kern w:val="0"/>
+                <w:sz w:val="22"/>
+                <w:szCs w:val="22"/>
+                <w:highlight w:val="yellow"/>
+                <w:lang w:val="uk-UA" w:bidi="ar-SA"/>
+              </w:rPr>
+            </w:r>
+          </w:p>
+        </w:tc>
+        <w:tc>
+          <w:tcPr>
+            <w:tcW w:w="15" w:type="dxa"/>
+            <w:tcBorders>
+              <w:top w:val="nil"/>
+              <w:left w:val="nil"/>
+              <w:bottom w:val="nil"/>
+              <w:right w:val="nil"/>
+            </w:tcBorders>
+          </w:tcPr>
+          <w:p>
+            <w:pPr>
+              <w:pStyle w:val="Normal"/>
+              <w:spacing w:before="0" w:after="0"/>
+              <w:jc w:val="left"/>
+              <w:rPr>
+                <w:kern w:val="0"/>
+                <w:lang w:bidi="ar-SA"/>
+              </w:rPr>
+            </w:pPr>
+            <w:r>
+              <w:rPr>
+                <w:kern w:val="0"/>
+                <w:lang w:bidi="ar-SA"/>
+              </w:rPr>
+            </w:r>
           </w:p>
         </w:tc>
       </w:tr>
       <w:tr>
         <w:trPr>
-          <w:gridAfter w:val="1"/>
-          <w:wAfter w:w="16" w:type="dxa"/>
-          <w:trHeight w:val="1014"/>
+          <w:trHeight w:val="1014" w:hRule="atLeast"/>
         </w:trPr>
         <w:tc>
           <w:tcPr>
-            <w:tcW w:w="562" w:type="dxa"/>
+            <w:tcW w:w="554" w:type="dxa"/>
+            <w:tcBorders/>
           </w:tcPr>
           <w:p>
             <w:pPr>
+              <w:pStyle w:val="Normal"/>
+              <w:spacing w:before="0" w:after="0"/>
               <w:jc w:val="both"/>
               <w:rPr>
                 <w:rFonts w:ascii="Times New Roman" w:hAnsi="Times New Roman" w:cs="Times New Roman"/>
@@ -1822,46 +1953,42 @@
             </w:pPr>
             <w:r>
               <w:rPr>
-                <w:rFonts w:ascii="Times New Roman" w:hAnsi="Times New Roman" w:cs="Times New Roman"/>
-                <w:bCs/>
-                <w:color w:val="000000"/>
-                <w:sz w:val="22"/>
-                <w:szCs w:val="22"/>
-                <w:lang w:val="uk-UA"/>
-              </w:rPr>
-              <w:t>3</w:t>
-            </w:r>
-            <w:r>
-              <w:rPr>
-                <w:rFonts w:ascii="Times New Roman" w:hAnsi="Times New Roman" w:cs="Times New Roman"/>
-                <w:bCs/>
-                <w:color w:val="000000"/>
-                <w:sz w:val="22"/>
-                <w:szCs w:val="22"/>
-                <w:lang w:val="uk-UA"/>
-              </w:rPr>
-              <w:t>.</w:t>
+                <w:rFonts w:cs="Times New Roman" w:ascii="Times New Roman" w:hAnsi="Times New Roman"/>
+                <w:bCs/>
+                <w:color w:val="000000"/>
+                <w:kern w:val="0"/>
+                <w:sz w:val="22"/>
+                <w:szCs w:val="22"/>
+                <w:lang w:val="uk-UA" w:bidi="ar-SA"/>
+              </w:rPr>
+              <w:t>3.</w:t>
             </w:r>
           </w:p>
         </w:tc>
         <w:tc>
           <w:tcPr>
-            <w:tcW w:w="4820" w:type="dxa"/>
+            <w:tcW w:w="4638" w:type="dxa"/>
+            <w:tcBorders/>
           </w:tcPr>
           <w:p>
             <w:pPr>
-              <w:rPr>
-                <w:rFonts w:ascii="Times New Roman" w:hAnsi="Times New Roman" w:cs="Times New Roman"/>
-                <w:sz w:val="22"/>
-                <w:szCs w:val="22"/>
-                <w:lang w:val="uk-UA"/>
-              </w:rPr>
-            </w:pPr>
-            <w:r>
-              <w:rPr>
-                <w:rFonts w:ascii="Times New Roman" w:hAnsi="Times New Roman" w:cs="Times New Roman"/>
-                <w:sz w:val="22"/>
-                <w:szCs w:val="22"/>
+              <w:pStyle w:val="Normal"/>
+              <w:spacing w:before="0" w:after="0"/>
+              <w:jc w:val="left"/>
+              <w:rPr>
+                <w:rFonts w:ascii="Times New Roman" w:hAnsi="Times New Roman" w:cs="Times New Roman"/>
+                <w:sz w:val="22"/>
+                <w:szCs w:val="22"/>
+                <w:lang w:val="uk-UA"/>
+              </w:rPr>
+            </w:pPr>
+            <w:r>
+              <w:rPr>
+                <w:rFonts w:cs="Times New Roman" w:ascii="Times New Roman" w:hAnsi="Times New Roman"/>
+                <w:kern w:val="0"/>
+                <w:sz w:val="22"/>
+                <w:szCs w:val="22"/>
+                <w:lang w:bidi="ar-SA"/>
               </w:rPr>
               <w:t>Консультування у питаннях виправлення помилок, неточностей у роботі програмного забезпечення технічних засобів електронних комунікацій</w:t>
             </w:r>
@@ -1869,10 +1996,13 @@
         </w:tc>
         <w:tc>
           <w:tcPr>
-            <w:tcW w:w="1276" w:type="dxa"/>
+            <w:tcW w:w="1518" w:type="dxa"/>
+            <w:tcBorders/>
           </w:tcPr>
           <w:p>
             <w:pPr>
+              <w:pStyle w:val="Normal"/>
+              <w:spacing w:before="0" w:after="0"/>
               <w:jc w:val="center"/>
               <w:rPr>
                 <w:rFonts w:ascii="Times New Roman" w:hAnsi="Times New Roman" w:cs="Times New Roman"/>
@@ -1885,18 +2015,22 @@
             </w:pPr>
             <w:r>
               <w:rPr>
-                <w:rFonts w:ascii="Times New Roman" w:hAnsi="Times New Roman" w:cs="Times New Roman"/>
-                <w:bCs/>
-                <w:color w:val="000000"/>
+                <w:rFonts w:cs="Times New Roman" w:ascii="Times New Roman" w:hAnsi="Times New Roman"/>
+                <w:bCs/>
+                <w:color w:val="000000"/>
+                <w:kern w:val="0"/>
                 <w:sz w:val="22"/>
                 <w:szCs w:val="22"/>
                 <w:highlight w:val="yellow"/>
+                <w:lang w:bidi="ar-SA"/>
               </w:rPr>
               <w:t>@time_count</w:t>
             </w:r>
           </w:p>
           <w:p>
             <w:pPr>
+              <w:pStyle w:val="Normal"/>
+              <w:spacing w:before="0" w:after="0"/>
               <w:jc w:val="center"/>
               <w:rPr>
                 <w:rFonts w:ascii="Times New Roman" w:hAnsi="Times New Roman" w:cs="Times New Roman"/>
@@ -1907,14 +2041,28 @@
                 <w:lang w:val="uk-UA"/>
               </w:rPr>
             </w:pPr>
+            <w:r>
+              <w:rPr>
+                <w:rFonts w:cs="Times New Roman" w:ascii="Times New Roman" w:hAnsi="Times New Roman"/>
+                <w:bCs/>
+                <w:color w:val="000000"/>
+                <w:kern w:val="0"/>
+                <w:sz w:val="22"/>
+                <w:szCs w:val="22"/>
+                <w:lang w:val="uk-UA" w:bidi="ar-SA"/>
+              </w:rPr>
+            </w:r>
           </w:p>
         </w:tc>
         <w:tc>
           <w:tcPr>
-            <w:tcW w:w="1275" w:type="dxa"/>
+            <w:tcW w:w="1266" w:type="dxa"/>
+            <w:tcBorders/>
           </w:tcPr>
           <w:p>
             <w:pPr>
+              <w:pStyle w:val="Normal"/>
+              <w:spacing w:before="0" w:after="0"/>
               <w:jc w:val="center"/>
               <w:rPr>
                 <w:rFonts w:ascii="Times New Roman" w:hAnsi="Times New Roman" w:cs="Times New Roman"/>
@@ -1927,34 +2075,27 @@
             </w:pPr>
             <w:r>
               <w:rPr>
-                <w:rFonts w:ascii="Times New Roman" w:hAnsi="Times New Roman" w:cs="Times New Roman"/>
-                <w:bCs/>
-                <w:color w:val="000000"/>
-                <w:sz w:val="22"/>
-                <w:szCs w:val="22"/>
-                <w:lang w:val="uk-UA"/>
-              </w:rPr>
-              <w:t>годин</w:t>
-            </w:r>
-            <w:r>
-              <w:rPr>
-                <w:rFonts w:ascii="Times New Roman" w:hAnsi="Times New Roman" w:cs="Times New Roman"/>
-                <w:bCs/>
-                <w:color w:val="000000"/>
-                <w:sz w:val="22"/>
-                <w:szCs w:val="22"/>
-                <w:lang w:val="uk-UA"/>
-              </w:rPr>
-              <w:t>а</w:t>
+                <w:rFonts w:cs="Times New Roman" w:ascii="Times New Roman" w:hAnsi="Times New Roman"/>
+                <w:bCs/>
+                <w:color w:val="000000"/>
+                <w:kern w:val="0"/>
+                <w:sz w:val="22"/>
+                <w:szCs w:val="22"/>
+                <w:lang w:val="uk-UA" w:bidi="ar-SA"/>
+              </w:rPr>
+              <w:t>година</w:t>
             </w:r>
           </w:p>
         </w:tc>
         <w:tc>
           <w:tcPr>
-            <w:tcW w:w="1559" w:type="dxa"/>
+            <w:tcW w:w="1522" w:type="dxa"/>
+            <w:tcBorders/>
           </w:tcPr>
           <w:p>
             <w:pPr>
+              <w:pStyle w:val="Normal"/>
+              <w:spacing w:before="0" w:after="0"/>
               <w:jc w:val="center"/>
               <w:rPr>
                 <w:rFonts w:ascii="Times New Roman" w:hAnsi="Times New Roman" w:cs="Times New Roman"/>
@@ -1968,12 +2109,13 @@
             </w:pPr>
             <w:r>
               <w:rPr>
-                <w:rFonts w:ascii="Times New Roman" w:hAnsi="Times New Roman" w:cs="Times New Roman"/>
-                <w:bCs/>
-                <w:color w:val="000000"/>
-                <w:sz w:val="22"/>
-                <w:szCs w:val="22"/>
-                <w:lang w:val="uk-UA"/>
+                <w:rFonts w:cs="Times New Roman" w:ascii="Times New Roman" w:hAnsi="Times New Roman"/>
+                <w:bCs/>
+                <w:color w:val="000000"/>
+                <w:kern w:val="0"/>
+                <w:sz w:val="22"/>
+                <w:szCs w:val="22"/>
+                <w:lang w:val="uk-UA" w:bidi="ar-SA"/>
               </w:rPr>
               <w:t>1000, 00</w:t>
             </w:r>
@@ -1981,11 +2123,14 @@
         </w:tc>
         <w:tc>
           <w:tcPr>
-            <w:tcW w:w="1479" w:type="dxa"/>
+            <w:tcW w:w="1473" w:type="dxa"/>
             <w:gridSpan w:val="2"/>
+            <w:tcBorders/>
           </w:tcPr>
           <w:p>
             <w:pPr>
+              <w:pStyle w:val="Normal"/>
+              <w:spacing w:before="0" w:after="0"/>
               <w:jc w:val="both"/>
               <w:rPr>
                 <w:rFonts w:ascii="Times New Roman" w:hAnsi="Times New Roman" w:cs="Times New Roman"/>
@@ -1998,18 +2143,22 @@
             </w:pPr>
             <w:r>
               <w:rPr>
-                <w:rFonts w:ascii="Times New Roman" w:hAnsi="Times New Roman" w:cs="Times New Roman"/>
-                <w:bCs/>
-                <w:color w:val="000000"/>
+                <w:rFonts w:cs="Times New Roman" w:ascii="Times New Roman" w:hAnsi="Times New Roman"/>
+                <w:bCs/>
+                <w:color w:val="000000"/>
+                <w:kern w:val="0"/>
                 <w:sz w:val="22"/>
                 <w:szCs w:val="22"/>
                 <w:highlight w:val="yellow"/>
+                <w:lang w:bidi="ar-SA"/>
               </w:rPr>
               <w:t>@time_sum</w:t>
             </w:r>
           </w:p>
           <w:p>
             <w:pPr>
+              <w:pStyle w:val="Normal"/>
+              <w:spacing w:before="0" w:after="0"/>
               <w:jc w:val="both"/>
               <w:rPr>
                 <w:rFonts w:ascii="Times New Roman" w:hAnsi="Times New Roman" w:cs="Times New Roman"/>
@@ -2021,20 +2170,63 @@
                 <w:lang w:val="uk-UA"/>
               </w:rPr>
             </w:pPr>
+            <w:r>
+              <w:rPr>
+                <w:rFonts w:cs="Times New Roman" w:ascii="Times New Roman" w:hAnsi="Times New Roman"/>
+                <w:bCs/>
+                <w:color w:val="000000"/>
+                <w:kern w:val="0"/>
+                <w:sz w:val="22"/>
+                <w:szCs w:val="22"/>
+                <w:highlight w:val="yellow"/>
+                <w:lang w:val="uk-UA" w:bidi="ar-SA"/>
+              </w:rPr>
+            </w:r>
+          </w:p>
+        </w:tc>
+        <w:tc>
+          <w:tcPr>
+            <w:tcW w:w="15" w:type="dxa"/>
+            <w:tcBorders>
+              <w:top w:val="nil"/>
+              <w:left w:val="nil"/>
+              <w:bottom w:val="nil"/>
+              <w:right w:val="nil"/>
+            </w:tcBorders>
+          </w:tcPr>
+          <w:p>
+            <w:pPr>
+              <w:pStyle w:val="Normal"/>
+              <w:spacing w:before="0" w:after="0"/>
+              <w:jc w:val="left"/>
+              <w:rPr>
+                <w:kern w:val="0"/>
+                <w:lang w:bidi="ar-SA"/>
+              </w:rPr>
+            </w:pPr>
+            <w:r>
+              <w:rPr>
+                <w:kern w:val="0"/>
+                <w:lang w:bidi="ar-SA"/>
+              </w:rPr>
+            </w:r>
           </w:p>
         </w:tc>
       </w:tr>
       <w:tr>
         <w:trPr>
-          <w:trHeight w:val="373"/>
+          <w:trHeight w:val="373" w:hRule="atLeast"/>
         </w:trPr>
         <w:tc>
           <w:tcPr>
-            <w:tcW w:w="9508" w:type="dxa"/>
+            <w:tcW w:w="9513" w:type="dxa"/>
             <w:gridSpan w:val="6"/>
+            <w:tcBorders/>
           </w:tcPr>
           <w:p>
             <w:pPr>
+              <w:pStyle w:val="Normal"/>
+              <w:spacing w:before="0" w:after="0"/>
               <w:jc w:val="both"/>
               <w:rPr>
                 <w:rFonts w:ascii="Times New Roman" w:hAnsi="Times New Roman" w:cs="Times New Roman"/>
@@ -2048,49 +2240,29 @@
             </w:pPr>
             <w:r>
               <w:rPr>
-                <w:rFonts w:ascii="Times New Roman" w:hAnsi="Times New Roman" w:cs="Times New Roman"/>
-                <w:b/>
-                <w:bCs/>
-                <w:color w:val="000000"/>
-                <w:sz w:val="22"/>
-                <w:szCs w:val="22"/>
-                <w:lang w:val="uk-UA"/>
-              </w:rPr>
-              <w:t xml:space="preserve">Всього </w:t>
-            </w:r>
-            <w:r>
-              <w:rPr>
-                <w:rFonts w:ascii="Times New Roman" w:hAnsi="Times New Roman" w:cs="Times New Roman"/>
-                <w:b/>
-                <w:bCs/>
-                <w:color w:val="000000"/>
-                <w:sz w:val="22"/>
-                <w:szCs w:val="22"/>
-                <w:lang w:val="uk-UA"/>
-              </w:rPr>
-              <w:t>бе</w:t>
-            </w:r>
-            <w:r>
-              <w:rPr>
-                <w:rFonts w:ascii="Times New Roman" w:hAnsi="Times New Roman" w:cs="Times New Roman"/>
-                <w:b/>
-                <w:bCs/>
-                <w:color w:val="000000"/>
-                <w:sz w:val="22"/>
-                <w:szCs w:val="22"/>
-                <w:lang w:val="uk-UA"/>
-              </w:rPr>
-              <w:t>з ПДВ</w:t>
+                <w:rFonts w:cs="Times New Roman" w:ascii="Times New Roman" w:hAnsi="Times New Roman"/>
+                <w:b/>
+                <w:bCs/>
+                <w:color w:val="000000"/>
+                <w:kern w:val="0"/>
+                <w:sz w:val="22"/>
+                <w:szCs w:val="22"/>
+                <w:lang w:val="uk-UA" w:bidi="ar-SA"/>
+              </w:rPr>
+              <w:t>Всього без ПДВ</w:t>
             </w:r>
           </w:p>
         </w:tc>
         <w:tc>
           <w:tcPr>
-            <w:tcW w:w="1479" w:type="dxa"/>
+            <w:tcW w:w="1473" w:type="dxa"/>
             <w:gridSpan w:val="2"/>
+            <w:tcBorders/>
           </w:tcPr>
           <w:p>
             <w:pPr>
+              <w:pStyle w:val="Normal"/>
+              <w:spacing w:before="0" w:after="0"/>
               <w:jc w:val="both"/>
               <w:rPr>
                 <w:rFonts w:ascii="Times New Roman" w:hAnsi="Times New Roman" w:cs="Times New Roman"/>
@@ -2104,13 +2276,15 @@
             </w:pPr>
             <w:r>
               <w:rPr>
-                <w:rFonts w:ascii="Times New Roman" w:hAnsi="Times New Roman" w:cs="Times New Roman"/>
-                <w:b/>
-                <w:bCs/>
-                <w:color w:val="000000"/>
+                <w:rFonts w:cs="Times New Roman" w:ascii="Times New Roman" w:hAnsi="Times New Roman"/>
+                <w:b/>
+                <w:bCs/>
+                <w:color w:val="000000"/>
+                <w:kern w:val="0"/>
                 <w:sz w:val="22"/>
                 <w:szCs w:val="22"/>
                 <w:highlight w:val="yellow"/>
+                <w:lang w:bidi="ar-SA"/>
               </w:rPr>
               <w:t>@act_sum</w:t>
             </w:r>
@@ -2120,6 +2294,7 @@
     </w:tbl>
     <w:p>
       <w:pPr>
+        <w:pStyle w:val="Normal"/>
         <w:ind w:firstLine="567"/>
         <w:jc w:val="both"/>
         <w:rPr>
@@ -2128,67 +2303,43 @@
           <w:color w:val="000000"/>
           <w:sz w:val="22"/>
           <w:szCs w:val="22"/>
-          <w:shd w:val="clear" w:color="auto" w:fill="FFFFFF"/>
+          <w:shd w:fill="FFFFFF" w:val="clear"/>
           <w:lang w:val="uk-UA"/>
         </w:rPr>
       </w:pPr>
       <w:r>
         <w:rPr>
-          <w:rFonts w:ascii="Times New Roman" w:hAnsi="Times New Roman" w:cs="Times New Roman"/>
-          <w:bCs/>
-          <w:color w:val="000000"/>
-          <w:sz w:val="22"/>
-          <w:szCs w:val="22"/>
-          <w:shd w:val="clear" w:color="auto" w:fill="FFFFFF"/>
-          <w:lang w:val="uk-UA"/>
-        </w:rPr>
-        <w:t xml:space="preserve">Загальна вартість </w:t>
-      </w:r>
-      <w:r>
-        <w:rPr>
-          <w:rFonts w:ascii="Times New Roman" w:hAnsi="Times New Roman" w:cs="Times New Roman"/>
-          <w:bCs/>
-          <w:color w:val="000000"/>
-          <w:sz w:val="22"/>
-          <w:szCs w:val="22"/>
-          <w:shd w:val="clear" w:color="auto" w:fill="FFFFFF"/>
-          <w:lang w:val="uk-UA"/>
-        </w:rPr>
-        <w:t xml:space="preserve">наданих </w:t>
-      </w:r>
-      <w:r>
-        <w:rPr>
-          <w:rFonts w:ascii="Times New Roman" w:hAnsi="Times New Roman" w:cs="Times New Roman"/>
-          <w:bCs/>
-          <w:color w:val="000000"/>
-          <w:sz w:val="22"/>
-          <w:szCs w:val="22"/>
-          <w:shd w:val="clear" w:color="auto" w:fill="FFFFFF"/>
-          <w:lang w:val="uk-UA"/>
-        </w:rPr>
-        <w:t xml:space="preserve">послуг складає : </w:t>
-      </w:r>
-      <w:r>
-        <w:rPr>
-          <w:rFonts w:ascii="Times New Roman" w:hAnsi="Times New Roman" w:cs="Times New Roman"/>
+          <w:rFonts w:cs="Times New Roman" w:ascii="Times New Roman" w:hAnsi="Times New Roman"/>
+          <w:bCs/>
+          <w:color w:val="000000"/>
+          <w:sz w:val="22"/>
+          <w:szCs w:val="22"/>
+          <w:shd w:fill="FFFFFF" w:val="clear"/>
+          <w:lang w:val="uk-UA"/>
+        </w:rPr>
+        <w:t xml:space="preserve">Загальна вартість наданих послуг складає : </w:t>
+      </w:r>
+      <w:r>
+        <w:rPr>
+          <w:rFonts w:cs="Times New Roman" w:ascii="Times New Roman" w:hAnsi="Times New Roman"/>
           <w:b/>
           <w:color w:val="000000"/>
           <w:sz w:val="22"/>
           <w:szCs w:val="22"/>
           <w:highlight w:val="yellow"/>
-          <w:shd w:val="clear" w:color="auto" w:fill="FFFFFF"/>
+          <w:shd w:fill="FFFFFF" w:val="clear"/>
         </w:rPr>
         <w:t>@actsumwords</w:t>
       </w:r>
       <w:r>
         <w:rPr>
-          <w:rFonts w:ascii="Times New Roman" w:hAnsi="Times New Roman" w:cs="Times New Roman"/>
+          <w:rFonts w:cs="Times New Roman" w:ascii="Times New Roman" w:hAnsi="Times New Roman"/>
           <w:b/>
           <w:color w:val="000000"/>
           <w:sz w:val="22"/>
           <w:szCs w:val="22"/>
           <w:highlight w:val="yellow"/>
-          <w:shd w:val="clear" w:color="auto" w:fill="FFFFFF"/>
+          <w:shd w:fill="FFFFFF" w:val="clear"/>
           <w:lang w:val="uk-UA"/>
         </w:rPr>
         <w:t>, без ПДВ</w:t>
@@ -2196,22 +2347,32 @@
     </w:p>
     <w:p>
       <w:pPr>
+        <w:pStyle w:val="Normal"/>
         <w:ind w:firstLine="567"/>
         <w:jc w:val="both"/>
         <w:rPr>
-          <w:rFonts w:ascii="Times New Roman" w:eastAsia="Calibri" w:hAnsi="Times New Roman" w:cs="Times New Roman"/>
+          <w:rFonts w:ascii="Times New Roman" w:hAnsi="Times New Roman" w:eastAsia="Calibri" w:cs="Times New Roman"/>
           <w:sz w:val="22"/>
           <w:szCs w:val="22"/>
           <w:lang w:val="uk-UA"/>
         </w:rPr>
       </w:pPr>
+      <w:r>
+        <w:rPr>
+          <w:rFonts w:eastAsia="Calibri" w:cs="Times New Roman" w:ascii="Times New Roman" w:hAnsi="Times New Roman"/>
+          <w:sz w:val="22"/>
+          <w:szCs w:val="22"/>
+          <w:lang w:val="uk-UA"/>
+        </w:rPr>
+      </w:r>
     </w:p>
     <w:p>
       <w:pPr>
+        <w:pStyle w:val="Normal"/>
         <w:ind w:firstLine="567"/>
         <w:jc w:val="both"/>
         <w:rPr>
-          <w:rFonts w:ascii="Times New Roman" w:eastAsia="Calibri" w:hAnsi="Times New Roman" w:cs="Times New Roman"/>
+          <w:rFonts w:ascii="Times New Roman" w:hAnsi="Times New Roman" w:eastAsia="Calibri" w:cs="Times New Roman"/>
           <w:bCs/>
           <w:iCs/>
           <w:sz w:val="22"/>
@@ -2221,43 +2382,16 @@
       </w:pPr>
       <w:r>
         <w:rPr>
-          <w:rFonts w:ascii="Times New Roman" w:eastAsia="Calibri" w:hAnsi="Times New Roman" w:cs="Times New Roman"/>
-          <w:sz w:val="22"/>
-          <w:szCs w:val="22"/>
-          <w:lang w:val="uk-UA"/>
-        </w:rPr>
-        <w:t>Детальни</w:t>
-      </w:r>
-      <w:r>
-        <w:rPr>
-          <w:rFonts w:ascii="Times New Roman" w:eastAsia="Calibri" w:hAnsi="Times New Roman" w:cs="Times New Roman"/>
-          <w:sz w:val="22"/>
-          <w:szCs w:val="22"/>
-          <w:lang w:val="uk-UA"/>
-        </w:rPr>
-        <w:t>й</w:t>
-      </w:r>
-      <w:r>
-        <w:rPr>
-          <w:rFonts w:ascii="Times New Roman" w:eastAsia="Calibri" w:hAnsi="Times New Roman" w:cs="Times New Roman"/>
-          <w:sz w:val="22"/>
-          <w:szCs w:val="22"/>
-          <w:lang w:val="uk-UA"/>
-        </w:rPr>
-        <w:t xml:space="preserve"> з</w:t>
-      </w:r>
-      <w:r>
-        <w:rPr>
-          <w:rFonts w:ascii="Times New Roman" w:eastAsia="Calibri" w:hAnsi="Times New Roman" w:cs="Times New Roman"/>
-          <w:sz w:val="22"/>
-          <w:szCs w:val="22"/>
-          <w:lang w:val="uk-UA"/>
-        </w:rPr>
-        <w:t xml:space="preserve">віт </w:t>
-      </w:r>
-      <w:r>
-        <w:rPr>
-          <w:rFonts w:ascii="Times New Roman" w:eastAsia="Calibri" w:hAnsi="Times New Roman" w:cs="Times New Roman"/>
+          <w:rFonts w:eastAsia="Calibri" w:cs="Times New Roman" w:ascii="Times New Roman" w:hAnsi="Times New Roman"/>
+          <w:sz w:val="22"/>
+          <w:szCs w:val="22"/>
+          <w:lang w:val="uk-UA"/>
+        </w:rPr>
+        <w:t xml:space="preserve">Детальний звіт </w:t>
+      </w:r>
+      <w:r>
+        <w:rPr>
+          <w:rFonts w:eastAsia="Calibri" w:cs="Times New Roman" w:ascii="Times New Roman" w:hAnsi="Times New Roman"/>
           <w:bCs/>
           <w:sz w:val="22"/>
           <w:szCs w:val="22"/>
@@ -2267,7 +2401,7 @@
       </w:r>
       <w:r>
         <w:rPr>
-          <w:rFonts w:ascii="Times New Roman" w:hAnsi="Times New Roman" w:cs="Times New Roman"/>
+          <w:rFonts w:cs="Times New Roman" w:ascii="Times New Roman" w:hAnsi="Times New Roman"/>
           <w:sz w:val="22"/>
           <w:szCs w:val="22"/>
         </w:rPr>
@@ -2275,27 +2409,17 @@
       </w:r>
       <w:r>
         <w:rPr>
-          <w:rFonts w:ascii="Times New Roman" w:eastAsia="Calibri" w:hAnsi="Times New Roman" w:cs="Times New Roman"/>
-          <w:bCs/>
-          <w:sz w:val="22"/>
-          <w:szCs w:val="22"/>
-          <w:lang w:val="uk-UA"/>
-        </w:rPr>
-        <w:t xml:space="preserve"> від</w:t>
-      </w:r>
-      <w:r>
-        <w:rPr>
-          <w:rFonts w:ascii="Times New Roman" w:eastAsia="Calibri" w:hAnsi="Times New Roman" w:cs="Times New Roman"/>
-          <w:bCs/>
-          <w:sz w:val="22"/>
-          <w:szCs w:val="22"/>
-          <w:lang w:val="uk-UA"/>
-        </w:rPr>
-        <w:t xml:space="preserve"> </w:t>
-      </w:r>
-      <w:r>
-        <w:rPr>
-          <w:rFonts w:ascii="Times New Roman" w:eastAsia="Calibri" w:hAnsi="Times New Roman" w:cs="Times New Roman"/>
+          <w:rFonts w:eastAsia="Calibri" w:cs="Times New Roman" w:ascii="Times New Roman" w:hAnsi="Times New Roman"/>
+          <w:bCs/>
+          <w:sz w:val="22"/>
+          <w:szCs w:val="22"/>
+          <w:lang w:val="uk-UA"/>
+        </w:rPr>
+        <w:t xml:space="preserve"> від </w:t>
+      </w:r>
+      <w:r>
+        <w:rPr>
+          <w:rFonts w:eastAsia="Calibri" w:cs="Times New Roman" w:ascii="Times New Roman" w:hAnsi="Times New Roman"/>
           <w:bCs/>
           <w:sz w:val="22"/>
           <w:szCs w:val="22"/>
@@ -2304,7 +2428,7 @@
       </w:r>
       <w:r>
         <w:rPr>
-          <w:rFonts w:ascii="Times New Roman" w:eastAsia="Calibri" w:hAnsi="Times New Roman" w:cs="Times New Roman"/>
+          <w:rFonts w:eastAsia="Calibri" w:cs="Times New Roman" w:ascii="Times New Roman" w:hAnsi="Times New Roman"/>
           <w:bCs/>
           <w:sz w:val="22"/>
           <w:szCs w:val="22"/>
@@ -2314,7 +2438,7 @@
       </w:r>
       <w:r>
         <w:rPr>
-          <w:rFonts w:ascii="Times New Roman" w:eastAsia="Calibri" w:hAnsi="Times New Roman" w:cs="Times New Roman"/>
+          <w:rFonts w:eastAsia="Calibri" w:cs="Times New Roman" w:ascii="Times New Roman" w:hAnsi="Times New Roman"/>
           <w:bCs/>
           <w:iCs/>
           <w:sz w:val="22"/>
@@ -2326,10 +2450,11 @@
     </w:p>
     <w:p>
       <w:pPr>
+        <w:pStyle w:val="Normal"/>
         <w:ind w:firstLine="567"/>
         <w:jc w:val="both"/>
         <w:rPr>
-          <w:rFonts w:ascii="Times New Roman" w:eastAsia="Calibri" w:hAnsi="Times New Roman" w:cs="Times New Roman"/>
+          <w:rFonts w:ascii="Times New Roman" w:hAnsi="Times New Roman" w:eastAsia="Calibri" w:cs="Times New Roman"/>
           <w:bCs/>
           <w:iCs/>
           <w:sz w:val="22"/>
@@ -2337,9 +2462,20 @@
           <w:lang w:val="uk-UA"/>
         </w:rPr>
       </w:pPr>
+      <w:r>
+        <w:rPr>
+          <w:rFonts w:eastAsia="Calibri" w:cs="Times New Roman" w:ascii="Times New Roman" w:hAnsi="Times New Roman"/>
+          <w:bCs/>
+          <w:iCs/>
+          <w:sz w:val="22"/>
+          <w:szCs w:val="22"/>
+          <w:lang w:val="uk-UA"/>
+        </w:rPr>
+      </w:r>
     </w:p>
     <w:p>
       <w:pPr>
+        <w:pStyle w:val="Normal"/>
         <w:ind w:firstLine="567"/>
         <w:jc w:val="both"/>
         <w:rPr>
@@ -2348,18 +2484,18 @@
           <w:color w:val="000000"/>
           <w:sz w:val="22"/>
           <w:szCs w:val="22"/>
-          <w:shd w:val="clear" w:color="auto" w:fill="FFFFFF"/>
+          <w:shd w:fill="FFFFFF" w:val="clear"/>
           <w:lang w:val="uk-UA"/>
         </w:rPr>
       </w:pPr>
       <w:r>
         <w:rPr>
-          <w:rFonts w:ascii="Times New Roman" w:hAnsi="Times New Roman" w:cs="Times New Roman"/>
-          <w:bCs/>
-          <w:color w:val="000000"/>
-          <w:sz w:val="22"/>
-          <w:szCs w:val="22"/>
-          <w:shd w:val="clear" w:color="auto" w:fill="FFFFFF"/>
+          <w:rFonts w:cs="Times New Roman" w:ascii="Times New Roman" w:hAnsi="Times New Roman"/>
+          <w:bCs/>
+          <w:color w:val="000000"/>
+          <w:sz w:val="22"/>
+          <w:szCs w:val="22"/>
+          <w:shd w:fill="FFFFFF" w:val="clear"/>
           <w:lang w:val="uk-UA"/>
         </w:rPr>
         <w:t xml:space="preserve">Замовник претензій до Виконавця по обсягу, якості, строкам наданих послуг не має. </w:t>
@@ -2368,26 +2504,33 @@
     <w:tbl>
       <w:tblPr>
         <w:tblW w:w="10750" w:type="dxa"/>
+        <w:jc w:val="left"/>
+        <w:tblInd w:w="0" w:type="dxa"/>
         <w:tblLayout w:type="fixed"/>
         <w:tblCellMar>
+          <w:top w:w="0" w:type="dxa"/>
           <w:left w:w="118" w:type="dxa"/>
+          <w:bottom w:w="0" w:type="dxa"/>
+          <w:right w:w="108" w:type="dxa"/>
         </w:tblCellMar>
-        <w:tblLook w:val="00A0" w:firstRow="1" w:lastRow="0" w:firstColumn="1" w:lastColumn="0" w:noHBand="0" w:noVBand="0"/>
+        <w:tblLook w:val="00a0" w:noHBand="0" w:noVBand="0" w:firstColumn="1" w:lastRow="0" w:lastColumn="0" w:firstRow="1"/>
       </w:tblPr>
       <w:tblGrid>
         <w:gridCol w:w="5505"/>
-        <w:gridCol w:w="5245"/>
+        <w:gridCol w:w="5244"/>
       </w:tblGrid>
       <w:tr>
         <w:trPr>
-          <w:trHeight w:val="4015"/>
+          <w:trHeight w:val="4015" w:hRule="atLeast"/>
         </w:trPr>
         <w:tc>
           <w:tcPr>
             <w:tcW w:w="5505" w:type="dxa"/>
+            <w:tcBorders/>
           </w:tcPr>
           <w:p>
             <w:pPr>
+              <w:pStyle w:val="Normal"/>
               <w:ind w:right="311"/>
               <w:jc w:val="center"/>
               <w:rPr>
@@ -2402,7 +2545,7 @@
             </w:pPr>
             <w:r>
               <w:rPr>
-                <w:rFonts w:ascii="Times New Roman" w:hAnsi="Times New Roman" w:cs="Times New Roman"/>
+                <w:rFonts w:cs="Times New Roman" w:ascii="Times New Roman" w:hAnsi="Times New Roman"/>
                 <w:b/>
                 <w:color w:val="00000A"/>
                 <w:sz w:val="22"/>
@@ -2410,7 +2553,6 @@
                 <w:u w:val="single"/>
                 <w:lang w:val="uk-UA"/>
               </w:rPr>
-              <w:lastRenderedPageBreak/>
               <w:t>ЗАМОВНИК</w:t>
             </w:r>
             <w:r>
@@ -2426,6 +2568,7 @@
           </w:p>
           <w:p>
             <w:pPr>
+              <w:pStyle w:val="Normal"/>
               <w:ind w:right="311"/>
               <w:rPr>
                 <w:rFonts w:ascii="Times New Roman" w:hAnsi="Times New Roman" w:cs="Times New Roman"/>
@@ -2435,27 +2578,36 @@
                 <w:lang w:val="uk-UA"/>
               </w:rPr>
             </w:pPr>
+            <w:r>
+              <w:rPr>
+                <w:rFonts w:cs="Times New Roman" w:ascii="Times New Roman" w:hAnsi="Times New Roman"/>
+                <w:color w:val="00000A"/>
+                <w:sz w:val="22"/>
+                <w:szCs w:val="22"/>
+                <w:lang w:val="uk-UA"/>
+              </w:rPr>
+            </w:r>
           </w:p>
           <w:p>
             <w:pPr>
               <w:pStyle w:val="BodyTextIndent"/>
-              <w:spacing w:after="0"/>
+              <w:spacing w:before="0" w:after="0"/>
               <w:ind w:left="0"/>
               <w:jc w:val="center"/>
               <w:rPr>
                 <w:rFonts w:ascii="Times New Roman" w:hAnsi="Times New Roman" w:cs="Times New Roman"/>
                 <w:b/>
-                <w:shd w:val="clear" w:color="auto" w:fill="FFFFFF"/>
+                <w:shd w:fill="FFFFFF" w:val="clear"/>
                 <w:lang w:eastAsia="ru-RU"/>
               </w:rPr>
             </w:pPr>
             <w:r>
               <w:rPr>
-                <w:rFonts w:ascii="Times New Roman" w:hAnsi="Times New Roman" w:cs="Times New Roman"/>
-                <w:b/>
-                <w:sz w:val="22"/>
-                <w:szCs w:val="22"/>
-                <w:shd w:val="clear" w:color="auto" w:fill="FFFFFF"/>
+                <w:rFonts w:cs="Times New Roman" w:ascii="Times New Roman" w:hAnsi="Times New Roman"/>
+                <w:b/>
+                <w:sz w:val="22"/>
+                <w:szCs w:val="22"/>
+                <w:shd w:fill="FFFFFF" w:val="clear"/>
                 <w:lang w:eastAsia="ru-RU"/>
               </w:rPr>
               <w:t>Товариство з обмеженою відповідальністю</w:t>
@@ -2464,34 +2616,34 @@
           <w:p>
             <w:pPr>
               <w:pStyle w:val="BodyTextIndent"/>
-              <w:spacing w:after="0"/>
+              <w:spacing w:before="0" w:after="0"/>
               <w:ind w:left="0"/>
               <w:jc w:val="center"/>
               <w:rPr>
                 <w:rFonts w:ascii="Times New Roman" w:hAnsi="Times New Roman" w:cs="Times New Roman"/>
                 <w:sz w:val="22"/>
                 <w:szCs w:val="22"/>
-                <w:shd w:val="clear" w:color="auto" w:fill="FFFFFF"/>
+                <w:shd w:fill="FFFFFF" w:val="clear"/>
                 <w:lang w:eastAsia="ru-RU"/>
               </w:rPr>
             </w:pPr>
             <w:r>
               <w:rPr>
-                <w:rFonts w:ascii="Times New Roman" w:hAnsi="Times New Roman" w:cs="Times New Roman"/>
-                <w:b/>
-                <w:sz w:val="22"/>
-                <w:szCs w:val="22"/>
-                <w:shd w:val="clear" w:color="auto" w:fill="FFFFFF"/>
+                <w:rFonts w:cs="Times New Roman" w:ascii="Times New Roman" w:hAnsi="Times New Roman"/>
+                <w:b/>
+                <w:sz w:val="22"/>
+                <w:szCs w:val="22"/>
+                <w:shd w:fill="FFFFFF" w:val="clear"/>
                 <w:lang w:eastAsia="ru-RU"/>
               </w:rPr>
               <w:t>«Контент Делівері Нетворк</w:t>
             </w:r>
             <w:r>
               <w:rPr>
-                <w:rFonts w:ascii="Times New Roman" w:hAnsi="Times New Roman" w:cs="Times New Roman"/>
-                <w:sz w:val="22"/>
-                <w:szCs w:val="22"/>
-                <w:shd w:val="clear" w:color="auto" w:fill="FFFFFF"/>
+                <w:rFonts w:cs="Times New Roman" w:ascii="Times New Roman" w:hAnsi="Times New Roman"/>
+                <w:sz w:val="22"/>
+                <w:szCs w:val="22"/>
+                <w:shd w:fill="FFFFFF" w:val="clear"/>
                 <w:lang w:eastAsia="ru-RU"/>
               </w:rPr>
               <w:t>»</w:t>
@@ -2500,36 +2652,45 @@
           <w:p>
             <w:pPr>
               <w:pStyle w:val="BodyTextIndent"/>
-              <w:spacing w:after="0"/>
+              <w:spacing w:before="0" w:after="0"/>
               <w:ind w:left="0"/>
               <w:jc w:val="both"/>
               <w:rPr>
                 <w:rFonts w:ascii="Times New Roman" w:hAnsi="Times New Roman" w:cs="Times New Roman"/>
                 <w:sz w:val="22"/>
                 <w:szCs w:val="22"/>
-                <w:shd w:val="clear" w:color="auto" w:fill="FFFFFF"/>
+                <w:shd w:fill="FFFFFF" w:val="clear"/>
                 <w:lang w:eastAsia="ru-RU"/>
               </w:rPr>
             </w:pPr>
+            <w:r>
+              <w:rPr>
+                <w:rFonts w:cs="Times New Roman" w:ascii="Times New Roman" w:hAnsi="Times New Roman"/>
+                <w:sz w:val="22"/>
+                <w:szCs w:val="22"/>
+                <w:shd w:fill="FFFFFF" w:val="clear"/>
+                <w:lang w:eastAsia="ru-RU"/>
+              </w:rPr>
+            </w:r>
           </w:p>
           <w:p>
             <w:pPr>
               <w:pStyle w:val="BodyTextIndent"/>
-              <w:spacing w:after="0"/>
+              <w:spacing w:before="0" w:after="0"/>
               <w:ind w:left="0"/>
               <w:jc w:val="both"/>
               <w:rPr>
                 <w:rFonts w:ascii="Times New Roman" w:hAnsi="Times New Roman" w:cs="Times New Roman"/>
-                <w:shd w:val="clear" w:color="auto" w:fill="FFFFFF"/>
+                <w:shd w:fill="FFFFFF" w:val="clear"/>
                 <w:lang w:eastAsia="ru-RU"/>
               </w:rPr>
             </w:pPr>
             <w:r>
               <w:rPr>
-                <w:rFonts w:ascii="Times New Roman" w:hAnsi="Times New Roman" w:cs="Times New Roman"/>
-                <w:sz w:val="22"/>
-                <w:szCs w:val="22"/>
-                <w:shd w:val="clear" w:color="auto" w:fill="FFFFFF"/>
+                <w:rFonts w:cs="Times New Roman" w:ascii="Times New Roman" w:hAnsi="Times New Roman"/>
+                <w:sz w:val="22"/>
+                <w:szCs w:val="22"/>
+                <w:shd w:fill="FFFFFF" w:val="clear"/>
                 <w:lang w:eastAsia="ru-RU"/>
               </w:rPr>
               <w:t>Юридична/фактична адреса :</w:t>
@@ -2538,7 +2699,7 @@
           <w:p>
             <w:pPr>
               <w:pStyle w:val="BodyTextIndent"/>
-              <w:spacing w:after="0"/>
+              <w:spacing w:before="0" w:after="0"/>
               <w:ind w:left="0"/>
               <w:jc w:val="both"/>
               <w:rPr>
@@ -2548,17 +2709,17 @@
             </w:pPr>
             <w:r>
               <w:rPr>
-                <w:rFonts w:ascii="Times New Roman" w:hAnsi="Times New Roman" w:cs="Times New Roman"/>
-                <w:sz w:val="22"/>
-                <w:szCs w:val="22"/>
-                <w:shd w:val="clear" w:color="auto" w:fill="FFFFFF"/>
+                <w:rFonts w:cs="Times New Roman" w:ascii="Times New Roman" w:hAnsi="Times New Roman"/>
+                <w:sz w:val="22"/>
+                <w:szCs w:val="22"/>
+                <w:shd w:fill="FFFFFF" w:val="clear"/>
                 <w:lang w:eastAsia="ru-RU"/>
               </w:rPr>
               <w:t>04213, м. Київ, вул. Прирічна, буд. 25-А</w:t>
             </w:r>
             <w:r>
               <w:rPr>
-                <w:rFonts w:ascii="Times New Roman" w:hAnsi="Times New Roman" w:cs="Times New Roman"/>
+                <w:rFonts w:cs="Times New Roman" w:ascii="Times New Roman" w:hAnsi="Times New Roman"/>
                 <w:sz w:val="22"/>
                 <w:szCs w:val="22"/>
                 <w:lang w:eastAsia="ru-RU"/>
@@ -2569,7 +2730,7 @@
           <w:p>
             <w:pPr>
               <w:pStyle w:val="BodyTextIndent"/>
-              <w:spacing w:after="0"/>
+              <w:spacing w:before="0" w:after="0"/>
               <w:ind w:left="0"/>
               <w:jc w:val="both"/>
               <w:rPr>
@@ -2579,7 +2740,7 @@
             </w:pPr>
             <w:r>
               <w:rPr>
-                <w:rFonts w:ascii="Times New Roman" w:hAnsi="Times New Roman" w:cs="Times New Roman"/>
+                <w:rFonts w:cs="Times New Roman" w:ascii="Times New Roman" w:hAnsi="Times New Roman"/>
                 <w:sz w:val="22"/>
                 <w:szCs w:val="22"/>
                 <w:lang w:eastAsia="ru-RU"/>
@@ -2590,11 +2751,9 @@
           <w:p>
             <w:pPr>
               <w:pStyle w:val="ListParagraph"/>
-              <w:autoSpaceDE w:val="0"/>
-              <w:autoSpaceDN w:val="0"/>
-              <w:adjustRightInd w:val="0"/>
-              <w:spacing w:after="0" w:line="240" w:lineRule="auto"/>
+              <w:spacing w:lineRule="auto" w:line="240" w:before="0" w:after="0"/>
               <w:ind w:left="0"/>
+              <w:contextualSpacing/>
               <w:rPr>
                 <w:rFonts w:ascii="Times New Roman" w:hAnsi="Times New Roman"/>
                 <w:lang w:val="uk-UA"/>
@@ -2611,11 +2770,9 @@
           <w:p>
             <w:pPr>
               <w:pStyle w:val="ListParagraph"/>
-              <w:autoSpaceDE w:val="0"/>
-              <w:autoSpaceDN w:val="0"/>
-              <w:adjustRightInd w:val="0"/>
-              <w:spacing w:after="0" w:line="240" w:lineRule="auto"/>
+              <w:spacing w:lineRule="auto" w:line="240" w:before="0" w:after="0"/>
               <w:ind w:left="0"/>
+              <w:contextualSpacing/>
               <w:rPr>
                 <w:rFonts w:ascii="Times New Roman" w:hAnsi="Times New Roman"/>
                 <w:lang w:val="uk-UA"/>
@@ -2639,13 +2796,14 @@
           </w:p>
           <w:p>
             <w:pPr>
-              <w:rPr>
-                <w:rFonts w:ascii="Times New Roman" w:hAnsi="Times New Roman" w:cs="Times New Roman"/>
-              </w:rPr>
-            </w:pPr>
-            <w:r>
-              <w:rPr>
-                <w:rFonts w:ascii="Times New Roman" w:hAnsi="Times New Roman" w:cs="Times New Roman"/>
+              <w:pStyle w:val="Normal"/>
+              <w:rPr>
+                <w:rFonts w:ascii="Times New Roman" w:hAnsi="Times New Roman" w:cs="Times New Roman"/>
+              </w:rPr>
+            </w:pPr>
+            <w:r>
+              <w:rPr>
+                <w:rFonts w:cs="Times New Roman" w:ascii="Times New Roman" w:hAnsi="Times New Roman"/>
                 <w:sz w:val="22"/>
                 <w:szCs w:val="22"/>
               </w:rPr>
@@ -2654,6 +2812,7 @@
           </w:p>
           <w:p>
             <w:pPr>
+              <w:pStyle w:val="Normal"/>
               <w:jc w:val="both"/>
               <w:rPr>
                 <w:rFonts w:ascii="Times New Roman" w:hAnsi="Times New Roman" w:cs="Times New Roman"/>
@@ -2663,9 +2822,19 @@
                 <w:szCs w:val="22"/>
               </w:rPr>
             </w:pPr>
-          </w:p>
-          <w:p>
-            <w:pPr>
+            <w:r>
+              <w:rPr>
+                <w:rFonts w:cs="Times New Roman" w:ascii="Times New Roman" w:hAnsi="Times New Roman"/>
+                <w:b/>
+                <w:color w:val="00000A"/>
+                <w:sz w:val="22"/>
+                <w:szCs w:val="22"/>
+              </w:rPr>
+            </w:r>
+          </w:p>
+          <w:p>
+            <w:pPr>
+              <w:pStyle w:val="Normal"/>
               <w:jc w:val="both"/>
               <w:rPr>
                 <w:rFonts w:ascii="Times New Roman" w:hAnsi="Times New Roman" w:cs="Times New Roman"/>
@@ -2675,9 +2844,19 @@
                 <w:szCs w:val="22"/>
               </w:rPr>
             </w:pPr>
-          </w:p>
-          <w:p>
-            <w:pPr>
+            <w:r>
+              <w:rPr>
+                <w:rFonts w:cs="Times New Roman" w:ascii="Times New Roman" w:hAnsi="Times New Roman"/>
+                <w:b/>
+                <w:color w:val="00000A"/>
+                <w:sz w:val="22"/>
+                <w:szCs w:val="22"/>
+              </w:rPr>
+            </w:r>
+          </w:p>
+          <w:p>
+            <w:pPr>
+              <w:pStyle w:val="Normal"/>
               <w:jc w:val="both"/>
               <w:rPr>
                 <w:rFonts w:ascii="Times New Roman" w:hAnsi="Times New Roman" w:cs="Times New Roman"/>
@@ -2687,9 +2866,19 @@
                 <w:szCs w:val="22"/>
               </w:rPr>
             </w:pPr>
-          </w:p>
-          <w:p>
-            <w:pPr>
+            <w:r>
+              <w:rPr>
+                <w:rFonts w:cs="Times New Roman" w:ascii="Times New Roman" w:hAnsi="Times New Roman"/>
+                <w:b/>
+                <w:color w:val="00000A"/>
+                <w:sz w:val="22"/>
+                <w:szCs w:val="22"/>
+              </w:rPr>
+            </w:r>
+          </w:p>
+          <w:p>
+            <w:pPr>
+              <w:pStyle w:val="Normal"/>
               <w:ind w:right="311"/>
               <w:rPr>
                 <w:rFonts w:ascii="Times New Roman" w:hAnsi="Times New Roman" w:cs="Times New Roman"/>
@@ -2700,7 +2889,7 @@
             </w:pPr>
             <w:r>
               <w:rPr>
-                <w:rFonts w:ascii="Times New Roman" w:hAnsi="Times New Roman" w:cs="Times New Roman"/>
+                <w:rFonts w:cs="Times New Roman" w:ascii="Times New Roman" w:hAnsi="Times New Roman"/>
                 <w:b/>
                 <w:color w:val="00000A"/>
                 <w:sz w:val="22"/>
@@ -2712,10 +2901,12 @@
         </w:tc>
         <w:tc>
           <w:tcPr>
-            <w:tcW w:w="5245" w:type="dxa"/>
+            <w:tcW w:w="5244" w:type="dxa"/>
+            <w:tcBorders/>
           </w:tcPr>
           <w:p>
             <w:pPr>
+              <w:pStyle w:val="Normal"/>
               <w:ind w:right="294"/>
               <w:jc w:val="center"/>
               <w:rPr>
@@ -2730,7 +2921,7 @@
             </w:pPr>
             <w:r>
               <w:rPr>
-                <w:rFonts w:ascii="Times New Roman" w:hAnsi="Times New Roman" w:cs="Times New Roman"/>
+                <w:rFonts w:cs="Times New Roman" w:ascii="Times New Roman" w:hAnsi="Times New Roman"/>
                 <w:b/>
                 <w:color w:val="00000A"/>
                 <w:sz w:val="22"/>
@@ -2753,6 +2944,7 @@
           </w:p>
           <w:p>
             <w:pPr>
+              <w:pStyle w:val="Normal"/>
               <w:ind w:right="294"/>
               <w:jc w:val="center"/>
               <w:rPr>
@@ -2762,9 +2954,18 @@
                 <w:lang w:val="uk-UA"/>
               </w:rPr>
             </w:pPr>
-          </w:p>
-          <w:p>
-            <w:pPr>
+            <w:r>
+              <w:rPr>
+                <w:rFonts w:cs="Times New Roman" w:ascii="Times New Roman" w:hAnsi="Times New Roman"/>
+                <w:sz w:val="22"/>
+                <w:szCs w:val="22"/>
+                <w:lang w:val="uk-UA"/>
+              </w:rPr>
+            </w:r>
+          </w:p>
+          <w:p>
+            <w:pPr>
+              <w:pStyle w:val="Normal"/>
               <w:ind w:right="294"/>
               <w:jc w:val="center"/>
               <w:rPr>
@@ -2780,7 +2981,7 @@
             <w:r>
               <w:rPr>
                 <w:rStyle w:val="WW8Num1z3"/>
-                <w:rFonts w:ascii="Times New Roman" w:hAnsi="Times New Roman" w:cs="Times New Roman"/>
+                <w:rFonts w:cs="Times New Roman" w:ascii="Times New Roman" w:hAnsi="Times New Roman"/>
                 <w:b/>
                 <w:bCs/>
                 <w:iCs/>
@@ -2792,6 +2993,7 @@
           </w:p>
           <w:p>
             <w:pPr>
+              <w:pStyle w:val="Normal"/>
               <w:ind w:right="311"/>
               <w:jc w:val="center"/>
               <w:rPr>
@@ -2808,7 +3010,6 @@
               </w:rPr>
               <w:t>@</w:t>
             </w:r>
-            <w:proofErr w:type="spellStart"/>
             <w:r>
               <w:rPr>
                 <w:rFonts w:ascii="Times New Roman" w:hAnsi="Times New Roman"/>
@@ -2818,7 +3019,6 @@
               </w:rPr>
               <w:t>ri</w:t>
             </w:r>
-            <w:proofErr w:type="spellEnd"/>
             <w:r>
               <w:rPr>
                 <w:rFonts w:ascii="Times New Roman" w:hAnsi="Times New Roman"/>
@@ -2840,7 +3040,7 @@
           <w:p>
             <w:pPr>
               <w:pStyle w:val="BodyTextIndent"/>
-              <w:spacing w:after="0"/>
+              <w:spacing w:before="0" w:after="0"/>
               <w:ind w:left="0" w:right="294"/>
               <w:jc w:val="both"/>
               <w:rPr>
@@ -2848,27 +3048,38 @@
                 <w:b/>
                 <w:sz w:val="22"/>
                 <w:szCs w:val="22"/>
-                <w:shd w:val="clear" w:color="auto" w:fill="FFFFFF"/>
+                <w:shd w:fill="FFFFFF" w:val="clear"/>
                 <w:lang w:val="uk-UA" w:eastAsia="ru-RU"/>
               </w:rPr>
             </w:pPr>
-          </w:p>
-          <w:p>
-            <w:pPr>
-              <w:rPr>
-                <w:bCs/>
-              </w:rPr>
-            </w:pPr>
             <w:r>
               <w:rPr>
                 <w:rFonts w:ascii="Times New Roman" w:hAnsi="Times New Roman"/>
-                <w:bCs/>
-                <w:sz w:val="22"/>
-                <w:szCs w:val="22"/>
-                <w:shd w:val="clear" w:color="auto" w:fill="FFFFFF"/>
+                <w:b/>
+                <w:sz w:val="22"/>
+                <w:szCs w:val="22"/>
+                <w:shd w:fill="FFFFFF" w:val="clear"/>
+                <w:lang w:val="uk-UA" w:eastAsia="ru-RU"/>
+              </w:rPr>
+            </w:r>
+          </w:p>
+          <w:p>
+            <w:pPr>
+              <w:pStyle w:val="Normal"/>
+              <w:rPr>
+                <w:bCs/>
+              </w:rPr>
+            </w:pPr>
+            <w:r>
+              <w:rPr>
+                <w:rFonts w:ascii="Times New Roman" w:hAnsi="Times New Roman"/>
+                <w:bCs/>
+                <w:sz w:val="22"/>
+                <w:szCs w:val="22"/>
+                <w:shd w:fill="FFFFFF" w:val="clear"/>
                 <w:lang w:eastAsia="ru-RU"/>
               </w:rPr>
-              <w:t>Адреса</w:t>
+              <w:t>Адреса: @</w:t>
             </w:r>
             <w:r>
               <w:rPr>
@@ -2876,10 +3087,21 @@
                 <w:bCs/>
                 <w:sz w:val="22"/>
                 <w:szCs w:val="22"/>
-                <w:shd w:val="clear" w:color="auto" w:fill="FFFFFF"/>
+                <w:shd w:fill="FFFFFF" w:val="clear"/>
+                <w:lang w:val="en-US" w:eastAsia="ru-RU"/>
+              </w:rPr>
+              <w:t>ri</w:t>
+            </w:r>
+            <w:r>
+              <w:rPr>
+                <w:rFonts w:ascii="Times New Roman" w:hAnsi="Times New Roman"/>
+                <w:bCs/>
+                <w:sz w:val="22"/>
+                <w:szCs w:val="22"/>
+                <w:shd w:fill="FFFFFF" w:val="clear"/>
                 <w:lang w:eastAsia="ru-RU"/>
               </w:rPr>
-              <w:t xml:space="preserve">: </w:t>
+              <w:t>_</w:t>
             </w:r>
             <w:r>
               <w:rPr>
@@ -2887,51 +3109,16 @@
                 <w:bCs/>
                 <w:sz w:val="22"/>
                 <w:szCs w:val="22"/>
-                <w:shd w:val="clear" w:color="auto" w:fill="FFFFFF"/>
-                <w:lang w:eastAsia="ru-RU"/>
-              </w:rPr>
-              <w:t>@</w:t>
-            </w:r>
-            <w:proofErr w:type="spellStart"/>
-            <w:r>
-              <w:rPr>
-                <w:rFonts w:ascii="Times New Roman" w:hAnsi="Times New Roman"/>
-                <w:bCs/>
-                <w:sz w:val="22"/>
-                <w:szCs w:val="22"/>
-                <w:shd w:val="clear" w:color="auto" w:fill="FFFFFF"/>
+                <w:shd w:fill="FFFFFF" w:val="clear"/>
                 <w:lang w:val="en-US" w:eastAsia="ru-RU"/>
               </w:rPr>
-              <w:t>ri</w:t>
-            </w:r>
-            <w:proofErr w:type="spellEnd"/>
-            <w:r>
-              <w:rPr>
-                <w:rFonts w:ascii="Times New Roman" w:hAnsi="Times New Roman"/>
-                <w:bCs/>
-                <w:sz w:val="22"/>
-                <w:szCs w:val="22"/>
-                <w:shd w:val="clear" w:color="auto" w:fill="FFFFFF"/>
-                <w:lang w:eastAsia="ru-RU"/>
-              </w:rPr>
-              <w:t>_</w:t>
-            </w:r>
-            <w:r>
-              <w:rPr>
-                <w:rFonts w:ascii="Times New Roman" w:hAnsi="Times New Roman"/>
-                <w:bCs/>
-                <w:sz w:val="22"/>
-                <w:szCs w:val="22"/>
-                <w:shd w:val="clear" w:color="auto" w:fill="FFFFFF"/>
-                <w:lang w:val="en-US" w:eastAsia="ru-RU"/>
-              </w:rPr>
               <w:t>address</w:t>
             </w:r>
           </w:p>
           <w:p>
             <w:pPr>
               <w:pStyle w:val="BodyTextIndent"/>
-              <w:spacing w:after="0"/>
+              <w:spacing w:before="0" w:after="0"/>
               <w:ind w:left="0" w:right="294"/>
               <w:jc w:val="both"/>
               <w:rPr>
@@ -2962,7 +3149,6 @@
               </w:rPr>
               <w:t>@</w:t>
             </w:r>
-            <w:proofErr w:type="spellStart"/>
             <w:r>
               <w:rPr>
                 <w:rFonts w:ascii="Times New Roman" w:hAnsi="Times New Roman"/>
@@ -2973,7 +3159,6 @@
               </w:rPr>
               <w:t>ri</w:t>
             </w:r>
-            <w:proofErr w:type="spellEnd"/>
             <w:r>
               <w:rPr>
                 <w:rFonts w:ascii="Times New Roman" w:hAnsi="Times New Roman"/>
@@ -2998,11 +3183,9 @@
           <w:p>
             <w:pPr>
               <w:pStyle w:val="ListParagraph"/>
-              <w:autoSpaceDE w:val="0"/>
-              <w:autoSpaceDN w:val="0"/>
-              <w:adjustRightInd w:val="0"/>
-              <w:spacing w:after="0" w:line="240" w:lineRule="auto"/>
+              <w:spacing w:lineRule="auto" w:line="240" w:before="0" w:after="0"/>
               <w:ind w:left="0" w:right="294"/>
+              <w:contextualSpacing/>
               <w:rPr>
                 <w:rFonts w:ascii="Times New Roman" w:hAnsi="Times New Roman"/>
                 <w:bCs/>
@@ -3022,192 +3205,203 @@
                 <w:rFonts w:ascii="Times New Roman" w:hAnsi="Times New Roman"/>
                 <w:bCs/>
               </w:rPr>
-              <w:t xml:space="preserve"> </w:t>
+              <w:t xml:space="preserve"> @</w:t>
             </w:r>
             <w:r>
               <w:rPr>
                 <w:rFonts w:ascii="Times New Roman" w:hAnsi="Times New Roman"/>
                 <w:bCs/>
+                <w:lang w:val="en-US"/>
+              </w:rPr>
+              <w:t>ri</w:t>
+            </w:r>
+            <w:r>
+              <w:rPr>
+                <w:rFonts w:ascii="Times New Roman" w:hAnsi="Times New Roman"/>
+                <w:bCs/>
+              </w:rPr>
+              <w:t>_</w:t>
+            </w:r>
+            <w:r>
+              <w:rPr>
+                <w:rFonts w:ascii="Times New Roman" w:hAnsi="Times New Roman"/>
+                <w:bCs/>
+                <w:lang w:val="en-US"/>
+              </w:rPr>
+              <w:t>iban</w:t>
+            </w:r>
+          </w:p>
+          <w:p>
+            <w:pPr>
+              <w:pStyle w:val="ListParagraph"/>
+              <w:spacing w:lineRule="auto" w:line="240" w:before="0" w:after="0"/>
+              <w:ind w:left="0" w:right="294"/>
+              <w:contextualSpacing/>
+              <w:rPr>
+                <w:rFonts w:ascii="Times New Roman" w:hAnsi="Times New Roman"/>
+                <w:bCs/>
+                <w:lang w:val="uk-UA"/>
+              </w:rPr>
+            </w:pPr>
+            <w:r>
+              <w:rPr>
+                <w:rFonts w:ascii="Times New Roman" w:hAnsi="Times New Roman"/>
+                <w:bCs/>
+                <w:lang w:val="uk-UA"/>
+              </w:rPr>
+              <w:t>в</w:t>
+            </w:r>
+            <w:r>
+              <w:rPr>
+                <w:rFonts w:ascii="Times New Roman" w:hAnsi="Times New Roman"/>
+                <w:bCs/>
+              </w:rPr>
+              <w:t xml:space="preserve"> @bank_account_detail_ri</w:t>
+            </w:r>
+          </w:p>
+          <w:p>
+            <w:pPr>
+              <w:pStyle w:val="ListParagraph"/>
+              <w:spacing w:lineRule="auto" w:line="240" w:before="0" w:after="0"/>
+              <w:ind w:left="0" w:right="294"/>
+              <w:contextualSpacing/>
+              <w:rPr>
+                <w:rFonts w:ascii="Times New Roman" w:hAnsi="Times New Roman"/>
+                <w:bCs/>
+                <w:lang w:val="uk-UA"/>
+              </w:rPr>
+            </w:pPr>
+            <w:r>
+              <w:rPr>
+                <w:rFonts w:ascii="Times New Roman" w:hAnsi="Times New Roman"/>
+                <w:bCs/>
+                <w:lang w:val="uk-UA"/>
+              </w:rPr>
+            </w:r>
+          </w:p>
+          <w:p>
+            <w:pPr>
+              <w:pStyle w:val="ListParagraph"/>
+              <w:spacing w:lineRule="auto" w:line="240" w:before="0" w:after="0"/>
+              <w:ind w:left="0" w:right="294"/>
+              <w:contextualSpacing/>
+              <w:rPr>
+                <w:rFonts w:ascii="Times New Roman" w:hAnsi="Times New Roman"/>
+                <w:bCs/>
+                <w:lang w:val="uk-UA"/>
+              </w:rPr>
+            </w:pPr>
+            <w:r>
+              <w:rPr>
+                <w:rFonts w:ascii="Times New Roman" w:hAnsi="Times New Roman"/>
+                <w:bCs/>
+                <w:lang w:val="uk-UA"/>
+              </w:rPr>
+            </w:r>
+          </w:p>
+          <w:p>
+            <w:pPr>
+              <w:pStyle w:val="ListParagraph"/>
+              <w:spacing w:lineRule="auto" w:line="240" w:before="0" w:after="0"/>
+              <w:ind w:left="0" w:right="294"/>
+              <w:contextualSpacing/>
+              <w:rPr>
+                <w:rFonts w:ascii="Times New Roman" w:hAnsi="Times New Roman"/>
+                <w:bCs/>
+                <w:color w:val="00000A"/>
+                <w:lang w:val="uk-UA"/>
+              </w:rPr>
+            </w:pPr>
+            <w:r>
+              <w:rPr>
+                <w:rFonts w:ascii="Times New Roman" w:hAnsi="Times New Roman"/>
+                <w:bCs/>
+                <w:color w:val="00000A"/>
+                <w:lang w:val="uk-UA"/>
+              </w:rPr>
+            </w:r>
+          </w:p>
+          <w:p>
+            <w:pPr>
+              <w:pStyle w:val="Normal"/>
+              <w:ind w:right="294"/>
+              <w:rPr>
+                <w:rFonts w:ascii="Times New Roman" w:hAnsi="Times New Roman" w:cs="Times New Roman"/>
+                <w:sz w:val="22"/>
+                <w:szCs w:val="22"/>
+                <w:lang w:val="uk-UA"/>
+              </w:rPr>
+            </w:pPr>
+            <w:r>
+              <w:rPr>
+                <w:rStyle w:val="WW8Num1z3"/>
+                <w:rFonts w:cs="Times New Roman" w:ascii="Times New Roman" w:hAnsi="Times New Roman"/>
+                <w:b/>
+                <w:bCs/>
+                <w:iCs/>
+                <w:sz w:val="22"/>
+                <w:szCs w:val="22"/>
+                <w:lang w:val="uk-UA"/>
+              </w:rPr>
+              <w:t>ФОП</w:t>
+            </w:r>
+            <w:r>
+              <w:rPr>
+                <w:rStyle w:val="WW8Num1z3"/>
+                <w:rFonts w:cs="Times New Roman" w:ascii="Times New Roman" w:hAnsi="Times New Roman"/>
+                <w:bCs/>
+                <w:iCs/>
+                <w:sz w:val="22"/>
+                <w:szCs w:val="22"/>
+                <w:lang w:val="uk-UA"/>
+              </w:rPr>
+              <w:t>____________________</w:t>
+            </w:r>
+            <w:r>
+              <w:rPr>
+                <w:rStyle w:val="WW8Num1z3"/>
+                <w:b/>
+                <w:bCs/>
+                <w:iCs/>
               </w:rPr>
               <w:t>@</w:t>
             </w:r>
-            <w:proofErr w:type="spellStart"/>
-            <w:r>
-              <w:rPr>
-                <w:rFonts w:ascii="Times New Roman" w:hAnsi="Times New Roman"/>
-                <w:bCs/>
-                <w:lang w:val="en-US"/>
-              </w:rPr>
-              <w:t>ri</w:t>
-            </w:r>
-            <w:proofErr w:type="spellEnd"/>
-            <w:r>
-              <w:rPr>
-                <w:rFonts w:ascii="Times New Roman" w:hAnsi="Times New Roman"/>
-                <w:bCs/>
-              </w:rPr>
-              <w:t>_</w:t>
-            </w:r>
-            <w:proofErr w:type="spellStart"/>
-            <w:r>
-              <w:rPr>
-                <w:rFonts w:ascii="Times New Roman" w:hAnsi="Times New Roman"/>
-                <w:bCs/>
-                <w:lang w:val="en-US"/>
-              </w:rPr>
-              <w:t>iban</w:t>
-            </w:r>
-            <w:proofErr w:type="spellEnd"/>
-          </w:p>
-          <w:p>
-            <w:pPr>
-              <w:pStyle w:val="ListParagraph"/>
-              <w:autoSpaceDE w:val="0"/>
-              <w:autoSpaceDN w:val="0"/>
-              <w:adjustRightInd w:val="0"/>
-              <w:spacing w:after="0" w:line="240" w:lineRule="auto"/>
-              <w:ind w:left="0" w:right="294"/>
-              <w:rPr>
-                <w:rFonts w:ascii="Times New Roman" w:hAnsi="Times New Roman"/>
-                <w:bCs/>
-                <w:lang w:val="uk-UA"/>
-              </w:rPr>
-            </w:pPr>
-            <w:r>
-              <w:rPr>
-                <w:rFonts w:ascii="Times New Roman" w:hAnsi="Times New Roman"/>
-                <w:bCs/>
-                <w:lang w:val="uk-UA"/>
-              </w:rPr>
-              <w:t>в</w:t>
-            </w:r>
-            <w:r>
-              <w:rPr>
-                <w:rFonts w:ascii="Times New Roman" w:hAnsi="Times New Roman"/>
-                <w:bCs/>
-              </w:rPr>
-              <w:t xml:space="preserve"> </w:t>
-            </w:r>
-            <w:r>
-              <w:rPr>
-                <w:rFonts w:ascii="Times New Roman" w:hAnsi="Times New Roman"/>
-                <w:bCs/>
-              </w:rPr>
-              <w:t>@bank_account_detail_ri</w:t>
-            </w:r>
-          </w:p>
-          <w:p>
-            <w:pPr>
-              <w:pStyle w:val="ListParagraph"/>
-              <w:autoSpaceDE w:val="0"/>
-              <w:autoSpaceDN w:val="0"/>
-              <w:adjustRightInd w:val="0"/>
-              <w:spacing w:after="0" w:line="240" w:lineRule="auto"/>
-              <w:ind w:left="0" w:right="294"/>
-              <w:rPr>
-                <w:rFonts w:ascii="Times New Roman" w:hAnsi="Times New Roman"/>
-                <w:bCs/>
-                <w:lang w:val="uk-UA"/>
-              </w:rPr>
-            </w:pPr>
-          </w:p>
-          <w:p>
-            <w:pPr>
-              <w:pStyle w:val="ListParagraph"/>
-              <w:autoSpaceDE w:val="0"/>
-              <w:autoSpaceDN w:val="0"/>
-              <w:adjustRightInd w:val="0"/>
-              <w:spacing w:after="0" w:line="240" w:lineRule="auto"/>
-              <w:ind w:left="0" w:right="294"/>
-              <w:rPr>
-                <w:rFonts w:ascii="Times New Roman" w:hAnsi="Times New Roman"/>
-                <w:bCs/>
-                <w:lang w:val="uk-UA"/>
-              </w:rPr>
-            </w:pPr>
-          </w:p>
-          <w:p>
-            <w:pPr>
-              <w:pStyle w:val="ListParagraph"/>
-              <w:autoSpaceDE w:val="0"/>
-              <w:autoSpaceDN w:val="0"/>
-              <w:adjustRightInd w:val="0"/>
-              <w:spacing w:after="0" w:line="240" w:lineRule="auto"/>
-              <w:ind w:left="0" w:right="294"/>
-              <w:rPr>
-                <w:rFonts w:ascii="Times New Roman" w:hAnsi="Times New Roman"/>
-                <w:bCs/>
-                <w:color w:val="00000A"/>
-                <w:lang w:val="uk-UA"/>
-              </w:rPr>
-            </w:pPr>
-          </w:p>
-          <w:p>
-            <w:pPr>
-              <w:ind w:right="294"/>
-              <w:rPr>
-                <w:rFonts w:ascii="Times New Roman" w:hAnsi="Times New Roman" w:cs="Times New Roman"/>
-                <w:sz w:val="22"/>
-                <w:szCs w:val="22"/>
-                <w:lang w:val="uk-UA"/>
-              </w:rPr>
-            </w:pPr>
             <w:r>
               <w:rPr>
                 <w:rStyle w:val="WW8Num1z3"/>
-                <w:rFonts w:ascii="Times New Roman" w:hAnsi="Times New Roman" w:cs="Times New Roman"/>
-                <w:bCs/>
-                <w:iCs/>
-                <w:sz w:val="22"/>
-                <w:szCs w:val="22"/>
-                <w:lang w:val="uk-UA"/>
-              </w:rPr>
-              <w:t>ФОП____________________/</w:t>
-            </w:r>
-            <w:r>
-              <w:rPr>
-                <w:rStyle w:val="WW8Num1z3"/>
-                <w:bCs/>
-                <w:iCs/>
-              </w:rPr>
-              <w:t>@</w:t>
-            </w:r>
-            <w:proofErr w:type="spellStart"/>
-            <w:r>
-              <w:rPr>
-                <w:rStyle w:val="WW8Num1z3"/>
+                <w:b/>
                 <w:bCs/>
                 <w:iCs/>
                 <w:lang w:val="en-US"/>
               </w:rPr>
               <w:t>ri</w:t>
             </w:r>
-            <w:proofErr w:type="spellEnd"/>
             <w:r>
               <w:rPr>
                 <w:rStyle w:val="WW8Num1z3"/>
+                <w:b/>
                 <w:bCs/>
                 <w:iCs/>
               </w:rPr>
               <w:t>_</w:t>
             </w:r>
-            <w:proofErr w:type="spellStart"/>
             <w:r>
               <w:rPr>
                 <w:rStyle w:val="WW8Num1z3"/>
+                <w:b/>
                 <w:bCs/>
                 <w:iCs/>
                 <w:lang w:val="en-US"/>
               </w:rPr>
               <w:t>shortname</w:t>
             </w:r>
-            <w:proofErr w:type="spellEnd"/>
           </w:p>
         </w:tc>
       </w:tr>
     </w:tbl>
     <w:p>
       <w:pPr>
+        <w:pStyle w:val="Normal"/>
         <w:ind w:firstLine="567"/>
         <w:jc w:val="both"/>
         <w:rPr>
@@ -3216,27 +3410,41 @@
           <w:color w:val="000000"/>
           <w:sz w:val="22"/>
           <w:szCs w:val="22"/>
-          <w:shd w:val="clear" w:color="auto" w:fill="FFFFFF"/>
+          <w:shd w:fill="FFFFFF" w:val="clear"/>
           <w:lang w:val="uk-UA"/>
         </w:rPr>
       </w:pPr>
+      <w:r>
+        <w:rPr>
+          <w:rFonts w:cs="Times New Roman" w:ascii="Times New Roman" w:hAnsi="Times New Roman"/>
+          <w:bCs/>
+          <w:color w:val="000000"/>
+          <w:sz w:val="22"/>
+          <w:szCs w:val="22"/>
+          <w:shd w:fill="FFFFFF" w:val="clear"/>
+          <w:lang w:val="uk-UA"/>
+        </w:rPr>
+      </w:r>
     </w:p>
     <w:sectPr>
+      <w:type w:val="nextPage"/>
       <w:pgSz w:w="12240" w:h="15840"/>
-      <w:pgMar w:top="426" w:right="567" w:bottom="426" w:left="851" w:header="709" w:footer="709" w:gutter="0"/>
-      <w:cols w:space="708"/>
-      <w:docGrid w:linePitch="360"/>
+      <w:pgMar w:left="851" w:right="567" w:gutter="0" w:header="0" w:top="426" w:footer="0" w:bottom="426"/>
+      <w:pgNumType w:fmt="decimal"/>
+      <w:formProt w:val="false"/>
+      <w:textDirection w:val="lrTb"/>
+      <w:docGrid w:type="default" w:linePitch="360" w:charSpace="0"/>
     </w:sectPr>
   </w:body>
 </w:document>
 </file>
 
 <file path=word/styles.xml><?xml version="1.0" encoding="utf-8"?>
-<w:styles xmlns:mc="http://schemas.openxmlformats.org/markup-compatibility/2006" xmlns:r="http://schemas.openxmlformats.org/officeDocument/2006/relationships" xmlns:w="http://schemas.openxmlformats.org/wordprocessingml/2006/main" xmlns:w14="http://schemas.microsoft.com/office/word/2010/wordml" xmlns:w15="http://schemas.microsoft.com/office/word/2012/wordml" xmlns:w16cex="http://schemas.microsoft.com/office/word/2018/wordml/cex" xmlns:w16cid="http://schemas.microsoft.com/office/word/2016/wordml/cid" xmlns:w16="http://schemas.microsoft.com/office/word/2018/wordml" xmlns:w16sdtdh="http://schemas.microsoft.com/office/word/2020/wordml/sdtdatahash" xmlns:w16se="http://schemas.microsoft.com/office/word/2015/wordml/symex" mc:Ignorable="w14 w15 w16se w16cid w16 w16cex w16sdtdh">
+<w:styles xmlns:w="http://schemas.openxmlformats.org/wordprocessingml/2006/main" xmlns:w14="http://schemas.microsoft.com/office/word/2010/wordml" xmlns:mc="http://schemas.openxmlformats.org/markup-compatibility/2006" mc:Ignorable="w14">
   <w:docDefaults>
     <w:rPrDefault>
       <w:rPr>
-        <w:rFonts w:asciiTheme="minorHAnsi" w:eastAsiaTheme="minorHAnsi" w:hAnsiTheme="minorHAnsi" w:cstheme="minorBidi"/>
+        <w:rFonts w:ascii="Calibri" w:hAnsi="Calibri" w:eastAsia="Calibri" w:cs="Arial" w:asciiTheme="minorHAnsi" w:cstheme="minorBidi" w:eastAsiaTheme="minorHAnsi" w:hAnsiTheme="minorHAnsi"/>
         <w:sz w:val="22"/>
         <w:szCs w:val="22"/>
         <w:lang w:val="en-US" w:eastAsia="en-US" w:bidi="ar-SA"/>
@@ -3244,21 +3452,21 @@
     </w:rPrDefault>
     <w:pPrDefault>
       <w:pPr>
-        <w:spacing w:after="160" w:line="259" w:lineRule="auto"/>
+        <w:suppressAutoHyphens w:val="true"/>
       </w:pPr>
     </w:pPrDefault>
   </w:docDefaults>
   <w:latentStyles w:defLockedState="0" w:defUIPriority="99" w:defSemiHidden="0" w:defUnhideWhenUsed="0" w:defQFormat="0" w:count="376">
     <w:lsdException w:name="Normal" w:uiPriority="0" w:qFormat="1"/>
     <w:lsdException w:name="heading 1" w:uiPriority="9" w:qFormat="1"/>
-    <w:lsdException w:name="heading 2" w:semiHidden="1" w:uiPriority="9" w:unhideWhenUsed="1" w:qFormat="1"/>
-    <w:lsdException w:name="heading 3" w:semiHidden="1" w:uiPriority="9" w:unhideWhenUsed="1" w:qFormat="1"/>
-    <w:lsdException w:name="heading 4" w:semiHidden="1" w:uiPriority="9" w:unhideWhenUsed="1" w:qFormat="1"/>
-    <w:lsdException w:name="heading 5" w:semiHidden="1" w:uiPriority="9" w:unhideWhenUsed="1" w:qFormat="1"/>
-    <w:lsdException w:name="heading 6" w:semiHidden="1" w:uiPriority="9" w:unhideWhenUsed="1" w:qFormat="1"/>
-    <w:lsdException w:name="heading 7" w:semiHidden="1" w:uiPriority="9" w:unhideWhenUsed="1" w:qFormat="1"/>
-    <w:lsdException w:name="heading 8" w:semiHidden="1" w:uiPriority="9" w:unhideWhenUsed="1" w:qFormat="1"/>
-    <w:lsdException w:name="heading 9" w:semiHidden="1" w:uiPriority="9" w:unhideWhenUsed="1" w:qFormat="1"/>
+    <w:lsdException w:name="heading 2" w:uiPriority="9" w:semiHidden="1" w:unhideWhenUsed="1" w:qFormat="1"/>
+    <w:lsdException w:name="heading 3" w:uiPriority="9" w:semiHidden="1" w:unhideWhenUsed="1" w:qFormat="1"/>
+    <w:lsdException w:name="heading 4" w:uiPriority="9" w:semiHidden="1" w:unhideWhenUsed="1" w:qFormat="1"/>
+    <w:lsdException w:name="heading 5" w:uiPriority="9" w:semiHidden="1" w:unhideWhenUsed="1" w:qFormat="1"/>
+    <w:lsdException w:name="heading 6" w:uiPriority="9" w:semiHidden="1" w:unhideWhenUsed="1" w:qFormat="1"/>
+    <w:lsdException w:name="heading 7" w:uiPriority="9" w:semiHidden="1" w:unhideWhenUsed="1" w:qFormat="1"/>
+    <w:lsdException w:name="heading 8" w:uiPriority="9" w:semiHidden="1" w:unhideWhenUsed="1" w:qFormat="1"/>
+    <w:lsdException w:name="heading 9" w:uiPriority="9" w:semiHidden="1" w:unhideWhenUsed="1" w:qFormat="1"/>
     <w:lsdException w:name="index 1" w:semiHidden="1" w:unhideWhenUsed="1"/>
     <w:lsdException w:name="index 2" w:semiHidden="1" w:unhideWhenUsed="1"/>
     <w:lsdException w:name="index 3" w:semiHidden="1" w:unhideWhenUsed="1"/>
@@ -3268,22 +3476,22 @@
     <w:lsdException w:name="index 7" w:semiHidden="1" w:unhideWhenUsed="1"/>
     <w:lsdException w:name="index 8" w:semiHidden="1" w:unhideWhenUsed="1"/>
     <w:lsdException w:name="index 9" w:semiHidden="1" w:unhideWhenUsed="1"/>
-    <w:lsdException w:name="toc 1" w:semiHidden="1" w:uiPriority="39" w:unhideWhenUsed="1"/>
-    <w:lsdException w:name="toc 2" w:semiHidden="1" w:uiPriority="39" w:unhideWhenUsed="1"/>
-    <w:lsdException w:name="toc 3" w:semiHidden="1" w:uiPriority="39" w:unhideWhenUsed="1"/>
-    <w:lsdException w:name="toc 4" w:semiHidden="1" w:uiPriority="39" w:unhideWhenUsed="1"/>
-    <w:lsdException w:name="toc 5" w:semiHidden="1" w:uiPriority="39" w:unhideWhenUsed="1"/>
-    <w:lsdException w:name="toc 6" w:semiHidden="1" w:uiPriority="39" w:unhideWhenUsed="1"/>
-    <w:lsdException w:name="toc 7" w:semiHidden="1" w:uiPriority="39" w:unhideWhenUsed="1"/>
-    <w:lsdException w:name="toc 8" w:semiHidden="1" w:uiPriority="39" w:unhideWhenUsed="1"/>
-    <w:lsdException w:name="toc 9" w:semiHidden="1" w:uiPriority="39" w:unhideWhenUsed="1"/>
+    <w:lsdException w:name="toc 1" w:uiPriority="39" w:semiHidden="1" w:unhideWhenUsed="1"/>
+    <w:lsdException w:name="toc 2" w:uiPriority="39" w:semiHidden="1" w:unhideWhenUsed="1"/>
+    <w:lsdException w:name="toc 3" w:uiPriority="39" w:semiHidden="1" w:unhideWhenUsed="1"/>
+    <w:lsdException w:name="toc 4" w:uiPriority="39" w:semiHidden="1" w:unhideWhenUsed="1"/>
+    <w:lsdException w:name="toc 5" w:uiPriority="39" w:semiHidden="1" w:unhideWhenUsed="1"/>
+    <w:lsdException w:name="toc 6" w:uiPriority="39" w:semiHidden="1" w:unhideWhenUsed="1"/>
+    <w:lsdException w:name="toc 7" w:uiPriority="39" w:semiHidden="1" w:unhideWhenUsed="1"/>
+    <w:lsdException w:name="toc 8" w:uiPriority="39" w:semiHidden="1" w:unhideWhenUsed="1"/>
+    <w:lsdException w:name="toc 9" w:uiPriority="39" w:semiHidden="1" w:unhideWhenUsed="1"/>
     <w:lsdException w:name="Normal Indent" w:semiHidden="1" w:unhideWhenUsed="1"/>
     <w:lsdException w:name="footnote text" w:semiHidden="1" w:unhideWhenUsed="1"/>
     <w:lsdException w:name="annotation text" w:semiHidden="1" w:unhideWhenUsed="1"/>
     <w:lsdException w:name="header" w:semiHidden="1" w:unhideWhenUsed="1"/>
     <w:lsdException w:name="footer" w:semiHidden="1" w:unhideWhenUsed="1"/>
     <w:lsdException w:name="index heading" w:semiHidden="1" w:unhideWhenUsed="1"/>
-    <w:lsdException w:name="caption" w:semiHidden="1" w:uiPriority="35" w:unhideWhenUsed="1" w:qFormat="1"/>
+    <w:lsdException w:name="caption" w:uiPriority="35" w:semiHidden="1" w:unhideWhenUsed="1" w:qFormat="1"/>
     <w:lsdException w:name="table of figures" w:semiHidden="1" w:unhideWhenUsed="1"/>
     <w:lsdException w:name="envelope address" w:semiHidden="1" w:unhideWhenUsed="1"/>
     <w:lsdException w:name="envelope return" w:semiHidden="1" w:unhideWhenUsed="1"/>
@@ -3314,8 +3522,8 @@
     <w:lsdException w:name="Title" w:uiPriority="10" w:qFormat="1"/>
     <w:lsdException w:name="Closing" w:semiHidden="1" w:unhideWhenUsed="1"/>
     <w:lsdException w:name="Signature" w:semiHidden="1" w:unhideWhenUsed="1"/>
-    <w:lsdException w:name="Default Paragraph Font" w:semiHidden="1" w:uiPriority="1" w:unhideWhenUsed="1"/>
-    <w:lsdException w:name="Body Text" w:semiHidden="1" w:uiPriority="0" w:unhideWhenUsed="1"/>
+    <w:lsdException w:name="Default Paragraph Font" w:uiPriority="1" w:semiHidden="1" w:unhideWhenUsed="1"/>
+    <w:lsdException w:name="Body Text" w:uiPriority="0" w:semiHidden="1" w:unhideWhenUsed="1"/>
     <w:lsdException w:name="Body Text Indent" w:semiHidden="1" w:unhideWhenUsed="1"/>
     <w:lsdException w:name="List Continue" w:semiHidden="1" w:unhideWhenUsed="1"/>
     <w:lsdException w:name="List Continue 2" w:semiHidden="1" w:unhideWhenUsed="1"/>
@@ -3512,8 +3720,8 @@
     <w:lsdException w:name="Subtle Reference" w:uiPriority="31" w:qFormat="1"/>
     <w:lsdException w:name="Intense Reference" w:uiPriority="32" w:qFormat="1"/>
     <w:lsdException w:name="Book Title" w:uiPriority="33" w:qFormat="1"/>
-    <w:lsdException w:name="Bibliography" w:semiHidden="1" w:uiPriority="37" w:unhideWhenUsed="1"/>
-    <w:lsdException w:name="TOC Heading" w:semiHidden="1" w:uiPriority="39" w:unhideWhenUsed="1" w:qFormat="1"/>
+    <w:lsdException w:name="Bibliography" w:uiPriority="37" w:semiHidden="1" w:unhideWhenUsed="1"/>
+    <w:lsdException w:name="TOC Heading" w:uiPriority="39" w:semiHidden="1" w:unhideWhenUsed="1" w:qFormat="1"/>
     <w:lsdException w:name="Plain Table 1" w:uiPriority="41"/>
     <w:lsdException w:name="Plain Table 2" w:uiPriority="42"/>
     <w:lsdException w:name="Plain Table 3" w:uiPriority="43"/>
@@ -3624,59 +3832,105 @@
     <w:lsdException w:name="Unresolved Mention" w:semiHidden="1" w:unhideWhenUsed="1"/>
     <w:lsdException w:name="Smart Link" w:semiHidden="1" w:unhideWhenUsed="1"/>
   </w:latentStyles>
-  <w:style w:type="paragraph" w:default="1" w:styleId="Normal">
+  <w:style w:type="paragraph" w:styleId="Normal" w:default="1">
     <w:name w:val="Normal"/>
     <w:qFormat/>
-    <w:rsid w:val="001A0D10"/>
+    <w:rsid w:val="001a0d10"/>
     <w:pPr>
-      <w:widowControl w:val="0"/>
-      <w:suppressAutoHyphens/>
-      <w:autoSpaceDE w:val="0"/>
-      <w:spacing w:after="0" w:line="240" w:lineRule="auto"/>
+      <w:widowControl w:val="false"/>
+      <w:suppressAutoHyphens w:val="true"/>
+      <w:bidi w:val="0"/>
+      <w:spacing w:lineRule="auto" w:line="240" w:before="0" w:after="0"/>
+      <w:jc w:val="left"/>
     </w:pPr>
     <w:rPr>
-      <w:rFonts w:ascii="Arial" w:eastAsia="Times New Roman" w:hAnsi="Arial" w:cs="Arial"/>
+      <w:rFonts w:ascii="Arial" w:hAnsi="Arial" w:eastAsia="Times New Roman" w:cs="Arial" w:cstheme="minorBidi"/>
+      <w:color w:val="auto"/>
+      <w:kern w:val="0"/>
+      <w:sz w:val="20"/>
+      <w:szCs w:val="20"/>
+      <w:lang w:val="ru-RU" w:eastAsia="zh-CN" w:bidi="ar-SA"/>
+    </w:rPr>
+  </w:style>
+  <w:style w:type="character" w:styleId="DefaultParagraphFont" w:default="1">
+    <w:name w:val="Default Paragraph Font"/>
+    <w:uiPriority w:val="1"/>
+    <w:unhideWhenUsed/>
+    <w:qFormat/>
+    <w:rPr/>
+  </w:style>
+  <w:style w:type="character" w:styleId="Style14" w:customStyle="1">
+    <w:name w:val="Основной текст Знак"/>
+    <w:basedOn w:val="DefaultParagraphFont"/>
+    <w:uiPriority w:val="99"/>
+    <w:semiHidden/>
+    <w:qFormat/>
+    <w:rsid w:val="001a0d10"/>
+    <w:rPr>
+      <w:rFonts w:ascii="Arial" w:hAnsi="Arial" w:eastAsia="Times New Roman" w:cs="Arial"/>
       <w:sz w:val="20"/>
       <w:szCs w:val="20"/>
       <w:lang w:val="ru-RU" w:eastAsia="zh-CN"/>
     </w:rPr>
   </w:style>
-  <w:style w:type="character" w:default="1" w:styleId="DefaultParagraphFont">
-    <w:name w:val="Default Paragraph Font"/>
-    <w:uiPriority w:val="1"/>
-    <w:unhideWhenUsed/>
+  <w:style w:type="character" w:styleId="BodyTextChar" w:customStyle="1">
+    <w:name w:val="Body Text Char"/>
+    <w:qFormat/>
+    <w:locked/>
+    <w:rsid w:val="001a0d10"/>
+    <w:rPr>
+      <w:rFonts w:ascii="Courier New" w:hAnsi="Courier New" w:eastAsia="Times New Roman" w:cs="Times New Roman"/>
+      <w:color w:val="000000"/>
+      <w:sz w:val="24"/>
+      <w:szCs w:val="24"/>
+      <w:shd w:fill="FFFFFF" w:val="clear"/>
+      <w:lang w:val="ru-RU" w:eastAsia="ru-RU"/>
+    </w:rPr>
   </w:style>
-  <w:style w:type="table" w:default="1" w:styleId="TableNormal">
-    <w:name w:val="Normal Table"/>
+  <w:style w:type="character" w:styleId="BodyTextIndentChar" w:customStyle="1">
+    <w:name w:val="Body Text Indent Char"/>
+    <w:basedOn w:val="DefaultParagraphFont"/>
     <w:uiPriority w:val="99"/>
     <w:semiHidden/>
-    <w:unhideWhenUsed/>
-    <w:tblPr>
-      <w:tblInd w:w="0" w:type="dxa"/>
-      <w:tblCellMar>
-        <w:top w:w="0" w:type="dxa"/>
-        <w:left w:w="108" w:type="dxa"/>
-        <w:bottom w:w="0" w:type="dxa"/>
-        <w:right w:w="108" w:type="dxa"/>
-      </w:tblCellMar>
-    </w:tblPr>
+    <w:qFormat/>
+    <w:rsid w:val="004c0da3"/>
+    <w:rPr>
+      <w:rFonts w:ascii="Arial" w:hAnsi="Arial" w:eastAsia="Times New Roman" w:cs="Arial"/>
+      <w:sz w:val="20"/>
+      <w:szCs w:val="20"/>
+      <w:lang w:val="ru-RU" w:eastAsia="zh-CN"/>
+    </w:rPr>
   </w:style>
-  <w:style w:type="numbering" w:default="1" w:styleId="NoList">
-    <w:name w:val="No List"/>
-    <w:uiPriority w:val="99"/>
-    <w:semiHidden/>
-    <w:unhideWhenUsed/>
+  <w:style w:type="character" w:styleId="WW8Num1z3" w:customStyle="1">
+    <w:name w:val="WW8Num1z3"/>
+    <w:qFormat/>
+    <w:rsid w:val="004c0da3"/>
+    <w:rPr/>
+  </w:style>
+  <w:style w:type="paragraph" w:styleId="Heading">
+    <w:name w:val="Heading"/>
+    <w:basedOn w:val="Normal"/>
+    <w:next w:val="BodyText"/>
+    <w:qFormat/>
+    <w:pPr>
+      <w:keepNext w:val="true"/>
+      <w:spacing w:before="240" w:after="120"/>
+    </w:pPr>
+    <w:rPr>
+      <w:rFonts w:ascii="Liberation Sans" w:hAnsi="Liberation Sans" w:eastAsia="Noto Sans CJK SC" w:cs="Noto Sans Devanagari"/>
+      <w:sz w:val="28"/>
+      <w:szCs w:val="28"/>
+    </w:rPr>
   </w:style>
   <w:style w:type="paragraph" w:styleId="BodyText">
     <w:name w:val="Body Text"/>
     <w:basedOn w:val="Normal"/>
     <w:link w:val="BodyTextChar"/>
     <w:qFormat/>
-    <w:rsid w:val="001A0D10"/>
+    <w:rsid w:val="001a0d10"/>
     <w:pPr>
       <w:shd w:val="clear" w:color="auto" w:fill="FFFFFF"/>
-      <w:autoSpaceDE/>
-      <w:spacing w:before="120" w:line="206" w:lineRule="exact"/>
+      <w:spacing w:lineRule="exact" w:line="206" w:before="120" w:after="0"/>
       <w:jc w:val="both"/>
     </w:pPr>
     <w:rPr>
@@ -3687,51 +3941,40 @@
       <w:lang w:eastAsia="ru-RU"/>
     </w:rPr>
   </w:style>
-  <w:style w:type="character" w:customStyle="1" w:styleId="a">
-    <w:name w:val="Основной текст Знак"/>
-    <w:basedOn w:val="DefaultParagraphFont"/>
-    <w:uiPriority w:val="99"/>
-    <w:semiHidden/>
-    <w:rsid w:val="001A0D10"/>
+  <w:style w:type="paragraph" w:styleId="List">
+    <w:name w:val="List"/>
+    <w:basedOn w:val="BodyText"/>
+    <w:pPr/>
     <w:rPr>
-      <w:rFonts w:ascii="Arial" w:eastAsia="Times New Roman" w:hAnsi="Arial" w:cs="Arial"/>
-      <w:sz w:val="20"/>
-      <w:szCs w:val="20"/>
-      <w:lang w:val="ru-RU" w:eastAsia="zh-CN"/>
+      <w:rFonts w:cs="Noto Sans Devanagari"/>
     </w:rPr>
   </w:style>
-  <w:style w:type="character" w:customStyle="1" w:styleId="BodyTextChar">
-    <w:name w:val="Body Text Char"/>
-    <w:link w:val="BodyText"/>
-    <w:locked/>
-    <w:rsid w:val="001A0D10"/>
+  <w:style w:type="paragraph" w:styleId="Caption">
+    <w:name w:val="Caption"/>
+    <w:basedOn w:val="Normal"/>
+    <w:qFormat/>
+    <w:pPr>
+      <w:suppressLineNumbers/>
+      <w:spacing w:before="120" w:after="120"/>
+    </w:pPr>
     <w:rPr>
-      <w:rFonts w:ascii="Courier New" w:eastAsia="Times New Roman" w:hAnsi="Courier New" w:cs="Times New Roman"/>
-      <w:color w:val="000000"/>
+      <w:rFonts w:cs="Noto Sans Devanagari"/>
+      <w:i/>
+      <w:iCs/>
       <w:sz w:val="24"/>
       <w:szCs w:val="24"/>
-      <w:shd w:val="clear" w:color="auto" w:fill="FFFFFF"/>
-      <w:lang w:val="ru-RU" w:eastAsia="ru-RU"/>
     </w:rPr>
   </w:style>
-  <w:style w:type="table" w:styleId="TableGrid">
-    <w:name w:val="Table Grid"/>
-    <w:basedOn w:val="TableNormal"/>
-    <w:uiPriority w:val="39"/>
-    <w:rsid w:val="001A0D10"/>
+  <w:style w:type="paragraph" w:styleId="Index">
+    <w:name w:val="Index"/>
+    <w:basedOn w:val="Normal"/>
+    <w:qFormat/>
     <w:pPr>
-      <w:spacing w:after="0" w:line="240" w:lineRule="auto"/>
+      <w:suppressLineNumbers/>
     </w:pPr>
-    <w:tblPr>
-      <w:tblBorders>
-        <w:top w:val="single" w:sz="4" w:space="0" w:color="auto"/>
-        <w:left w:val="single" w:sz="4" w:space="0" w:color="auto"/>
-        <w:bottom w:val="single" w:sz="4" w:space="0" w:color="auto"/>
-        <w:right w:val="single" w:sz="4" w:space="0" w:color="auto"/>
-        <w:insideH w:val="single" w:sz="4" w:space="0" w:color="auto"/>
-        <w:insideV w:val="single" w:sz="4" w:space="0" w:color="auto"/>
-      </w:tblBorders>
-    </w:tblPr>
+    <w:rPr>
+      <w:rFonts w:cs="Noto Sans Devanagari"/>
+    </w:rPr>
   </w:style>
   <w:style w:type="paragraph" w:styleId="BodyTextIndent">
     <w:name w:val="Body Text Indent"/>
@@ -3741,209 +3984,167 @@
     <w:semiHidden/>
     <w:unhideWhenUsed/>
     <w:qFormat/>
-    <w:rsid w:val="004C0DA3"/>
+    <w:rsid w:val="004c0da3"/>
     <w:pPr>
-      <w:spacing w:after="120"/>
+      <w:spacing w:before="0" w:after="120"/>
       <w:ind w:left="283"/>
     </w:pPr>
-  </w:style>
-  <w:style w:type="character" w:customStyle="1" w:styleId="BodyTextIndentChar">
-    <w:name w:val="Body Text Indent Char"/>
-    <w:basedOn w:val="DefaultParagraphFont"/>
-    <w:link w:val="BodyTextIndent"/>
-    <w:uiPriority w:val="99"/>
-    <w:semiHidden/>
-    <w:rsid w:val="004C0DA3"/>
-    <w:rPr>
-      <w:rFonts w:ascii="Arial" w:eastAsia="Times New Roman" w:hAnsi="Arial" w:cs="Arial"/>
-      <w:sz w:val="20"/>
-      <w:szCs w:val="20"/>
-      <w:lang w:val="ru-RU" w:eastAsia="zh-CN"/>
-    </w:rPr>
+    <w:rPr/>
   </w:style>
   <w:style w:type="paragraph" w:styleId="ListParagraph">
     <w:name w:val="List Paragraph"/>
     <w:basedOn w:val="Normal"/>
     <w:qFormat/>
-    <w:rsid w:val="004C0DA3"/>
+    <w:rsid w:val="004c0da3"/>
     <w:pPr>
       <w:widowControl/>
-      <w:suppressAutoHyphens w:val="0"/>
-      <w:autoSpaceDE/>
-      <w:spacing w:after="200" w:line="276" w:lineRule="auto"/>
+      <w:suppressAutoHyphens w:val="false"/>
+      <w:spacing w:lineRule="auto" w:line="276" w:before="0" w:after="200"/>
       <w:ind w:left="720"/>
       <w:contextualSpacing/>
     </w:pPr>
     <w:rPr>
-      <w:rFonts w:ascii="Calibri" w:eastAsia="Calibri" w:hAnsi="Calibri" w:cs="Times New Roman"/>
+      <w:rFonts w:ascii="Calibri" w:hAnsi="Calibri" w:eastAsia="Calibri" w:cs="Times New Roman"/>
       <w:sz w:val="22"/>
       <w:szCs w:val="22"/>
       <w:lang w:eastAsia="en-US"/>
     </w:rPr>
   </w:style>
-  <w:style w:type="character" w:customStyle="1" w:styleId="WW8Num1z3">
-    <w:name w:val="WW8Num1z3"/>
-    <w:rsid w:val="004C0DA3"/>
+  <w:style w:type="numbering" w:styleId="NoList" w:default="1">
+    <w:name w:val="No List"/>
+    <w:uiPriority w:val="99"/>
+    <w:semiHidden/>
+    <w:unhideWhenUsed/>
+    <w:qFormat/>
+  </w:style>
+  <w:style w:type="table" w:default="1" w:styleId="TableNormal">
+    <w:name w:val="Normal Table"/>
+    <w:uiPriority w:val="99"/>
+    <w:semiHidden/>
+    <w:unhideWhenUsed/>
+    <w:tblPr>
+      <w:tblCellMar>
+        <w:top w:w="0" w:type="dxa"/>
+        <w:left w:w="108" w:type="dxa"/>
+        <w:bottom w:w="0" w:type="dxa"/>
+        <w:right w:w="108" w:type="dxa"/>
+      </w:tblCellMar>
+    </w:tblPr>
+  </w:style>
+  <w:style w:type="table" w:styleId="TableGrid">
+    <w:name w:val="Table Grid"/>
+    <w:basedOn w:val="TableNormal"/>
+    <w:uiPriority w:val="39"/>
+    <w:rsid w:val="001a0d10"/>
+    <w:pPr>
+      <w:spacing w:after="0" w:line="240" w:lineRule="auto"/>
+    </w:pPr>
+    <w:tblPr>
+      <w:tblBorders>
+        <w:top w:val="single" w:color="auto" w:sz="4" w:space="0"/>
+        <w:left w:val="single" w:color="auto" w:sz="4" w:space="0"/>
+        <w:bottom w:val="single" w:color="auto" w:sz="4" w:space="0"/>
+        <w:right w:val="single" w:color="auto" w:sz="4" w:space="0"/>
+        <w:insideH w:val="single" w:color="auto" w:sz="4" w:space="0"/>
+        <w:insideV w:val="single" w:color="auto" w:sz="4" w:space="0"/>
+      </w:tblBorders>
+    </w:tblPr>
   </w:style>
 </w:styles>
 </file>
 
 <file path=word/theme/theme1.xml><?xml version="1.0" encoding="utf-8"?>
-<a:theme xmlns:a="http://schemas.openxmlformats.org/drawingml/2006/main" name="Тема Office">
+<a:theme xmlns:a="http://schemas.openxmlformats.org/drawingml/2006/main" xmlns:r="http://schemas.openxmlformats.org/officeDocument/2006/relationships" name="Тема Office">
   <a:themeElements>
     <a:clrScheme name="Стандартная">
       <a:dk1>
-        <a:sysClr val="windowText" lastClr="000000"/>
+        <a:srgbClr val="000000"/>
       </a:dk1>
       <a:lt1>
-        <a:sysClr val="window" lastClr="FFFFFF"/>
+        <a:srgbClr val="ffffff"/>
       </a:lt1>
       <a:dk2>
-        <a:srgbClr val="44546A"/>
+        <a:srgbClr val="44546a"/>
       </a:dk2>
       <a:lt2>
-        <a:srgbClr val="E7E6E6"/>
+        <a:srgbClr val="e7e6e6"/>
       </a:lt2>
       <a:accent1>
-        <a:srgbClr val="5B9BD5"/>
+        <a:srgbClr val="5b9bd5"/>
       </a:accent1>
       <a:accent2>
-        <a:srgbClr val="ED7D31"/>
+        <a:srgbClr val="ed7d31"/>
       </a:accent2>
       <a:accent3>
-        <a:srgbClr val="A5A5A5"/>
+        <a:srgbClr val="a5a5a5"/>
       </a:accent3>
       <a:accent4>
-        <a:srgbClr val="FFC000"/>
+        <a:srgbClr val="ffc000"/>
       </a:accent4>
       <a:accent5>
-        <a:srgbClr val="4472C4"/>
+        <a:srgbClr val="4472c4"/>
       </a:accent5>
       <a:accent6>
-        <a:srgbClr val="70AD47"/>
+        <a:srgbClr val="70ad47"/>
       </a:accent6>
       <a:hlink>
-        <a:srgbClr val="0563C1"/>
+        <a:srgbClr val="0563c1"/>
       </a:hlink>
       <a:folHlink>
-        <a:srgbClr val="954F72"/>
+        <a:srgbClr val="954f72"/>
       </a:folHlink>
     </a:clrScheme>
     <a:fontScheme name="Стандартная">
       <a:majorFont>
-        <a:latin typeface="Calibri Light" panose="020F0302020204030204"/>
+        <a:latin typeface="Calibri Light" panose="020F0302020204030204" pitchFamily="0" charset="1"/>
         <a:ea typeface=""/>
         <a:cs typeface=""/>
-        <a:font script="Jpan" typeface="游ゴシック Light"/>
-        <a:font script="Hang" typeface="맑은 고딕"/>
-        <a:font script="Hans" typeface="等线 Light"/>
-        <a:font script="Hant" typeface="新細明體"/>
-        <a:font script="Arab" typeface="Times New Roman"/>
-        <a:font script="Hebr" typeface="Times New Roman"/>
-        <a:font script="Thai" typeface="Angsana New"/>
-        <a:font script="Ethi" typeface="Nyala"/>
-        <a:font script="Beng" typeface="Vrinda"/>
-        <a:font script="Gujr" typeface="Shruti"/>
-        <a:font script="Khmr" typeface="MoolBoran"/>
-        <a:font script="Knda" typeface="Tunga"/>
-        <a:font script="Guru" typeface="Raavi"/>
-        <a:font script="Cans" typeface="Euphemia"/>
-        <a:font script="Cher" typeface="Plantagenet Cherokee"/>
-        <a:font script="Yiii" typeface="Microsoft Yi Baiti"/>
-        <a:font script="Tibt" typeface="Microsoft Himalaya"/>
-        <a:font script="Thaa" typeface="MV Boli"/>
-        <a:font script="Deva" typeface="Mangal"/>
-        <a:font script="Telu" typeface="Gautami"/>
-        <a:font script="Taml" typeface="Latha"/>
-        <a:font script="Syrc" typeface="Estrangelo Edessa"/>
-        <a:font script="Orya" typeface="Kalinga"/>
-        <a:font script="Mlym" typeface="Kartika"/>
-        <a:font script="Laoo" typeface="DokChampa"/>
-        <a:font script="Sinh" typeface="Iskoola Pota"/>
-        <a:font script="Mong" typeface="Mongolian Baiti"/>
-        <a:font script="Viet" typeface="Times New Roman"/>
-        <a:font script="Uigh" typeface="Microsoft Uighur"/>
-        <a:font script="Geor" typeface="Sylfaen"/>
       </a:majorFont>
       <a:minorFont>
-        <a:latin typeface="Calibri" panose="020F0502020204030204"/>
+        <a:latin typeface="Calibri" panose="020F0502020204030204" pitchFamily="0" charset="1"/>
         <a:ea typeface=""/>
         <a:cs typeface=""/>
-        <a:font script="Jpan" typeface="游明朝"/>
-        <a:font script="Hang" typeface="맑은 고딕"/>
-        <a:font script="Hans" typeface="等线"/>
-        <a:font script="Hant" typeface="新細明體"/>
-        <a:font script="Arab" typeface="Arial"/>
-        <a:font script="Hebr" typeface="Arial"/>
-        <a:font script="Thai" typeface="Cordia New"/>
-        <a:font script="Ethi" typeface="Nyala"/>
-        <a:font script="Beng" typeface="Vrinda"/>
-        <a:font script="Gujr" typeface="Shruti"/>
-        <a:font script="Khmr" typeface="DaunPenh"/>
-        <a:font script="Knda" typeface="Tunga"/>
-        <a:font script="Guru" typeface="Raavi"/>
-        <a:font script="Cans" typeface="Euphemia"/>
-        <a:font script="Cher" typeface="Plantagenet Cherokee"/>
-        <a:font script="Yiii" typeface="Microsoft Yi Baiti"/>
-        <a:font script="Tibt" typeface="Microsoft Himalaya"/>
-        <a:font script="Thaa" typeface="MV Boli"/>
-        <a:font script="Deva" typeface="Mangal"/>
-        <a:font script="Telu" typeface="Gautami"/>
-        <a:font script="Taml" typeface="Latha"/>
-        <a:font script="Syrc" typeface="Estrangelo Edessa"/>
-        <a:font script="Orya" typeface="Kalinga"/>
-        <a:font script="Mlym" typeface="Kartika"/>
-        <a:font script="Laoo" typeface="DokChampa"/>
-        <a:font script="Sinh" typeface="Iskoola Pota"/>
-        <a:font script="Mong" typeface="Mongolian Baiti"/>
-        <a:font script="Viet" typeface="Arial"/>
-        <a:font script="Uigh" typeface="Microsoft Uighur"/>
-        <a:font script="Geor" typeface="Sylfaen"/>
       </a:minorFont>
     </a:fontScheme>
-    <a:fmtScheme name="Стандартная">
+    <a:fmtScheme>
       <a:fillStyleLst>
         <a:solidFill>
           <a:schemeClr val="phClr"/>
         </a:solidFill>
-        <a:gradFill rotWithShape="1">
+        <a:gradFill>
           <a:gsLst>
             <a:gs pos="0">
               <a:schemeClr val="phClr">
                 <a:lumMod val="110000"/>
-                <a:satMod val="105000"/>
                 <a:tint val="67000"/>
               </a:schemeClr>
             </a:gs>
             <a:gs pos="50000">
               <a:schemeClr val="phClr">
                 <a:lumMod val="105000"/>
-                <a:satMod val="103000"/>
                 <a:tint val="73000"/>
               </a:schemeClr>
             </a:gs>
             <a:gs pos="100000">
               <a:schemeClr val="phClr">
                 <a:lumMod val="105000"/>
-                <a:satMod val="109000"/>
                 <a:tint val="81000"/>
               </a:schemeClr>
             </a:gs>
           </a:gsLst>
           <a:lin ang="5400000" scaled="0"/>
+          <a:tileRect l="0" t="0" r="0" b="0"/>
         </a:gradFill>
-        <a:gradFill rotWithShape="1">
+        <a:gradFill>
           <a:gsLst>
             <a:gs pos="0">
               <a:schemeClr val="phClr">
-                <a:satMod val="103000"/>
                 <a:lumMod val="102000"/>
                 <a:tint val="94000"/>
               </a:schemeClr>
             </a:gs>
             <a:gs pos="50000">
               <a:schemeClr val="phClr">
-                <a:satMod val="110000"/>
                 <a:lumMod val="100000"/>
                 <a:shade val="100000"/>
               </a:schemeClr>
@@ -3951,33 +4152,24 @@
             <a:gs pos="100000">
               <a:schemeClr val="phClr">
                 <a:lumMod val="99000"/>
-                <a:satMod val="120000"/>
                 <a:shade val="78000"/>
               </a:schemeClr>
             </a:gs>
           </a:gsLst>
           <a:lin ang="5400000" scaled="0"/>
+          <a:tileRect l="0" t="0" r="0" b="0"/>
         </a:gradFill>
       </a:fillStyleLst>
       <a:lnStyleLst>
         <a:ln w="6350" cap="flat" cmpd="sng" algn="ctr">
-          <a:solidFill>
-            <a:schemeClr val="phClr"/>
-          </a:solidFill>
           <a:prstDash val="solid"/>
           <a:miter lim="800000"/>
         </a:ln>
         <a:ln w="12700" cap="flat" cmpd="sng" algn="ctr">
-          <a:solidFill>
-            <a:schemeClr val="phClr"/>
-          </a:solidFill>
           <a:prstDash val="solid"/>
           <a:miter lim="800000"/>
         </a:ln>
         <a:ln w="19050" cap="flat" cmpd="sng" algn="ctr">
-          <a:solidFill>
-            <a:schemeClr val="phClr"/>
-          </a:solidFill>
           <a:prstDash val="solid"/>
           <a:miter lim="800000"/>
         </a:ln>
@@ -3990,13 +4182,7 @@
           <a:effectLst/>
         </a:effectStyle>
         <a:effectStyle>
-          <a:effectLst>
-            <a:outerShdw blurRad="57150" dist="19050" dir="5400000" algn="ctr" rotWithShape="0">
-              <a:srgbClr val="000000">
-                <a:alpha val="63000"/>
-              </a:srgbClr>
-            </a:outerShdw>
-          </a:effectLst>
+          <a:effectLst/>
         </a:effectStyle>
       </a:effectStyleLst>
       <a:bgFillStyleLst>
@@ -4006,15 +4192,13 @@
         <a:solidFill>
           <a:schemeClr val="phClr">
             <a:tint val="95000"/>
-            <a:satMod val="170000"/>
           </a:schemeClr>
         </a:solidFill>
-        <a:gradFill rotWithShape="1">
+        <a:gradFill>
           <a:gsLst>
             <a:gs pos="0">
               <a:schemeClr val="phClr">
                 <a:tint val="93000"/>
-                <a:satMod val="150000"/>
                 <a:shade val="98000"/>
                 <a:lumMod val="102000"/>
               </a:schemeClr>
@@ -4022,7 +4206,6 @@
             <a:gs pos="50000">
               <a:schemeClr val="phClr">
                 <a:tint val="98000"/>
-                <a:satMod val="130000"/>
                 <a:shade val="90000"/>
                 <a:lumMod val="103000"/>
               </a:schemeClr>
@@ -4030,35 +4213,19 @@
             <a:gs pos="100000">
               <a:schemeClr val="phClr">
                 <a:shade val="63000"/>
-                <a:satMod val="120000"/>
               </a:schemeClr>
             </a:gs>
           </a:gsLst>
           <a:lin ang="5400000" scaled="0"/>
+          <a:tileRect l="0" t="0" r="0" b="0"/>
         </a:gradFill>
       </a:bgFillStyleLst>
     </a:fmtScheme>
   </a:themeElements>
-  <a:objectDefaults/>
-  <a:extraClrSchemeLst/>
-  <a:extLst>
-    <a:ext uri="{05A4C25C-085E-4340-85A3-A5531E510DB2}">
-      <thm15:themeFamily xmlns:thm15="http://schemas.microsoft.com/office/thememl/2012/main" name="Office Theme" id="{62F939B6-93AF-4DB8-9C6B-D6C7DFDC589F}" vid="{4A3C46E8-61CC-4603-A589-7422A47A8E4A}"/>
-    </a:ext>
-  </a:extLst>
 </a:theme>
 </file>
 
 <file path=customXml/item1.xml><?xml version="1.0" encoding="utf-8"?>
-<?mso-contentType ?>
-<FormTemplates xmlns="http://schemas.microsoft.com/sharepoint/v3/contenttype/forms">
-  <Display>DocumentLibraryForm</Display>
-  <Edit>DocumentLibraryForm</Edit>
-  <New>DocumentLibraryForm</New>
-</FormTemplates>
-</file>
-
-<file path=customXml/item2.xml><?xml version="1.0" encoding="utf-8"?>
 <ct:contentTypeSchema xmlns:ct="http://schemas.microsoft.com/office/2006/metadata/contentType" xmlns:ma="http://schemas.microsoft.com/office/2006/metadata/properties/metaAttributes" ct:_="" ma:_="" ma:contentTypeName="Документ" ma:contentTypeID="0x0101007AA98016A56F934B8C1C0D4E617E1C00" ma:contentTypeVersion="12" ma:contentTypeDescription="Створення нового документа." ma:contentTypeScope="" ma:versionID="8b52ecd0e4c3358fd86748d7f375288c">
   <xsd:schema xmlns:xsd="http://www.w3.org/2001/XMLSchema" xmlns:xs="http://www.w3.org/2001/XMLSchema" xmlns:p="http://schemas.microsoft.com/office/2006/metadata/properties" xmlns:ns2="0bf87b2e-2f18-4fb7-a175-ceca74504cd7" xmlns:ns3="a42c7528-3124-4219-90a5-1e05b8b134de" targetNamespace="http://schemas.microsoft.com/office/2006/metadata/properties" ma:root="true" ma:fieldsID="660b7d5d1bb5d41bed2cc507144a682e" ns2:_="" ns3:_="">
     <xsd:import namespace="0bf87b2e-2f18-4fb7-a175-ceca74504cd7"/>
@@ -4253,15 +4420,16 @@
 </ct:contentTypeSchema>
 </file>
 
-<file path=customXml/itemProps1.xml><?xml version="1.0" encoding="utf-8"?>
-<ds:datastoreItem xmlns:ds="http://schemas.openxmlformats.org/officeDocument/2006/customXml" ds:itemID="{7A5ADC6A-6616-4910-8D1D-0134B3DA1915}">
-  <ds:schemaRefs>
-    <ds:schemaRef ds:uri="http://schemas.microsoft.com/sharepoint/v3/contenttype/forms"/>
-  </ds:schemaRefs>
-</ds:datastoreItem>
+<file path=customXml/item2.xml><?xml version="1.0" encoding="utf-8"?>
+<?mso-contentType ?>
+<FormTemplates xmlns="http://schemas.microsoft.com/sharepoint/v3/contenttype/forms">
+  <Display>DocumentLibraryForm</Display>
+  <Edit>DocumentLibraryForm</Edit>
+  <New>DocumentLibraryForm</New>
+</FormTemplates>
 </file>
 
-<file path=customXml/itemProps2.xml><?xml version="1.0" encoding="utf-8"?>
+<file path=customXml/itemProps1.xml><?xml version="1.0" encoding="utf-8"?>
 <ds:datastoreItem xmlns:ds="http://schemas.openxmlformats.org/officeDocument/2006/customXml" ds:itemID="{C571ABC5-2D52-44EB-B907-147D8937B3B8}">
   <ds:schemaRefs>
     <ds:schemaRef ds:uri="http://schemas.microsoft.com/office/2006/metadata/contentType"/>
@@ -4278,4 +4446,12 @@
     <ds:schemaRef ds:uri="http://schemas.microsoft.com/internal/obd"/>
   </ds:schemaRefs>
 </ds:datastoreItem>
+</file>
+
+<file path=customXml/itemProps2.xml><?xml version="1.0" encoding="utf-8"?>
+<ds:datastoreItem xmlns:ds="http://schemas.openxmlformats.org/officeDocument/2006/customXml" ds:itemID="{7A5ADC6A-6616-4910-8D1D-0134B3DA1915}">
+  <ds:schemaRefs>
+    <ds:schemaRef ds:uri="http://schemas.microsoft.com/sharepoint/v3/contenttype/forms"/>
+  </ds:schemaRefs>
+</ds:datastoreItem>
 </file>
</xml_diff>